<commit_message>
Added new results, adapted the smoketest, adapted the results in the ESP_Visualization_Background.docx, finished the pipeline!!!
</commit_message>
<xml_diff>
--- a/docs/ESP_Visualization_Background.docx
+++ b/docs/ESP_Visualization_Background.docx
@@ -10709,62 +10709,42 @@
       </w:pPr>
       <w:r>
         <w:rPr>
-          <w:rFonts w:ascii="Consolas" w:eastAsia="Consolas" w:hAnsi="Consolas" w:cs="Consolas"/>
+          <w:rFonts w:ascii="Consolas" w:hAnsi="Consolas"/>
           <w:sz w:val="19"/>
-          <w:szCs w:val="19"/>
-          <w:lang w:val="en-GB"/>
         </w:rPr>
         <w:t>results/</w:t>
       </w:r>
       <w:r>
-        <w:rPr>
-          <w:lang w:val="en-GB"/>
-        </w:rPr>
-        <w:t xml:space="preserve"> holds the image sets that this project actually delivers — seven molecules, each with the three standard views, its colour bar and its </w:t>
-      </w:r>
-      <w:r>
-        <w:rPr>
-          <w:rFonts w:ascii="Consolas" w:eastAsia="Consolas" w:hAnsi="Consolas" w:cs="Consolas"/>
+        <w:t xml:space="preserve"> holds the image sets that this project actually delivers — nine molecules, each with the three standard views, its colour bar and its </w:t>
+      </w:r>
+      <w:r>
+        <w:rPr>
+          <w:rFonts w:ascii="Consolas" w:hAnsi="Consolas"/>
           <w:sz w:val="19"/>
-          <w:szCs w:val="19"/>
-          <w:lang w:val="en-GB"/>
         </w:rPr>
         <w:t>*_settings.txt</w:t>
       </w:r>
       <w:r>
-        <w:rPr>
-          <w:lang w:val="en-GB"/>
-        </w:rPr>
         <w:t xml:space="preserve">. Unlike </w:t>
       </w:r>
       <w:r>
         <w:rPr>
-          <w:rFonts w:ascii="Consolas" w:eastAsia="Consolas" w:hAnsi="Consolas" w:cs="Consolas"/>
+          <w:rFonts w:ascii="Consolas" w:hAnsi="Consolas"/>
           <w:sz w:val="19"/>
-          <w:szCs w:val="19"/>
-          <w:lang w:val="en-GB"/>
         </w:rPr>
         <w:t>sandbox/</w:t>
       </w:r>
       <w:r>
-        <w:rPr>
-          <w:lang w:val="en-GB"/>
-        </w:rPr>
         <w:t xml:space="preserve">, this folder is committed: the images are the deliverable, and </w:t>
       </w:r>
       <w:r>
         <w:rPr>
-          <w:rFonts w:ascii="Consolas" w:eastAsia="Consolas" w:hAnsi="Consolas" w:cs="Consolas"/>
+          <w:rFonts w:ascii="Consolas" w:hAnsi="Consolas"/>
           <w:sz w:val="19"/>
-          <w:szCs w:val="19"/>
-          <w:lang w:val="en-GB"/>
         </w:rPr>
         <w:t>*_settings.txt</w:t>
       </w:r>
       <w:r>
-        <w:rPr>
-          <w:lang w:val="en-GB"/>
-        </w:rPr>
         <w:t xml:space="preserve"> next to each one is the record of how it was made.</w:t>
       </w:r>
     </w:p>
@@ -10892,7 +10872,7 @@
                 <w:sz w:val="15"/>
                 <w:szCs w:val="15"/>
               </w:rPr>
-              <w:t>chlorbenzol/</w:t>
+              <w:t>Pyridine/</w:t>
             </w:r>
           </w:p>
         </w:tc>
@@ -10916,7 +10896,7 @@
                 <w:sz w:val="16"/>
                 <w:szCs w:val="16"/>
               </w:rPr>
-              <w:t>chlorobenzene</w:t>
+              <w:t>pyridine</w:t>
             </w:r>
           </w:p>
         </w:tc>
@@ -10964,7 +10944,7 @@
                 <w:sz w:val="15"/>
                 <w:szCs w:val="15"/>
               </w:rPr>
-              <w:t>brombenzol/</w:t>
+              <w:t>Me-Pyr/</w:t>
             </w:r>
           </w:p>
         </w:tc>
@@ -10988,7 +10968,7 @@
                 <w:sz w:val="16"/>
                 <w:szCs w:val="16"/>
               </w:rPr>
-              <w:t>bromobenzene</w:t>
+              <w:t>4-methylpyridine</w:t>
             </w:r>
           </w:p>
         </w:tc>
@@ -11036,7 +11016,7 @@
                 <w:sz w:val="15"/>
                 <w:szCs w:val="15"/>
               </w:rPr>
-              <w:t>iodbenzol/</w:t>
+              <w:t>CN-Pyr/</w:t>
             </w:r>
           </w:p>
         </w:tc>
@@ -11060,7 +11040,7 @@
                 <w:sz w:val="16"/>
                 <w:szCs w:val="16"/>
               </w:rPr>
-              <w:t>iodobenzene</w:t>
+              <w:t>4-cyanopyridine</w:t>
             </w:r>
           </w:p>
         </w:tc>
@@ -11108,7 +11088,7 @@
                 <w:sz w:val="15"/>
                 <w:szCs w:val="15"/>
               </w:rPr>
-              <w:t>chlormethan/</w:t>
+              <w:t>NO2-Pyr/</w:t>
             </w:r>
           </w:p>
         </w:tc>
@@ -11132,7 +11112,7 @@
                 <w:sz w:val="16"/>
                 <w:szCs w:val="16"/>
               </w:rPr>
-              <w:t>chloromethane</w:t>
+              <w:t>4-nitropyridine</w:t>
             </w:r>
           </w:p>
         </w:tc>
@@ -11156,15 +11136,79 @@
                 <w:sz w:val="16"/>
                 <w:szCs w:val="16"/>
               </w:rPr>
-              <w:t xml:space="preserve">generated, </w:t>
-            </w:r>
+              <w:t>provided Turbomole data</w:t>
+            </w:r>
+          </w:p>
+        </w:tc>
+      </w:tr>
+      <w:tr>
+        <w:tc>
+          <w:tcPr>
+            <w:tcW w:w="2675" w:type="dxa"/>
+            <w:shd w:val="clear" w:color="auto" w:fill="FFFFFF"/>
+            <w:tcMar>
+              <w:top w:w="60" w:type="dxa"/>
+              <w:left w:w="100" w:type="dxa"/>
+              <w:bottom w:w="60" w:type="dxa"/>
+              <w:right w:w="100" w:type="dxa"/>
+            </w:tcMar>
+          </w:tcPr>
+          <w:p>
             <w:r>
               <w:rPr>
                 <w:rFonts w:ascii="Consolas" w:eastAsia="Consolas" w:hAnsi="Consolas" w:cs="Consolas"/>
                 <w:sz w:val="15"/>
                 <w:szCs w:val="15"/>
               </w:rPr>
-              <w:t>tools/CreateTpTdFromSmiles.py</w:t>
+              <w:t>I-Pyr/</w:t>
+            </w:r>
+          </w:p>
+        </w:tc>
+        <w:tc>
+          <w:tcPr>
+            <w:tcW w:w="2674" w:type="dxa"/>
+            <w:shd w:val="clear" w:color="auto" w:fill="FFFFFF"/>
+            <w:tcMar>
+              <w:top w:w="60" w:type="dxa"/>
+              <w:left w:w="100" w:type="dxa"/>
+              <w:bottom w:w="60" w:type="dxa"/>
+              <w:right w:w="100" w:type="dxa"/>
+            </w:tcMar>
+          </w:tcPr>
+          <w:p>
+            <w:pPr>
+              <w:jc w:val="right"/>
+            </w:pPr>
+            <w:r>
+              <w:rPr>
+                <w:sz w:val="16"/>
+                <w:szCs w:val="16"/>
+              </w:rPr>
+              <w:t>3-iodopyridine</w:t>
+            </w:r>
+          </w:p>
+        </w:tc>
+        <w:tc>
+          <w:tcPr>
+            <w:tcW w:w="4011" w:type="dxa"/>
+            <w:shd w:val="clear" w:color="auto" w:fill="FFFFFF"/>
+            <w:tcMar>
+              <w:top w:w="60" w:type="dxa"/>
+              <w:left w:w="100" w:type="dxa"/>
+              <w:bottom w:w="60" w:type="dxa"/>
+              <w:right w:w="100" w:type="dxa"/>
+            </w:tcMar>
+          </w:tcPr>
+          <w:p>
+            <w:pPr>
+              <w:jc w:val="right"/>
+            </w:pPr>
+            <w:r>
+              <w:rPr>
+                <w:sz w:val="16"/>
+                <w:szCs w:val="16"/>
+              </w:rPr>
+              <w:t>provided Turbomole data</w:t>
             </w:r>
           </w:p>
         </w:tc>
@@ -11188,7 +11232,7 @@
                 <w:sz w:val="15"/>
                 <w:szCs w:val="15"/>
               </w:rPr>
-              <w:t>4-bromacetophenon/</w:t>
+              <w:t>Cl-NO2-Pyr/</w:t>
             </w:r>
           </w:p>
         </w:tc>
@@ -11212,7 +11256,7 @@
                 <w:sz w:val="16"/>
                 <w:szCs w:val="16"/>
               </w:rPr>
-              <w:t>4-bromoacetophenone</w:t>
+              <w:t>4-chloro-3-nitropyridine</w:t>
             </w:r>
           </w:p>
         </w:tc>
@@ -11236,15 +11280,79 @@
                 <w:sz w:val="16"/>
                 <w:szCs w:val="16"/>
               </w:rPr>
-              <w:t xml:space="preserve">generated, </w:t>
-            </w:r>
+              <w:t>provided Turbomole data</w:t>
+            </w:r>
+          </w:p>
+        </w:tc>
+      </w:tr>
+      <w:tr>
+        <w:tc>
+          <w:tcPr>
+            <w:tcW w:w="2675" w:type="dxa"/>
+            <w:shd w:val="clear" w:color="auto" w:fill="FFFFFF"/>
+            <w:tcMar>
+              <w:top w:w="60" w:type="dxa"/>
+              <w:left w:w="100" w:type="dxa"/>
+              <w:bottom w:w="60" w:type="dxa"/>
+              <w:right w:w="100" w:type="dxa"/>
+            </w:tcMar>
+          </w:tcPr>
+          <w:p>
             <w:r>
               <w:rPr>
                 <w:rFonts w:ascii="Consolas" w:eastAsia="Consolas" w:hAnsi="Consolas" w:cs="Consolas"/>
                 <w:sz w:val="15"/>
                 <w:szCs w:val="15"/>
               </w:rPr>
-              <w:t>tools/CreateTpTdFromSmiles.py</w:t>
+              <w:t>chlorbenzol/</w:t>
+            </w:r>
+          </w:p>
+        </w:tc>
+        <w:tc>
+          <w:tcPr>
+            <w:tcW w:w="2674" w:type="dxa"/>
+            <w:shd w:val="clear" w:color="auto" w:fill="FFFFFF"/>
+            <w:tcMar>
+              <w:top w:w="60" w:type="dxa"/>
+              <w:left w:w="100" w:type="dxa"/>
+              <w:bottom w:w="60" w:type="dxa"/>
+              <w:right w:w="100" w:type="dxa"/>
+            </w:tcMar>
+          </w:tcPr>
+          <w:p>
+            <w:pPr>
+              <w:jc w:val="right"/>
+            </w:pPr>
+            <w:r>
+              <w:rPr>
+                <w:sz w:val="16"/>
+                <w:szCs w:val="16"/>
+              </w:rPr>
+              <w:t>chlorobenzene</w:t>
+            </w:r>
+          </w:p>
+        </w:tc>
+        <w:tc>
+          <w:tcPr>
+            <w:tcW w:w="4011" w:type="dxa"/>
+            <w:shd w:val="clear" w:color="auto" w:fill="FFFFFF"/>
+            <w:tcMar>
+              <w:top w:w="60" w:type="dxa"/>
+              <w:left w:w="100" w:type="dxa"/>
+              <w:bottom w:w="60" w:type="dxa"/>
+              <w:right w:w="100" w:type="dxa"/>
+            </w:tcMar>
+          </w:tcPr>
+          <w:p>
+            <w:pPr>
+              <w:jc w:val="right"/>
+            </w:pPr>
+            <w:r>
+              <w:rPr>
+                <w:sz w:val="16"/>
+                <w:szCs w:val="16"/>
+              </w:rPr>
+              <w:t>provided Turbomole data</w:t>
             </w:r>
           </w:p>
         </w:tc>
@@ -11268,7 +11376,7 @@
                 <w:sz w:val="15"/>
                 <w:szCs w:val="15"/>
               </w:rPr>
-              <w:t>paracetamol/</w:t>
+              <w:t>brombenzol/</w:t>
             </w:r>
           </w:p>
         </w:tc>
@@ -11292,7 +11400,7 @@
                 <w:sz w:val="16"/>
                 <w:szCs w:val="16"/>
               </w:rPr>
-              <w:t>paracetamol</w:t>
+              <w:t>bromobenzene</w:t>
             </w:r>
           </w:p>
         </w:tc>
@@ -11316,39 +11424,31 @@
                 <w:sz w:val="16"/>
                 <w:szCs w:val="16"/>
               </w:rPr>
-              <w:t xml:space="preserve">generated, </w:t>
-            </w:r>
+              <w:t>provided Turbomole data</w:t>
+            </w:r>
+          </w:p>
+        </w:tc>
+      </w:tr>
+      <w:tr>
+        <w:tc>
+          <w:tcPr>
+            <w:tcW w:w="2675" w:type="dxa"/>
+            <w:shd w:val="clear" w:color="auto" w:fill="FFFFFF"/>
+            <w:tcMar>
+              <w:top w:w="60" w:type="dxa"/>
+              <w:left w:w="100" w:type="dxa"/>
+              <w:bottom w:w="60" w:type="dxa"/>
+              <w:right w:w="100" w:type="dxa"/>
+            </w:tcMar>
+          </w:tcPr>
+          <w:p>
             <w:r>
               <w:rPr>
                 <w:rFonts w:ascii="Consolas" w:eastAsia="Consolas" w:hAnsi="Consolas" w:cs="Consolas"/>
                 <w:sz w:val="15"/>
                 <w:szCs w:val="15"/>
               </w:rPr>
-              <w:t>tools/CreateTpTdFromSmiles.py</w:t>
-            </w:r>
-          </w:p>
-        </w:tc>
-      </w:tr>
-      <w:tr>
-        <w:tc>
-          <w:tcPr>
-            <w:tcW w:w="2675" w:type="dxa"/>
-            <w:shd w:val="clear" w:color="auto" w:fill="FFFFFF"/>
-            <w:tcMar>
-              <w:top w:w="60" w:type="dxa"/>
-              <w:left w:w="100" w:type="dxa"/>
-              <w:bottom w:w="60" w:type="dxa"/>
-              <w:right w:w="100" w:type="dxa"/>
-            </w:tcMar>
-          </w:tcPr>
-          <w:p>
-            <w:r>
-              <w:rPr>
-                <w:rFonts w:ascii="Consolas" w:eastAsia="Consolas" w:hAnsi="Consolas" w:cs="Consolas"/>
-                <w:sz w:val="15"/>
-                <w:szCs w:val="15"/>
-              </w:rPr>
-              <w:t>halcion/</w:t>
+              <w:t>iodbenzol/</w:t>
             </w:r>
           </w:p>
         </w:tc>
@@ -11372,7 +11472,7 @@
                 <w:sz w:val="16"/>
                 <w:szCs w:val="16"/>
               </w:rPr>
-              <w:t>triazolam</w:t>
+              <w:t>iodobenzene</w:t>
             </w:r>
           </w:p>
         </w:tc>
@@ -11396,15 +11496,7 @@
                 <w:sz w:val="16"/>
                 <w:szCs w:val="16"/>
               </w:rPr>
-              <w:t xml:space="preserve">generated, </w:t>
-            </w:r>
-            <w:r>
-              <w:rPr>
-                <w:rFonts w:ascii="Consolas" w:eastAsia="Consolas" w:hAnsi="Consolas" w:cs="Consolas"/>
-                <w:sz w:val="15"/>
-                <w:szCs w:val="15"/>
-              </w:rPr>
-              <w:t>tools/CreateTpTdFromSmiles.py</w:t>
+              <w:t>provided Turbomole data</w:t>
             </w:r>
           </w:p>
         </w:tc>
@@ -11436,28 +11528,7 @@
         </w:rPr>
       </w:pPr>
       <w:r>
-        <w:rPr>
-          <w:lang w:val="en-GB"/>
-        </w:rPr>
-        <w:t xml:space="preserve">All at </w:t>
-      </w:r>
-      <w:r>
-        <w:t>ρ</w:t>
-      </w:r>
-      <w:r>
-        <w:rPr>
-          <w:lang w:val="en-GB"/>
-        </w:rPr>
-        <w:t xml:space="preserve"> = 0.001 a.u.; </w:t>
-      </w:r>
-      <w:r>
-        <w:t>σ</w:t>
-      </w:r>
-      <w:r>
-        <w:rPr>
-          <w:lang w:val="en-GB"/>
-        </w:rPr>
-        <w:t>-hole and belt from the ray method. Atom labels are 1-based indices into the respective structure file.</w:t>
+        <w:t>All at ρ = 0.001 a.u.; σ-hole and belt from the ray method. Atom labels are 1-based indices into the respective structure file. Note the two grid spacings — see §5.2.</w:t>
       </w:r>
     </w:p>
     <w:tbl>
@@ -11773,7 +11844,7 @@
                 <w:sz w:val="15"/>
                 <w:szCs w:val="15"/>
               </w:rPr>
-              <w:t>chlorobenzene</w:t>
+              <w:t>pyridine</w:t>
             </w:r>
           </w:p>
         </w:tc>
@@ -11821,7 +11892,7 @@
                 <w:sz w:val="15"/>
                 <w:szCs w:val="15"/>
               </w:rPr>
-              <w:t>0.12</w:t>
+              <w:t>0.16</w:t>
             </w:r>
           </w:p>
         </w:tc>
@@ -11845,7 +11916,7 @@
                 <w:sz w:val="15"/>
                 <w:szCs w:val="15"/>
               </w:rPr>
-              <w:t>±0.035</w:t>
+              <w:t>±0.070</w:t>
             </w:r>
           </w:p>
         </w:tc>
@@ -11869,7 +11940,7 @@
                 <w:sz w:val="15"/>
                 <w:szCs w:val="15"/>
               </w:rPr>
-              <w:t>−0.0190 (Cl12)</w:t>
+              <w:t>−0.0650 (N7)</w:t>
             </w:r>
           </w:p>
         </w:tc>
@@ -11893,7 +11964,7 @@
                 <w:sz w:val="15"/>
                 <w:szCs w:val="15"/>
               </w:rPr>
-              <w:t>+0.0313 (H9)</w:t>
+              <w:t>+0.0396 (H6)</w:t>
             </w:r>
           </w:p>
         </w:tc>
@@ -11917,7 +11988,7 @@
                 <w:sz w:val="15"/>
                 <w:szCs w:val="15"/>
               </w:rPr>
-              <w:t>+0.0078</w:t>
+              <w:t>—</w:t>
             </w:r>
           </w:p>
         </w:tc>
@@ -11941,7 +12012,7 @@
                 <w:sz w:val="15"/>
                 <w:szCs w:val="15"/>
               </w:rPr>
-              <w:t>+4.9</w:t>
+              <w:t>—</w:t>
             </w:r>
           </w:p>
         </w:tc>
@@ -11965,7 +12036,7 @@
                 <w:sz w:val="15"/>
                 <w:szCs w:val="15"/>
               </w:rPr>
-              <w:t>−0.0190</w:t>
+              <w:t>—</w:t>
             </w:r>
           </w:p>
         </w:tc>
@@ -11988,7 +12059,7 @@
                 <w:sz w:val="15"/>
                 <w:szCs w:val="15"/>
               </w:rPr>
-              <w:t>bromobenzene</w:t>
+              <w:t>4-methylpyridine</w:t>
             </w:r>
           </w:p>
         </w:tc>
@@ -12036,7 +12107,7 @@
                 <w:sz w:val="15"/>
                 <w:szCs w:val="15"/>
               </w:rPr>
-              <w:t>0.12</w:t>
+              <w:t>0.16</w:t>
             </w:r>
           </w:p>
         </w:tc>
@@ -12060,7 +12131,7 @@
                 <w:sz w:val="15"/>
                 <w:szCs w:val="15"/>
               </w:rPr>
-              <w:t>±0.035</w:t>
+              <w:t>±0.070</w:t>
             </w:r>
           </w:p>
         </w:tc>
@@ -12084,7 +12155,7 @@
                 <w:sz w:val="15"/>
                 <w:szCs w:val="15"/>
               </w:rPr>
-              <w:t>−0.0188 (Br12)</w:t>
+              <w:t>−0.0678 (N10)</w:t>
             </w:r>
           </w:p>
         </w:tc>
@@ -12108,7 +12179,7 @@
                 <w:sz w:val="15"/>
                 <w:szCs w:val="15"/>
               </w:rPr>
-              <w:t>+0.0315 (H7)</w:t>
+              <w:t>+0.0365 (H12)</w:t>
             </w:r>
           </w:p>
         </w:tc>
@@ -12132,7 +12203,7 @@
                 <w:sz w:val="15"/>
                 <w:szCs w:val="15"/>
               </w:rPr>
-              <w:t>+0.0162</w:t>
+              <w:t>—</w:t>
             </w:r>
           </w:p>
         </w:tc>
@@ -12156,7 +12227,7 @@
                 <w:sz w:val="15"/>
                 <w:szCs w:val="15"/>
               </w:rPr>
-              <w:t>+10.2</w:t>
+              <w:t>—</w:t>
             </w:r>
           </w:p>
         </w:tc>
@@ -12180,7 +12251,7 @@
                 <w:sz w:val="15"/>
                 <w:szCs w:val="15"/>
               </w:rPr>
-              <w:t>−0.0188</w:t>
+              <w:t>—</w:t>
             </w:r>
           </w:p>
         </w:tc>
@@ -12203,7 +12274,7 @@
                 <w:sz w:val="15"/>
                 <w:szCs w:val="15"/>
               </w:rPr>
-              <w:t>iodobenzene</w:t>
+              <w:t>4-cyanopyridine</w:t>
             </w:r>
           </w:p>
         </w:tc>
@@ -12251,7 +12322,7 @@
                 <w:sz w:val="15"/>
                 <w:szCs w:val="15"/>
               </w:rPr>
-              <w:t>0.12</w:t>
+              <w:t>0.16</w:t>
             </w:r>
           </w:p>
         </w:tc>
@@ -12275,7 +12346,7 @@
                 <w:sz w:val="15"/>
                 <w:szCs w:val="15"/>
               </w:rPr>
-              <w:t>±0.035</w:t>
+              <w:t>±0.060</w:t>
             </w:r>
           </w:p>
         </w:tc>
@@ -12299,7 +12370,7 @@
                 <w:sz w:val="15"/>
                 <w:szCs w:val="15"/>
               </w:rPr>
-              <w:t>−0.0169 (I12)</w:t>
+              <w:t>−0.0593 (N3)</w:t>
             </w:r>
           </w:p>
         </w:tc>
@@ -12323,7 +12394,7 @@
                 <w:sz w:val="15"/>
                 <w:szCs w:val="15"/>
               </w:rPr>
-              <w:t>+0.0317 (H5)</w:t>
+              <w:t>+0.0502 (H8)</w:t>
             </w:r>
           </w:p>
         </w:tc>
@@ -12347,7 +12418,7 @@
                 <w:sz w:val="15"/>
                 <w:szCs w:val="15"/>
               </w:rPr>
-              <w:t>+0.0255</w:t>
+              <w:t>—</w:t>
             </w:r>
           </w:p>
         </w:tc>
@@ -12371,7 +12442,7 @@
                 <w:sz w:val="15"/>
                 <w:szCs w:val="15"/>
               </w:rPr>
-              <w:t>+16.0</w:t>
+              <w:t>—</w:t>
             </w:r>
           </w:p>
         </w:tc>
@@ -12395,7 +12466,7 @@
                 <w:sz w:val="15"/>
                 <w:szCs w:val="15"/>
               </w:rPr>
-              <w:t>−0.0169</w:t>
+              <w:t>—</w:t>
             </w:r>
           </w:p>
         </w:tc>
@@ -12418,7 +12489,7 @@
                 <w:sz w:val="15"/>
                 <w:szCs w:val="15"/>
               </w:rPr>
-              <w:t>chloromethane</w:t>
+              <w:t>4-nitropyridine</w:t>
             </w:r>
           </w:p>
         </w:tc>
@@ -12442,7 +12513,7 @@
                 <w:sz w:val="15"/>
                 <w:szCs w:val="15"/>
               </w:rPr>
-              <w:t>40×38×38</w:t>
+              <w:t>251³</w:t>
             </w:r>
           </w:p>
         </w:tc>
@@ -12466,7 +12537,7 @@
                 <w:sz w:val="15"/>
                 <w:szCs w:val="15"/>
               </w:rPr>
-              <w:t>0.40</w:t>
+              <w:t>0.16</w:t>
             </w:r>
           </w:p>
         </w:tc>
@@ -12490,7 +12561,7 @@
                 <w:sz w:val="15"/>
                 <w:szCs w:val="15"/>
               </w:rPr>
-              <w:t>±0.035</w:t>
+              <w:t>±0.050</w:t>
             </w:r>
           </w:p>
         </w:tc>
@@ -12514,7 +12585,7 @@
                 <w:sz w:val="15"/>
                 <w:szCs w:val="15"/>
               </w:rPr>
-              <w:t>−0.0283 (Cl1)</w:t>
+              <w:t>−0.0471 (N2)</w:t>
             </w:r>
           </w:p>
         </w:tc>
@@ -12538,7 +12609,7 @@
                 <w:sz w:val="15"/>
                 <w:szCs w:val="15"/>
               </w:rPr>
-              <w:t>+0.0323 (H3)</w:t>
+              <w:t>+0.0449 (H12)</w:t>
             </w:r>
           </w:p>
         </w:tc>
@@ -12559,12 +12630,10 @@
             </w:pPr>
             <w:r>
               <w:rPr>
-                <w:b/>
-                <w:bCs/>
                 <w:sz w:val="15"/>
                 <w:szCs w:val="15"/>
               </w:rPr>
-              <w:t>−0.0083</w:t>
+              <w:t>—</w:t>
             </w:r>
           </w:p>
         </w:tc>
@@ -12585,12 +12654,10 @@
             </w:pPr>
             <w:r>
               <w:rPr>
-                <w:b/>
-                <w:bCs/>
                 <w:sz w:val="15"/>
                 <w:szCs w:val="15"/>
               </w:rPr>
-              <w:t>−5.2</w:t>
+              <w:t>—</w:t>
             </w:r>
           </w:p>
         </w:tc>
@@ -12614,7 +12681,7 @@
                 <w:sz w:val="15"/>
                 <w:szCs w:val="15"/>
               </w:rPr>
-              <w:t>−0.0283</w:t>
+              <w:t>—</w:t>
             </w:r>
           </w:p>
         </w:tc>
@@ -12637,7 +12704,7 @@
                 <w:sz w:val="15"/>
                 <w:szCs w:val="15"/>
               </w:rPr>
-              <w:t>4-bromoacetophenone</w:t>
+              <w:t>3-iodopyridine</w:t>
             </w:r>
           </w:p>
         </w:tc>
@@ -12661,7 +12728,7 @@
                 <w:sz w:val="15"/>
                 <w:szCs w:val="15"/>
               </w:rPr>
-              <w:t>114×86×80</w:t>
+              <w:t>251³</w:t>
             </w:r>
           </w:p>
         </w:tc>
@@ -12685,7 +12752,7 @@
                 <w:sz w:val="15"/>
                 <w:szCs w:val="15"/>
               </w:rPr>
-              <w:t>0.25</w:t>
+              <w:t>0.16</w:t>
             </w:r>
           </w:p>
         </w:tc>
@@ -12709,7 +12776,7 @@
                 <w:sz w:val="15"/>
                 <w:szCs w:val="15"/>
               </w:rPr>
-              <w:t>±0.070</w:t>
+              <w:t>±0.060</w:t>
             </w:r>
           </w:p>
         </w:tc>
@@ -12733,7 +12800,7 @@
                 <w:sz w:val="15"/>
                 <w:szCs w:val="15"/>
               </w:rPr>
-              <w:t>−0.0653 (O3)</w:t>
+              <w:t>−0.0564 (N8)</w:t>
             </w:r>
           </w:p>
         </w:tc>
@@ -12757,7 +12824,7 @@
                 <w:sz w:val="15"/>
                 <w:szCs w:val="15"/>
               </w:rPr>
-              <w:t>+0.0476 (H14)</w:t>
+              <w:t>+0.0459 (H10)</w:t>
             </w:r>
           </w:p>
         </w:tc>
@@ -12781,7 +12848,7 @@
                 <w:sz w:val="15"/>
                 <w:szCs w:val="15"/>
               </w:rPr>
-              <w:t>+0.0230</w:t>
+              <w:t>+0.0344 (I7)</w:t>
             </w:r>
           </w:p>
         </w:tc>
@@ -12805,7 +12872,7 @@
                 <w:sz w:val="15"/>
                 <w:szCs w:val="15"/>
               </w:rPr>
-              <w:t>+14.5</w:t>
+              <w:t>+21.6</w:t>
             </w:r>
           </w:p>
         </w:tc>
@@ -12829,7 +12896,7 @@
                 <w:sz w:val="15"/>
                 <w:szCs w:val="15"/>
               </w:rPr>
-              <w:t>−0.0167</w:t>
+              <w:t>−0.0115</w:t>
             </w:r>
           </w:p>
         </w:tc>
@@ -12852,7 +12919,7 @@
                 <w:sz w:val="15"/>
                 <w:szCs w:val="15"/>
               </w:rPr>
-              <w:t>triazolam</w:t>
+              <w:t>4-chloro-3-nitropyridine</w:t>
             </w:r>
           </w:p>
         </w:tc>
@@ -12876,7 +12943,7 @@
                 <w:sz w:val="15"/>
                 <w:szCs w:val="15"/>
               </w:rPr>
-              <w:t>132×101×106</w:t>
+              <w:t>251³</w:t>
             </w:r>
           </w:p>
         </w:tc>
@@ -12900,7 +12967,7 @@
                 <w:sz w:val="15"/>
                 <w:szCs w:val="15"/>
               </w:rPr>
-              <w:t>0.25</w:t>
+              <w:t>0.16</w:t>
             </w:r>
           </w:p>
         </w:tc>
@@ -12924,7 +12991,7 @@
                 <w:sz w:val="15"/>
                 <w:szCs w:val="15"/>
               </w:rPr>
-              <w:t>±0.085</w:t>
+              <w:t>±0.060</w:t>
             </w:r>
           </w:p>
         </w:tc>
@@ -12948,7 +13015,7 @@
                 <w:sz w:val="15"/>
                 <w:szCs w:val="15"/>
               </w:rPr>
-              <w:t>−0.0843 (N4)</w:t>
+              <w:t>−0.0454 (O8)</w:t>
             </w:r>
           </w:p>
         </w:tc>
@@ -12972,7 +13039,7 @@
                 <w:sz w:val="15"/>
                 <w:szCs w:val="15"/>
               </w:rPr>
-              <w:t>+0.0543 (H27)</w:t>
+              <w:t>+0.0582 (H12)</w:t>
             </w:r>
           </w:p>
         </w:tc>
@@ -12996,7 +13063,7 @@
                 <w:sz w:val="15"/>
                 <w:szCs w:val="15"/>
               </w:rPr>
-              <w:t>+0.0171 (Cl21)</w:t>
+              <w:t>+0.0251 (Cl10)</w:t>
             </w:r>
           </w:p>
         </w:tc>
@@ -13020,7 +13087,7 @@
                 <w:sz w:val="15"/>
                 <w:szCs w:val="15"/>
               </w:rPr>
-              <w:t>+10.7</w:t>
+              <w:t>+15.7</w:t>
             </w:r>
           </w:p>
         </w:tc>
@@ -13044,7 +13111,7 @@
                 <w:sz w:val="15"/>
                 <w:szCs w:val="15"/>
               </w:rPr>
-              <w:t>−0.0184</w:t>
+              <w:t>−0.0309</w:t>
             </w:r>
           </w:p>
         </w:tc>
@@ -13067,98 +13134,13 @@
                 <w:sz w:val="15"/>
                 <w:szCs w:val="15"/>
               </w:rPr>
-              <w:t>"</w:t>
+              <w:t>chlorobenzene</w:t>
             </w:r>
           </w:p>
         </w:tc>
         <w:tc>
           <w:tcPr>
             <w:tcW w:w="1294" w:type="dxa"/>
-            <w:shd w:val="clear" w:color="auto" w:fill="FFFFFF"/>
-            <w:tcMar>
-              <w:top w:w="60" w:type="dxa"/>
-              <w:left w:w="100" w:type="dxa"/>
-              <w:bottom w:w="60" w:type="dxa"/>
-              <w:right w:w="100" w:type="dxa"/>
-            </w:tcMar>
-          </w:tcPr>
-          <w:p>
-            <w:pPr>
-              <w:jc w:val="right"/>
-            </w:pPr>
-          </w:p>
-        </w:tc>
-        <w:tc>
-          <w:tcPr>
-            <w:tcW w:w="685" w:type="dxa"/>
-            <w:shd w:val="clear" w:color="auto" w:fill="FFFFFF"/>
-            <w:tcMar>
-              <w:top w:w="60" w:type="dxa"/>
-              <w:left w:w="100" w:type="dxa"/>
-              <w:bottom w:w="60" w:type="dxa"/>
-              <w:right w:w="100" w:type="dxa"/>
-            </w:tcMar>
-          </w:tcPr>
-          <w:p>
-            <w:pPr>
-              <w:jc w:val="right"/>
-            </w:pPr>
-          </w:p>
-        </w:tc>
-        <w:tc>
-          <w:tcPr>
-            <w:tcW w:w="761" w:type="dxa"/>
-            <w:shd w:val="clear" w:color="auto" w:fill="FFFFFF"/>
-            <w:tcMar>
-              <w:top w:w="60" w:type="dxa"/>
-              <w:left w:w="100" w:type="dxa"/>
-              <w:bottom w:w="60" w:type="dxa"/>
-              <w:right w:w="100" w:type="dxa"/>
-            </w:tcMar>
-          </w:tcPr>
-          <w:p>
-            <w:pPr>
-              <w:jc w:val="right"/>
-            </w:pPr>
-          </w:p>
-        </w:tc>
-        <w:tc>
-          <w:tcPr>
-            <w:tcW w:w="1141" w:type="dxa"/>
-            <w:shd w:val="clear" w:color="auto" w:fill="FFFFFF"/>
-            <w:tcMar>
-              <w:top w:w="60" w:type="dxa"/>
-              <w:left w:w="100" w:type="dxa"/>
-              <w:bottom w:w="60" w:type="dxa"/>
-              <w:right w:w="100" w:type="dxa"/>
-            </w:tcMar>
-          </w:tcPr>
-          <w:p>
-            <w:pPr>
-              <w:jc w:val="right"/>
-            </w:pPr>
-          </w:p>
-        </w:tc>
-        <w:tc>
-          <w:tcPr>
-            <w:tcW w:w="1065" w:type="dxa"/>
-            <w:shd w:val="clear" w:color="auto" w:fill="FFFFFF"/>
-            <w:tcMar>
-              <w:top w:w="60" w:type="dxa"/>
-              <w:left w:w="100" w:type="dxa"/>
-              <w:bottom w:w="60" w:type="dxa"/>
-              <w:right w:w="100" w:type="dxa"/>
-            </w:tcMar>
-          </w:tcPr>
-          <w:p>
-            <w:pPr>
-              <w:jc w:val="right"/>
-            </w:pPr>
-          </w:p>
-        </w:tc>
-        <w:tc>
-          <w:tcPr>
-            <w:tcW w:w="1141" w:type="dxa"/>
             <w:shd w:val="clear" w:color="auto" w:fill="FFFFFF"/>
             <w:tcMar>
               <w:top w:w="60" w:type="dxa"/>
@@ -13176,13 +13158,13 @@
                 <w:sz w:val="15"/>
                 <w:szCs w:val="15"/>
               </w:rPr>
-              <w:t>+0.0144 (Cl11)</w:t>
-            </w:r>
-          </w:p>
-        </w:tc>
-        <w:tc>
-          <w:tcPr>
-            <w:tcW w:w="761" w:type="dxa"/>
+              <w:t>251³</w:t>
+            </w:r>
+          </w:p>
+        </w:tc>
+        <w:tc>
+          <w:tcPr>
+            <w:tcW w:w="685" w:type="dxa"/>
             <w:shd w:val="clear" w:color="auto" w:fill="FFFFFF"/>
             <w:tcMar>
               <w:top w:w="60" w:type="dxa"/>
@@ -13200,13 +13182,13 @@
                 <w:sz w:val="15"/>
                 <w:szCs w:val="15"/>
               </w:rPr>
-              <w:t>+9.0</w:t>
-            </w:r>
-          </w:p>
-        </w:tc>
-        <w:tc>
-          <w:tcPr>
-            <w:tcW w:w="837" w:type="dxa"/>
+              <w:t>0.12</w:t>
+            </w:r>
+          </w:p>
+        </w:tc>
+        <w:tc>
+          <w:tcPr>
+            <w:tcW w:w="761" w:type="dxa"/>
             <w:shd w:val="clear" w:color="auto" w:fill="FFFFFF"/>
             <w:tcMar>
               <w:top w:w="60" w:type="dxa"/>
@@ -13224,7 +13206,127 @@
                 <w:sz w:val="15"/>
                 <w:szCs w:val="15"/>
               </w:rPr>
-              <w:t>−0.0110</w:t>
+              <w:t>±0.035</w:t>
+            </w:r>
+          </w:p>
+        </w:tc>
+        <w:tc>
+          <w:tcPr>
+            <w:tcW w:w="1141" w:type="dxa"/>
+            <w:shd w:val="clear" w:color="auto" w:fill="FFFFFF"/>
+            <w:tcMar>
+              <w:top w:w="60" w:type="dxa"/>
+              <w:left w:w="100" w:type="dxa"/>
+              <w:bottom w:w="60" w:type="dxa"/>
+              <w:right w:w="100" w:type="dxa"/>
+            </w:tcMar>
+          </w:tcPr>
+          <w:p>
+            <w:pPr>
+              <w:jc w:val="right"/>
+            </w:pPr>
+            <w:r>
+              <w:rPr>
+                <w:sz w:val="15"/>
+                <w:szCs w:val="15"/>
+              </w:rPr>
+              <w:t>−0.0190 (Cl12)</w:t>
+            </w:r>
+          </w:p>
+        </w:tc>
+        <w:tc>
+          <w:tcPr>
+            <w:tcW w:w="1065" w:type="dxa"/>
+            <w:shd w:val="clear" w:color="auto" w:fill="FFFFFF"/>
+            <w:tcMar>
+              <w:top w:w="60" w:type="dxa"/>
+              <w:left w:w="100" w:type="dxa"/>
+              <w:bottom w:w="60" w:type="dxa"/>
+              <w:right w:w="100" w:type="dxa"/>
+            </w:tcMar>
+          </w:tcPr>
+          <w:p>
+            <w:pPr>
+              <w:jc w:val="right"/>
+            </w:pPr>
+            <w:r>
+              <w:rPr>
+                <w:sz w:val="15"/>
+                <w:szCs w:val="15"/>
+              </w:rPr>
+              <w:t>+0.0313 (H9)</w:t>
+            </w:r>
+          </w:p>
+        </w:tc>
+        <w:tc>
+          <w:tcPr>
+            <w:tcW w:w="1141" w:type="dxa"/>
+            <w:shd w:val="clear" w:color="auto" w:fill="FFFFFF"/>
+            <w:tcMar>
+              <w:top w:w="60" w:type="dxa"/>
+              <w:left w:w="100" w:type="dxa"/>
+              <w:bottom w:w="60" w:type="dxa"/>
+              <w:right w:w="100" w:type="dxa"/>
+            </w:tcMar>
+          </w:tcPr>
+          <w:p>
+            <w:pPr>
+              <w:jc w:val="right"/>
+            </w:pPr>
+            <w:r>
+              <w:rPr>
+                <w:sz w:val="15"/>
+                <w:szCs w:val="15"/>
+              </w:rPr>
+              <w:t>+0.0079</w:t>
+            </w:r>
+          </w:p>
+        </w:tc>
+        <w:tc>
+          <w:tcPr>
+            <w:tcW w:w="761" w:type="dxa"/>
+            <w:shd w:val="clear" w:color="auto" w:fill="FFFFFF"/>
+            <w:tcMar>
+              <w:top w:w="60" w:type="dxa"/>
+              <w:left w:w="100" w:type="dxa"/>
+              <w:bottom w:w="60" w:type="dxa"/>
+              <w:right w:w="100" w:type="dxa"/>
+            </w:tcMar>
+          </w:tcPr>
+          <w:p>
+            <w:pPr>
+              <w:jc w:val="right"/>
+            </w:pPr>
+            <w:r>
+              <w:rPr>
+                <w:sz w:val="15"/>
+                <w:szCs w:val="15"/>
+              </w:rPr>
+              <w:t>+4.9</w:t>
+            </w:r>
+          </w:p>
+        </w:tc>
+        <w:tc>
+          <w:tcPr>
+            <w:tcW w:w="837" w:type="dxa"/>
+            <w:shd w:val="clear" w:color="auto" w:fill="FFFFFF"/>
+            <w:tcMar>
+              <w:top w:w="60" w:type="dxa"/>
+              <w:left w:w="100" w:type="dxa"/>
+              <w:bottom w:w="60" w:type="dxa"/>
+              <w:right w:w="100" w:type="dxa"/>
+            </w:tcMar>
+          </w:tcPr>
+          <w:p>
+            <w:pPr>
+              <w:jc w:val="right"/>
+            </w:pPr>
+            <w:r>
+              <w:rPr>
+                <w:sz w:val="15"/>
+                <w:szCs w:val="15"/>
+              </w:rPr>
+              <w:t>−0.0190</w:t>
             </w:r>
           </w:p>
         </w:tc>
@@ -13247,7 +13349,7 @@
                 <w:sz w:val="15"/>
                 <w:szCs w:val="15"/>
               </w:rPr>
-              <w:t>paracetamol</w:t>
+              <w:t>bromobenzene</w:t>
             </w:r>
           </w:p>
         </w:tc>
@@ -13271,7 +13373,7 @@
                 <w:sz w:val="15"/>
                 <w:szCs w:val="15"/>
               </w:rPr>
-              <w:t>122×67×86</w:t>
+              <w:t>251³</w:t>
             </w:r>
           </w:p>
         </w:tc>
@@ -13295,7 +13397,7 @@
                 <w:sz w:val="15"/>
                 <w:szCs w:val="15"/>
               </w:rPr>
-              <w:t>0.25</w:t>
+              <w:t>0.12</w:t>
             </w:r>
           </w:p>
         </w:tc>
@@ -13319,7 +13421,7 @@
                 <w:sz w:val="15"/>
                 <w:szCs w:val="15"/>
               </w:rPr>
-              <w:t>±0.090</w:t>
+              <w:t>±0.035</w:t>
             </w:r>
           </w:p>
         </w:tc>
@@ -13343,7 +13445,7 @@
                 <w:sz w:val="15"/>
                 <w:szCs w:val="15"/>
               </w:rPr>
-              <w:t>−0.0737 (O3)</w:t>
+              <w:t>−0.0188 (Br12)</w:t>
             </w:r>
           </w:p>
         </w:tc>
@@ -13367,7 +13469,7 @@
                 <w:sz w:val="15"/>
                 <w:szCs w:val="15"/>
               </w:rPr>
-              <w:t>+0.0898 (H20)</w:t>
+              <w:t>+0.0315 (H7)</w:t>
             </w:r>
           </w:p>
         </w:tc>
@@ -13391,7 +13493,7 @@
                 <w:sz w:val="15"/>
                 <w:szCs w:val="15"/>
               </w:rPr>
-              <w:t>—</w:t>
+              <w:t>+0.0163</w:t>
             </w:r>
           </w:p>
         </w:tc>
@@ -13415,7 +13517,7 @@
                 <w:sz w:val="15"/>
                 <w:szCs w:val="15"/>
               </w:rPr>
-              <w:t>—</w:t>
+              <w:t>+10.2</w:t>
             </w:r>
           </w:p>
         </w:tc>
@@ -13439,7 +13541,222 @@
                 <w:sz w:val="15"/>
                 <w:szCs w:val="15"/>
               </w:rPr>
-              <w:t>—</w:t>
+              <w:t>−0.0188</w:t>
+            </w:r>
+          </w:p>
+        </w:tc>
+      </w:tr>
+      <w:tr>
+        <w:tc>
+          <w:tcPr>
+            <w:tcW w:w="1675" w:type="dxa"/>
+            <w:shd w:val="clear" w:color="auto" w:fill="FFFFFF"/>
+            <w:tcMar>
+              <w:top w:w="60" w:type="dxa"/>
+              <w:left w:w="100" w:type="dxa"/>
+              <w:bottom w:w="60" w:type="dxa"/>
+              <w:right w:w="100" w:type="dxa"/>
+            </w:tcMar>
+          </w:tcPr>
+          <w:p>
+            <w:r>
+              <w:rPr>
+                <w:sz w:val="15"/>
+                <w:szCs w:val="15"/>
+              </w:rPr>
+              <w:t>iodobenzene</w:t>
+            </w:r>
+          </w:p>
+        </w:tc>
+        <w:tc>
+          <w:tcPr>
+            <w:tcW w:w="1294" w:type="dxa"/>
+            <w:shd w:val="clear" w:color="auto" w:fill="FFFFFF"/>
+            <w:tcMar>
+              <w:top w:w="60" w:type="dxa"/>
+              <w:left w:w="100" w:type="dxa"/>
+              <w:bottom w:w="60" w:type="dxa"/>
+              <w:right w:w="100" w:type="dxa"/>
+            </w:tcMar>
+          </w:tcPr>
+          <w:p>
+            <w:pPr>
+              <w:jc w:val="right"/>
+            </w:pPr>
+            <w:r>
+              <w:rPr>
+                <w:sz w:val="15"/>
+                <w:szCs w:val="15"/>
+              </w:rPr>
+              <w:t>251³</w:t>
+            </w:r>
+          </w:p>
+        </w:tc>
+        <w:tc>
+          <w:tcPr>
+            <w:tcW w:w="685" w:type="dxa"/>
+            <w:shd w:val="clear" w:color="auto" w:fill="FFFFFF"/>
+            <w:tcMar>
+              <w:top w:w="60" w:type="dxa"/>
+              <w:left w:w="100" w:type="dxa"/>
+              <w:bottom w:w="60" w:type="dxa"/>
+              <w:right w:w="100" w:type="dxa"/>
+            </w:tcMar>
+          </w:tcPr>
+          <w:p>
+            <w:pPr>
+              <w:jc w:val="right"/>
+            </w:pPr>
+            <w:r>
+              <w:rPr>
+                <w:sz w:val="15"/>
+                <w:szCs w:val="15"/>
+              </w:rPr>
+              <w:t>0.12</w:t>
+            </w:r>
+          </w:p>
+        </w:tc>
+        <w:tc>
+          <w:tcPr>
+            <w:tcW w:w="761" w:type="dxa"/>
+            <w:shd w:val="clear" w:color="auto" w:fill="FFFFFF"/>
+            <w:tcMar>
+              <w:top w:w="60" w:type="dxa"/>
+              <w:left w:w="100" w:type="dxa"/>
+              <w:bottom w:w="60" w:type="dxa"/>
+              <w:right w:w="100" w:type="dxa"/>
+            </w:tcMar>
+          </w:tcPr>
+          <w:p>
+            <w:pPr>
+              <w:jc w:val="right"/>
+            </w:pPr>
+            <w:r>
+              <w:rPr>
+                <w:sz w:val="15"/>
+                <w:szCs w:val="15"/>
+              </w:rPr>
+              <w:t>±0.035</w:t>
+            </w:r>
+          </w:p>
+        </w:tc>
+        <w:tc>
+          <w:tcPr>
+            <w:tcW w:w="1141" w:type="dxa"/>
+            <w:shd w:val="clear" w:color="auto" w:fill="FFFFFF"/>
+            <w:tcMar>
+              <w:top w:w="60" w:type="dxa"/>
+              <w:left w:w="100" w:type="dxa"/>
+              <w:bottom w:w="60" w:type="dxa"/>
+              <w:right w:w="100" w:type="dxa"/>
+            </w:tcMar>
+          </w:tcPr>
+          <w:p>
+            <w:pPr>
+              <w:jc w:val="right"/>
+            </w:pPr>
+            <w:r>
+              <w:rPr>
+                <w:sz w:val="15"/>
+                <w:szCs w:val="15"/>
+              </w:rPr>
+              <w:t>−0.0169 (I12)</w:t>
+            </w:r>
+          </w:p>
+        </w:tc>
+        <w:tc>
+          <w:tcPr>
+            <w:tcW w:w="1065" w:type="dxa"/>
+            <w:shd w:val="clear" w:color="auto" w:fill="FFFFFF"/>
+            <w:tcMar>
+              <w:top w:w="60" w:type="dxa"/>
+              <w:left w:w="100" w:type="dxa"/>
+              <w:bottom w:w="60" w:type="dxa"/>
+              <w:right w:w="100" w:type="dxa"/>
+            </w:tcMar>
+          </w:tcPr>
+          <w:p>
+            <w:pPr>
+              <w:jc w:val="right"/>
+            </w:pPr>
+            <w:r>
+              <w:rPr>
+                <w:sz w:val="15"/>
+                <w:szCs w:val="15"/>
+              </w:rPr>
+              <w:t>+0.0317 (H5)</w:t>
+            </w:r>
+          </w:p>
+        </w:tc>
+        <w:tc>
+          <w:tcPr>
+            <w:tcW w:w="1141" w:type="dxa"/>
+            <w:shd w:val="clear" w:color="auto" w:fill="FFFFFF"/>
+            <w:tcMar>
+              <w:top w:w="60" w:type="dxa"/>
+              <w:left w:w="100" w:type="dxa"/>
+              <w:bottom w:w="60" w:type="dxa"/>
+              <w:right w:w="100" w:type="dxa"/>
+            </w:tcMar>
+          </w:tcPr>
+          <w:p>
+            <w:pPr>
+              <w:jc w:val="right"/>
+            </w:pPr>
+            <w:r>
+              <w:rPr>
+                <w:sz w:val="15"/>
+                <w:szCs w:val="15"/>
+              </w:rPr>
+              <w:t>+0.0256</w:t>
+            </w:r>
+          </w:p>
+        </w:tc>
+        <w:tc>
+          <w:tcPr>
+            <w:tcW w:w="761" w:type="dxa"/>
+            <w:shd w:val="clear" w:color="auto" w:fill="FFFFFF"/>
+            <w:tcMar>
+              <w:top w:w="60" w:type="dxa"/>
+              <w:left w:w="100" w:type="dxa"/>
+              <w:bottom w:w="60" w:type="dxa"/>
+              <w:right w:w="100" w:type="dxa"/>
+            </w:tcMar>
+          </w:tcPr>
+          <w:p>
+            <w:pPr>
+              <w:jc w:val="right"/>
+            </w:pPr>
+            <w:r>
+              <w:rPr>
+                <w:sz w:val="15"/>
+                <w:szCs w:val="15"/>
+              </w:rPr>
+              <w:t>+16.1</w:t>
+            </w:r>
+          </w:p>
+        </w:tc>
+        <w:tc>
+          <w:tcPr>
+            <w:tcW w:w="837" w:type="dxa"/>
+            <w:shd w:val="clear" w:color="auto" w:fill="FFFFFF"/>
+            <w:tcMar>
+              <w:top w:w="60" w:type="dxa"/>
+              <w:left w:w="100" w:type="dxa"/>
+              <w:bottom w:w="60" w:type="dxa"/>
+              <w:right w:w="100" w:type="dxa"/>
+            </w:tcMar>
+          </w:tcPr>
+          <w:p>
+            <w:pPr>
+              <w:jc w:val="right"/>
+            </w:pPr>
+            <w:r>
+              <w:rPr>
+                <w:sz w:val="15"/>
+                <w:szCs w:val="15"/>
+              </w:rPr>
+              <w:t>−0.0169</w:t>
             </w:r>
           </w:p>
         </w:tc>
@@ -13458,9 +13775,6 @@
         </w:rPr>
       </w:pPr>
       <w:r>
-        <w:rPr>
-          <w:lang w:val="en-GB"/>
-        </w:rPr>
         <w:t>What the set is meant to show:</w:t>
       </w:r>
     </w:p>
@@ -13476,32 +13790,11 @@
       <w:r>
         <w:rPr>
           <w:b/>
-          <w:bCs/>
-          <w:lang w:val="en-GB"/>
-        </w:rPr>
-        <w:t>The halobenzene series</w:t>
-      </w:r>
-      <w:r>
-        <w:rPr>
-          <w:lang w:val="en-GB"/>
-        </w:rPr>
-        <w:t xml:space="preserve"> is the trend Cl &lt; Br &lt; I, a factor of 3.3 across the three — while their global V</w:t>
-      </w:r>
-      <w:r>
-        <w:rPr>
-          <w:vertAlign w:val="subscript"/>
-          <w:lang w:val="en-GB"/>
-        </w:rPr>
-        <w:t>S,max</w:t>
-      </w:r>
-      <w:r>
-        <w:rPr>
-          <w:lang w:val="en-GB"/>
-        </w:rPr>
-        <w:t xml:space="preserve"> agree to within 0.4 %, because that maximum is the same aromatic C–H in all three. </w:t>
-      </w:r>
-      <w:r>
-        <w:t>This is the central argument of §2.1.</w:t>
+        </w:rPr>
+        <w:t>The halobenzene series is the trend Cl &lt; Br &lt; I,</w:t>
+      </w:r>
+      <w:r>
+        <w:t xml:space="preserve"> a factor of 3.2 across the three — while their global VS,max agree to within 1.3 %, because that maximum is the same aromatic C–H in all three. This is the central argument of §2.1.</w:t>
       </w:r>
     </w:p>
     <w:p>
@@ -13519,48 +13812,11 @@
       <w:r>
         <w:rPr>
           <w:b/>
-          <w:bCs/>
-          <w:lang w:val="en-GB"/>
-        </w:rPr>
-        <w:t>Chloromethane</w:t>
-      </w:r>
-      <w:r>
-        <w:rPr>
-          <w:lang w:val="en-GB"/>
-        </w:rPr>
-        <w:t xml:space="preserve"> is the negative control: an </w:t>
-      </w:r>
-      <w:r>
-        <w:rPr>
-          <w:i/>
-          <w:iCs/>
-          <w:lang w:val="en-GB"/>
-        </w:rPr>
-        <w:t>alkyl</w:t>
-      </w:r>
-      <w:r>
-        <w:rPr>
-          <w:lang w:val="en-GB"/>
-        </w:rPr>
-        <w:t xml:space="preserve"> chloride has no </w:t>
-      </w:r>
-      <w:r>
-        <w:t>σ</w:t>
-      </w:r>
-      <w:r>
-        <w:rPr>
-          <w:lang w:val="en-GB"/>
-        </w:rPr>
-        <w:t xml:space="preserve">-hole at all. The value on the C–Cl axis is −5.2 kcal/mol — still negative. The </w:t>
-      </w:r>
-      <w:r>
-        <w:t>σ</w:t>
-      </w:r>
-      <w:r>
-        <w:rPr>
-          <w:lang w:val="en-GB"/>
-        </w:rPr>
-        <w:t>-hole is a property of the C–X bond’s electronic environment, not of the halogen alone.</w:t>
+        </w:rPr>
+        <w:t>The ring nitrogen dominates the negative side.</w:t>
+      </w:r>
+      <w:r>
+        <w:t xml:space="preserve"> In five of the six pyridines VS,min sits on the ring nitrogen — the lone pair, not the π system — between −0.0471 and −0.0678 a.u., two and a half to three and a half times the most negative value found anywhere on a halobenzene. The exception is 4-chloro-3-nitropyridine, where the nitro oxygens win at −0.0454.</w:t>
       </w:r>
     </w:p>
     <w:p>
@@ -13578,29 +13834,11 @@
       <w:r>
         <w:rPr>
           <w:b/>
-          <w:bCs/>
-          <w:lang w:val="en-GB"/>
-        </w:rPr>
-        <w:t>4-Bromoacetophenone</w:t>
-      </w:r>
-      <w:r>
-        <w:rPr>
-          <w:lang w:val="en-GB"/>
-        </w:rPr>
-        <w:t xml:space="preserve"> separates the belt from the global minimum for the first time: V</w:t>
-      </w:r>
-      <w:r>
-        <w:rPr>
-          <w:vertAlign w:val="subscript"/>
-          <w:lang w:val="en-GB"/>
-        </w:rPr>
-        <w:t>S,min</w:t>
-      </w:r>
-      <w:r>
-        <w:rPr>
-          <w:lang w:val="en-GB"/>
-        </w:rPr>
-        <w:t xml:space="preserve"> sits on the carbonyl oxygen at −41.0, the belt on the bromine at −10.5. In the halobenzenes those two lines were always the same number.</w:t>
+        </w:rPr>
+        <w:t>Substituents shift that lone pair in the expected direction:</w:t>
+      </w:r>
+      <w:r>
+        <w:t xml:space="preserve"> methyl −0.0678, unsubstituted pyridine −0.0650, cyano −0.0593, nitro −0.0471. A span of 0.0207 a.u. — 54 kJ/(mol·e) — from a single group in the 4-position, with the electron-withdrawing ones making the nitrogen the weaker acceptor.</w:t>
       </w:r>
     </w:p>
     <w:p>
@@ -13618,25 +13856,11 @@
       <w:r>
         <w:rPr>
           <w:b/>
-          <w:bCs/>
-          <w:lang w:val="en-GB"/>
-        </w:rPr>
-        <w:t>Paracetamol</w:t>
-      </w:r>
-      <w:r>
-        <w:rPr>
-          <w:lang w:val="en-GB"/>
-        </w:rPr>
-        <w:t xml:space="preserve"> is the halogen-free case — no </w:t>
-      </w:r>
-      <w:r>
-        <w:t>σ</w:t>
-      </w:r>
-      <w:r>
-        <w:rPr>
-          <w:lang w:val="en-GB"/>
-        </w:rPr>
-        <w:t>-hole block, orientation from the principal axes, dash in the table.</w:t>
+        </w:rPr>
+        <w:t>The ring carries over to the σ-hole.</w:t>
+      </w:r>
+      <w:r>
+        <w:t xml:space="preserve"> 3-Iodopyridine reaches +0.0344 against +0.0256 for iodobenzene: the same C–I bond on an electron-poorer ring is 34 % stronger. The iodine sits in the 3-position, not the 4-position (see §5.2), so the effect here is inductive rather than mesomeric.</w:t>
       </w:r>
     </w:p>
     <w:p>
@@ -13654,164 +13878,11 @@
       <w:r>
         <w:rPr>
           <w:b/>
-          <w:bCs/>
-          <w:lang w:val="en-GB"/>
-        </w:rPr>
-        <w:lastRenderedPageBreak/>
-        <w:t>Triazolam</w:t>
-      </w:r>
-      <w:r>
-        <w:rPr>
-          <w:lang w:val="en-GB"/>
-        </w:rPr>
-        <w:t xml:space="preserve"> is the two-halogen case, and the two chlorines differ by 19 % despite being the same element: +10.7 on the pendant 2′-phenyl chlorine against +9.0 on the fused-ring one.</w:t>
-      </w:r>
-    </w:p>
-    <w:p>
-      <w:pPr>
-        <w:pStyle w:val="berschrift2"/>
-        <w:spacing w:before="280" w:after="140"/>
-        <w:rPr>
-          <w:lang w:val="en-GB"/>
-        </w:rPr>
-      </w:pPr>
-      <w:bookmarkStart w:id="36" w:name="_Toc238466604"/>
-      <w:bookmarkStart w:id="37" w:name="_Toc238548500"/>
-      <w:r>
-        <w:rPr>
-          <w:lang w:val="en-GB"/>
-        </w:rPr>
-        <w:t>5.2  What these numbers may and may not be compared with</w:t>
-      </w:r>
-      <w:bookmarkEnd w:id="36"/>
-      <w:bookmarkEnd w:id="37"/>
-    </w:p>
-    <w:p>
-      <w:pPr>
-        <w:spacing w:after="140"/>
-        <w:rPr>
-          <w:lang w:val="en-GB"/>
-        </w:rPr>
-      </w:pPr>
-      <w:r>
-        <w:rPr>
-          <w:b/>
-          <w:bCs/>
-          <w:lang w:val="en-GB"/>
-        </w:rPr>
-        <w:t>The first three rows and the last four are not comparable with each other.</w:t>
-      </w:r>
-      <w:r>
-        <w:rPr>
-          <w:lang w:val="en-GB"/>
-        </w:rPr>
-        <w:t xml:space="preserve"> Chlorobenzene, bromobenzene and iodobenzene come from the provided Turbomole calculation. The other four were generated with </w:t>
-      </w:r>
-      <w:r>
-        <w:rPr>
-          <w:rFonts w:ascii="Consolas" w:eastAsia="Consolas" w:hAnsi="Consolas" w:cs="Consolas"/>
-          <w:sz w:val="19"/>
-          <w:szCs w:val="19"/>
-          <w:lang w:val="en-GB"/>
-        </w:rPr>
-        <w:t>tools/CreateTpTdFromSmiles.py</w:t>
-      </w:r>
-      <w:r>
-        <w:rPr>
-          <w:lang w:val="en-GB"/>
-        </w:rPr>
-        <w:t xml:space="preserve"> at HF/def2-SVP on an MMFF94 geometry — a different method, a different basis set, and a force-field geometry rather than an optimised one. Any of those three differences moves V</w:t>
-      </w:r>
-      <w:r>
-        <w:rPr>
-          <w:vertAlign w:val="subscript"/>
-          <w:lang w:val="en-GB"/>
-        </w:rPr>
-        <w:t>S,min</w:t>
-      </w:r>
-      <w:r>
-        <w:rPr>
-          <w:lang w:val="en-GB"/>
-        </w:rPr>
-        <w:t xml:space="preserve"> and V</w:t>
-      </w:r>
-      <w:r>
-        <w:rPr>
-          <w:vertAlign w:val="subscript"/>
-          <w:lang w:val="en-GB"/>
-        </w:rPr>
-        <w:t>S,max</w:t>
-      </w:r>
-      <w:r>
-        <w:rPr>
-          <w:lang w:val="en-GB"/>
-        </w:rPr>
-        <w:t xml:space="preserve"> by more than the effects being discussed. See </w:t>
-      </w:r>
-      <w:r>
-        <w:rPr>
-          <w:rFonts w:ascii="Consolas" w:eastAsia="Consolas" w:hAnsi="Consolas" w:cs="Consolas"/>
-          <w:sz w:val="19"/>
-          <w:szCs w:val="19"/>
-          <w:lang w:val="en-GB"/>
-        </w:rPr>
-        <w:t>tools/README.txt</w:t>
-      </w:r>
-      <w:r>
-        <w:rPr>
-          <w:lang w:val="en-GB"/>
-        </w:rPr>
-        <w:t>, section "LIMITATIONS".</w:t>
-      </w:r>
-    </w:p>
-    <w:p>
-      <w:pPr>
-        <w:spacing w:after="140"/>
-        <w:rPr>
-          <w:lang w:val="en-GB"/>
-        </w:rPr>
-      </w:pPr>
-      <w:r>
-        <w:rPr>
-          <w:lang w:val="en-GB"/>
-        </w:rPr>
-        <w:t>Within each group the comparison is sound: the three halobenzenes were computed identically, and the four generated sets share method, basis and grid spacing.</w:t>
-      </w:r>
-    </w:p>
-    <w:p>
-      <w:pPr>
-        <w:spacing w:after="140"/>
-        <w:rPr>
-          <w:lang w:val="en-GB"/>
-        </w:rPr>
-      </w:pPr>
-      <w:r>
-        <w:rPr>
-          <w:lang w:val="en-GB"/>
-        </w:rPr>
-        <w:t xml:space="preserve">The colour scales tell the same story. All four molecules at ±0.035 can be compared </w:t>
-      </w:r>
-      <w:r>
-        <w:rPr>
-          <w:i/>
-          <w:iCs/>
-          <w:lang w:val="en-GB"/>
-        </w:rPr>
-        <w:t>by eye</w:t>
-      </w:r>
-      <w:r>
-        <w:rPr>
-          <w:lang w:val="en-GB"/>
-        </w:rPr>
-        <w:t>; 4-bromoacetophenone, triazolam and paracetamol each carry their own range because a shared one would render the halogen regions colourless. Always read the colour bar shipped with the image, never the colours alone.</w:t>
-      </w:r>
-    </w:p>
-    <w:p>
-      <w:pPr>
-        <w:spacing w:after="140"/>
-      </w:pPr>
-      <w:r>
-        <w:t>Two further caveats:</w:t>
+        </w:rPr>
+        <w:t>4-Chloro-3-nitropyridine is the clearest case for how much the environment matters.</w:t>
+      </w:r>
+      <w:r>
+        <w:t xml:space="preserve"> Its chlorine reaches +0.0251 against +0.0079 on chlorobenzene, more than three times, on the same element — and its belt is the deepest of the set at −0.0309. Ring nitrogen and nitro group withdraw together.</w:t>
       </w:r>
     </w:p>
     <w:p>
@@ -13829,16 +13900,129 @@
       <w:r>
         <w:rPr>
           <w:b/>
-          <w:bCs/>
-          <w:lang w:val="en-GB"/>
-        </w:rPr>
-        <w:t>Chloromethane’s grid is 0.40 Bohr</w:t>
-      </w:r>
-      <w:r>
-        <w:rPr>
-          <w:lang w:val="en-GB"/>
-        </w:rPr>
-        <w:t>, above the 0.30 Bohr threshold at which the script warns. Per §4.2 that biases the value low by a few percent. It does not affect the conclusion — the sign is what matters here, and −5.2 is nowhere near zero.</w:t>
+        </w:rPr>
+        <w:t>It is also the only σ-hole in the set that is not on the bond axis:</w:t>
+      </w:r>
+      <w:r>
+        <w:t xml:space="preserve"> the maximum sits 6.4° off, pushed there by the neighbouring nitro group. Every other halogen here gives 0.0°. The angle is recorded in *_settings.txt, and §2.4 explains why the search cone must not reach the rest of the molecule.</w:t>
+      </w:r>
+    </w:p>
+    <w:p>
+      <w:pPr>
+        <w:pStyle w:val="berschrift2"/>
+        <w:spacing w:before="280" w:after="140"/>
+        <w:rPr>
+          <w:lang w:val="en-GB"/>
+        </w:rPr>
+      </w:pPr>
+      <w:bookmarkStart w:id="36" w:name="_Toc238466604"/>
+      <w:bookmarkStart w:id="37" w:name="_Toc238548500"/>
+      <w:r>
+        <w:rPr>
+          <w:lang w:val="en-GB"/>
+        </w:rPr>
+        <w:t>5.2  What these numbers may and may not be compared with</w:t>
+      </w:r>
+      <w:bookmarkEnd w:id="36"/>
+      <w:bookmarkEnd w:id="37"/>
+    </w:p>
+    <w:p>
+      <w:pPr>
+        <w:spacing w:after="140"/>
+        <w:rPr>
+          <w:lang w:val="en-GB"/>
+        </w:rPr>
+      </w:pPr>
+      <w:r>
+        <w:rPr>
+          <w:b/>
+        </w:rPr>
+        <w:t>All nine sets come from Turbomole calculations provided by the supervisor.</w:t>
+      </w:r>
+      <w:r>
+        <w:t xml:space="preserve"> The method caveat of earlier versions of this document therefore no longer applies. The self-generated molecules — chloromethane, 4-bromoacetophenone, paracetamol and triazolam, computed at HF/def2-SVP on MMFF94 geometries with </w:t>
+      </w:r>
+      <w:r>
+        <w:rPr>
+          <w:rFonts w:ascii="Consolas" w:hAnsi="Consolas"/>
+          <w:sz w:val="19"/>
+        </w:rPr>
+        <w:t>tools/CreateTpTdFromSmiles.py</w:t>
+      </w:r>
+      <w:r>
+        <w:t xml:space="preserve"> — have been removed from the delivered set. The generator and its limitations are still documented in </w:t>
+      </w:r>
+      <w:r>
+        <w:rPr>
+          <w:rFonts w:ascii="Consolas" w:hAnsi="Consolas"/>
+          <w:sz w:val="19"/>
+        </w:rPr>
+        <w:t>tools/README.txt</w:t>
+      </w:r>
+      <w:r>
+        <w:t>.</w:t>
+      </w:r>
+    </w:p>
+    <w:p>
+      <w:pPr>
+        <w:spacing w:after="140"/>
+        <w:rPr>
+          <w:lang w:val="en-GB"/>
+        </w:rPr>
+      </w:pPr>
+      <w:r>
+        <w:t>One difference between the two groups remains and belongs in the methods section: they were computed on different grids. The pyridines use 0.16 Bohr spacing over a ±20 Bohr box, the halobenzenes 0.12 Bohr over ±15 Bohr. That is why the shell point counts differ by roughly a factor of three — 12 000 to 17 000 against 36 000 to 42 000. The effect on the values is small: decimating the bromobenzene grid from 0.12 to 0.24 Bohr, twice as coarse as the pyridine grid, moves VS,min by 0.00005 and VS,max by 0.00033 a.u., about 1 %. That is far below every difference discussed above, and per §4.2 both spacings sit well inside the range where the isovalue, not the grid, sets the accuracy.</w:t>
+      </w:r>
+    </w:p>
+    <w:p>
+      <w:pPr>
+        <w:spacing w:after="140"/>
+        <w:rPr>
+          <w:lang w:val="en-GB"/>
+        </w:rPr>
+      </w:pPr>
+      <w:r>
+        <w:t>The colour scales, however, are not comparable. Each molecule was rendered on its own automatic range, from ±0.035 to ±0.070. Two images read side by side without their colour bars would suggest that bromobenzene is as polarised as pyridine, which is wrong by a factor of two. For a comparison figure, re-render the whole set on one scale:</w:t>
+      </w:r>
+    </w:p>
+    <w:p>
+      <w:pPr>
+        <w:pBdr>
+          <w:top w:val="single" w:sz="2" w:space="0" w:color="D9D9D9"/>
+          <w:left w:val="single" w:sz="2" w:space="0" w:color="D9D9D9"/>
+          <w:bottom w:val="single" w:sz="2" w:space="0" w:color="D9D9D9"/>
+          <w:right w:val="single" w:sz="2" w:space="0" w:color="D9D9D9"/>
+        </w:pBdr>
+        <w:shd w:val="clear" w:color="auto" w:fill="F2F2F2"/>
+        <w:spacing w:before="100" w:after="160"/>
+        <w:rPr>
+          <w:lang w:val="en-GB"/>
+        </w:rPr>
+      </w:pPr>
+      <w:r>
+        <w:rPr>
+          <w:rFonts w:ascii="Consolas" w:eastAsia="Consolas" w:hAnsi="Consolas" w:cs="Consolas"/>
+          <w:sz w:val="15"/>
+          <w:szCs w:val="15"/>
+          <w:lang w:val="en-GB"/>
+        </w:rPr>
+        <w:t>python run_all.py --root ../sandbox --esp-range 0.070 --images-dir images_common</w:t>
+      </w:r>
+    </w:p>
+    <w:p>
+      <w:pPr>
+        <w:spacing w:after="140"/>
+      </w:pPr>
+      <w:r>
+        <w:t>Always read the colour bar shipped with the image, never the colours alone.</w:t>
+      </w:r>
+    </w:p>
+    <w:p>
+      <w:pPr>
+        <w:spacing w:after="140"/>
+      </w:pPr>
+      <w:r>
+        <w:t>Two further caveats:</w:t>
       </w:r>
     </w:p>
     <w:p>
@@ -13855,23 +14039,34 @@
       </w:pPr>
       <w:r>
         <w:rPr>
-          <w:lang w:val="en-GB"/>
-        </w:rPr>
-        <w:t xml:space="preserve">The maximum density value in the provided data suggests </w:t>
-      </w:r>
-      <w:r>
-        <w:rPr>
           <w:b/>
-          <w:bCs/>
-          <w:lang w:val="en-GB"/>
-        </w:rPr>
-        <w:t>bromine was treated all-electron while iodine used an effective core potential</w:t>
-      </w:r>
-      <w:r>
-        <w:rPr>
-          <w:lang w:val="en-GB"/>
-        </w:rPr>
-        <w:t>. That is a question for the supervisor; if so, the Br/I step in the table is not a pure basis-set-consistent comparison.</w:t>
+        </w:rPr>
+        <w:t>The maximum density value in the provided halobenzene data suggests bromine was treated all-electron while iodine used an effective core potential.</w:t>
+      </w:r>
+      <w:r>
+        <w:t xml:space="preserve"> That is a question for the supervisor; if so, the Br/I step in the table is not a pure basis-set-consistent comparison.</w:t>
+      </w:r>
+    </w:p>
+    <w:p>
+      <w:pPr>
+        <w:pStyle w:val="Listenabsatz"/>
+        <w:numPr>
+          <w:ilvl w:val="0"/>
+          <w:numId w:val="1"/>
+        </w:numPr>
+        <w:spacing w:after="100"/>
+        <w:rPr>
+          <w:lang w:val="en-GB"/>
+        </w:rPr>
+      </w:pPr>
+      <w:r>
+        <w:rPr>
+          <w:b/>
+        </w:rPr>
+        <w:t>I-Pyr is the 3-isomer, not the 4-isomer that the folder name suggests.</w:t>
+      </w:r>
+      <w:r>
+        <w:t xml:space="preserve"> By analogy with Me-Pyr, CN-Pyr and NO2-Pyr one would expect the 4-position. Confirmed from the geometry: the ring-nitrogen-to-iodine distance is 4.33 Å, against 4.36 Å expected for the 3-position and 4.88 Å for the 4-position. Any argument that lines it up with the para-substituted members has to account for that.</w:t>
       </w:r>
     </w:p>
     <w:p>
@@ -13906,123 +14101,37 @@
         </w:rPr>
       </w:pPr>
       <w:r>
-        <w:rPr>
-          <w:rFonts w:ascii="Consolas" w:eastAsia="Consolas" w:hAnsi="Consolas" w:cs="Consolas"/>
+        <w:t xml:space="preserve">All nine image sets come from a single run of the current </w:t>
+      </w:r>
+      <w:r>
+        <w:rPr>
+          <w:rFonts w:ascii="Consolas" w:hAnsi="Consolas"/>
           <w:sz w:val="19"/>
-          <w:szCs w:val="19"/>
-          <w:lang w:val="en-GB"/>
-        </w:rPr>
-        <w:t>chlorbenzol/</w:t>
-      </w:r>
-      <w:r>
-        <w:rPr>
-          <w:lang w:val="en-GB"/>
-        </w:rPr>
-        <w:t xml:space="preserve">, </w:t>
-      </w:r>
-      <w:r>
-        <w:rPr>
-          <w:rFonts w:ascii="Consolas" w:eastAsia="Consolas" w:hAnsi="Consolas" w:cs="Consolas"/>
+        </w:rPr>
+        <w:t>render_esp.py</w:t>
+      </w:r>
+      <w:r>
+        <w:t xml:space="preserve">, so the mixed-script-version caveat of earlier versions of this document no longer applies. The images in </w:t>
+      </w:r>
+      <w:r>
+        <w:rPr>
+          <w:rFonts w:ascii="Consolas" w:hAnsi="Consolas"/>
           <w:sz w:val="19"/>
-          <w:szCs w:val="19"/>
-          <w:lang w:val="en-GB"/>
-        </w:rPr>
-        <w:t>chlormethan/</w:t>
-      </w:r>
-      <w:r>
-        <w:rPr>
-          <w:lang w:val="en-GB"/>
-        </w:rPr>
-        <w:t xml:space="preserve"> and </w:t>
-      </w:r>
-      <w:r>
-        <w:rPr>
-          <w:rFonts w:ascii="Consolas" w:eastAsia="Consolas" w:hAnsi="Consolas" w:cs="Consolas"/>
+        </w:rPr>
+        <w:t>results/</w:t>
+      </w:r>
+      <w:r>
+        <w:t xml:space="preserve"> are copies of that run's output in </w:t>
+      </w:r>
+      <w:r>
+        <w:rPr>
+          <w:rFonts w:ascii="Consolas" w:hAnsi="Consolas"/>
           <w:sz w:val="19"/>
-          <w:szCs w:val="19"/>
-          <w:lang w:val="en-GB"/>
-        </w:rPr>
-        <w:t>iodbenzol/</w:t>
-      </w:r>
-      <w:r>
-        <w:rPr>
-          <w:lang w:val="en-GB"/>
-        </w:rPr>
-        <w:t xml:space="preserve"> were rendered with an earlier version of </w:t>
-      </w:r>
-      <w:r>
-        <w:rPr>
-          <w:rFonts w:ascii="Consolas" w:eastAsia="Consolas" w:hAnsi="Consolas" w:cs="Consolas"/>
-          <w:sz w:val="19"/>
-          <w:szCs w:val="19"/>
-          <w:lang w:val="en-GB"/>
-        </w:rPr>
-        <w:t>render_esp.py</w:t>
-      </w:r>
-      <w:r>
-        <w:rPr>
-          <w:lang w:val="en-GB"/>
-        </w:rPr>
-        <w:t xml:space="preserve"> — their </w:t>
-      </w:r>
-      <w:r>
-        <w:rPr>
-          <w:rFonts w:ascii="Consolas" w:eastAsia="Consolas" w:hAnsi="Consolas" w:cs="Consolas"/>
-          <w:sz w:val="19"/>
-          <w:szCs w:val="19"/>
-          <w:lang w:val="en-GB"/>
-        </w:rPr>
-        <w:t>*_settings.txt</w:t>
-      </w:r>
-      <w:r>
-        <w:rPr>
-          <w:lang w:val="en-GB"/>
-        </w:rPr>
-        <w:t xml:space="preserve"> still uses the single-halogen layout (</w:t>
-      </w:r>
-      <w:r>
-        <w:rPr>
-          <w:rFonts w:ascii="Consolas" w:eastAsia="Consolas" w:hAnsi="Consolas" w:cs="Consolas"/>
-          <w:sz w:val="19"/>
-          <w:szCs w:val="19"/>
-          <w:lang w:val="en-GB"/>
-        </w:rPr>
-        <w:t>sigma-Loch (Cl)</w:t>
-      </w:r>
-      <w:r>
-        <w:rPr>
-          <w:lang w:val="en-GB"/>
-        </w:rPr>
-        <w:t xml:space="preserve"> and a separate </w:t>
-      </w:r>
-      <w:r>
-        <w:rPr>
-          <w:rFonts w:ascii="Consolas" w:eastAsia="Consolas" w:hAnsi="Consolas" w:cs="Consolas"/>
-          <w:sz w:val="19"/>
-          <w:szCs w:val="19"/>
-          <w:lang w:val="en-GB"/>
-        </w:rPr>
-        <w:t>Halogenguertel</w:t>
-      </w:r>
-      <w:r>
-        <w:rPr>
-          <w:lang w:val="en-GB"/>
-        </w:rPr>
-        <w:t xml:space="preserve"> line) rather than the per-halogen one. The </w:t>
-      </w:r>
-      <w:r>
-        <w:rPr>
-          <w:b/>
-          <w:bCs/>
-          <w:lang w:val="en-GB"/>
-        </w:rPr>
-        <w:t>numbers are unaffected</w:t>
-      </w:r>
-      <w:r>
-        <w:rPr>
-          <w:lang w:val="en-GB"/>
-        </w:rPr>
-        <w:t>: all three molecules carry one halogen and are planar or axially symmetric, so neither the outermost-crossing fix nor the true-axis fix changes anything for them, and the values above match a current run. Still, a deliverable set should come from one script version. Re-rendering them is one command and the cube files are unchanged.</w:t>
+        </w:rPr>
+        <w:t>sandbox/</w:t>
+      </w:r>
+      <w:r>
+        <w:t>; the cube files behind them stay untracked and are regenerable from the pointval grids. The command was:</w:t>
       </w:r>
     </w:p>
     <w:p>
@@ -14046,7 +14155,7 @@
           <w:szCs w:val="15"/>
           <w:lang w:val="en-GB"/>
         </w:rPr>
-        <w:t>python run_all.py --root ../sandbox --only chlorbenzol chlormethan iodbenzol</w:t>
+        <w:t>python run_all.py --root ../sandbox</w:t>
       </w:r>
     </w:p>
     <w:p>

</xml_diff>

<commit_message>
Updated the readme and the docs to remove the things describing the removed options
</commit_message>
<xml_diff>
--- a/docs/ESP_Visualization_Background.docx
+++ b/docs/ESP_Visualization_Background.docx
@@ -124,11 +124,6 @@
             </a:graphic>
           </wp:inline>
         </w:drawing>
-      </w:r>
-      <w:r>
-        <w:rPr>
-          <w:noProof/>
-        </w:rPr>
         <w:drawing>
           <wp:inline distT="0" distB="0" distL="0" distR="0" wp14:anchorId="26DB74DC" wp14:editId="4C1EF5B0">
             <wp:extent cx="1428750" cy="1143000"/>
@@ -167,11 +162,6 @@
             </a:graphic>
           </wp:inline>
         </w:drawing>
-      </w:r>
-      <w:r>
-        <w:rPr>
-          <w:noProof/>
-        </w:rPr>
         <w:drawing>
           <wp:inline distT="0" distB="0" distL="0" distR="0" wp14:anchorId="5AC42BA4" wp14:editId="32CB1017">
             <wp:extent cx="1428750" cy="1143000"/>
@@ -223,7 +213,7 @@
         </w:rPr>
         <w:drawing>
           <wp:inline distT="0" distB="0" distL="0" distR="0" wp14:anchorId="33351035" wp14:editId="15BB9088">
-            <wp:extent cx="2476500" cy="438150"/>
+            <wp:extent cx="2476500" cy="456674"/>
             <wp:effectExtent l="0" t="0" r="0" b="0"/>
             <wp:docPr id="1086316838" name="Grafik 1086316838"/>
             <wp:cNvGraphicFramePr>
@@ -248,7 +238,7 @@
                   <pic:spPr bwMode="auto">
                     <a:xfrm>
                       <a:off x="0" y="0"/>
-                      <a:ext cx="2476500" cy="438150"/>
+                      <a:ext cx="2476500" cy="456674"/>
                     </a:xfrm>
                     <a:prstGeom prst="rect">
                       <a:avLst/>
@@ -278,7 +268,7 @@
           <w:szCs w:val="18"/>
           <w:lang w:val="en-GB"/>
         </w:rPr>
-        <w:t xml:space="preserve">4-Bromoacetophenone. Left: </w:t>
+        <w:t xml:space="preserve">4-Chloro-3-nitropyridine. Left: </w:t>
       </w:r>
       <w:r>
         <w:rPr>
@@ -299,7 +289,7 @@
           <w:szCs w:val="18"/>
           <w:lang w:val="en-GB"/>
         </w:rPr>
-        <w:t xml:space="preserve"> face, with the carbonyl oxygen as the deep red region at the top. Centre: view along the C–Br axis — the blue </w:t>
+        <w:t xml:space="preserve"> face, with the nitro oxygens as the deep red region. Centre: view along the C–Cl axis — the blue </w:t>
       </w:r>
       <w:r>
         <w:rPr>
@@ -320,7 +310,7 @@
           <w:szCs w:val="18"/>
           <w:lang w:val="en-GB"/>
         </w:rPr>
-        <w:t>-hole cap inside the red belt. Right: in-plane profile. One molecule showing both features the workflow has to get right: a strongly negative functional group and an anisotropic halogen.</w:t>
+        <w:t>-hole cap in the middle of the chlorine, the nitro group deep red beside it. Right: in-plane profile. One molecule showing both features the workflow has to get right: a strongly negative functional group and an anisotropic halogen.</w:t>
       </w:r>
     </w:p>
     <w:p>
@@ -456,11 +446,7 @@
           </w:pPr>
           <w:r>
             <w:fldChar w:fldCharType="begin"/>
-          </w:r>
-          <w:r>
             <w:instrText xml:space="preserve"> TOC \o "1-3" \h \z \u </w:instrText>
-          </w:r>
-          <w:r>
             <w:fldChar w:fldCharType="separate"/>
           </w:r>
           <w:hyperlink w:anchor="_Toc238548482" w:history="1">
@@ -478,46 +464,10 @@
                 <w:webHidden/>
               </w:rPr>
               <w:tab/>
-            </w:r>
-            <w:r>
-              <w:rPr>
-                <w:noProof/>
-                <w:webHidden/>
-              </w:rPr>
               <w:fldChar w:fldCharType="begin"/>
-            </w:r>
-            <w:r>
-              <w:rPr>
-                <w:noProof/>
-                <w:webHidden/>
-              </w:rPr>
               <w:instrText xml:space="preserve"> PAGEREF _Toc238548482 \h </w:instrText>
-            </w:r>
-            <w:r>
-              <w:rPr>
-                <w:noProof/>
-                <w:webHidden/>
-              </w:rPr>
-            </w:r>
-            <w:r>
-              <w:rPr>
-                <w:noProof/>
-                <w:webHidden/>
-              </w:rPr>
               <w:fldChar w:fldCharType="separate"/>
-            </w:r>
-            <w:r>
-              <w:rPr>
-                <w:noProof/>
-                <w:webHidden/>
-              </w:rPr>
               <w:t>3</w:t>
-            </w:r>
-            <w:r>
-              <w:rPr>
-                <w:noProof/>
-                <w:webHidden/>
-              </w:rPr>
               <w:fldChar w:fldCharType="end"/>
             </w:r>
           </w:hyperlink>
@@ -567,46 +517,10 @@
                 <w:webHidden/>
               </w:rPr>
               <w:tab/>
-            </w:r>
-            <w:r>
-              <w:rPr>
-                <w:noProof/>
-                <w:webHidden/>
-              </w:rPr>
               <w:fldChar w:fldCharType="begin"/>
-            </w:r>
-            <w:r>
-              <w:rPr>
-                <w:noProof/>
-                <w:webHidden/>
-              </w:rPr>
               <w:instrText xml:space="preserve"> PAGEREF _Toc238548483 \h </w:instrText>
-            </w:r>
-            <w:r>
-              <w:rPr>
-                <w:noProof/>
-                <w:webHidden/>
-              </w:rPr>
-            </w:r>
-            <w:r>
-              <w:rPr>
-                <w:noProof/>
-                <w:webHidden/>
-              </w:rPr>
               <w:fldChar w:fldCharType="separate"/>
-            </w:r>
-            <w:r>
-              <w:rPr>
-                <w:noProof/>
-                <w:webHidden/>
-              </w:rPr>
               <w:t>3</w:t>
-            </w:r>
-            <w:r>
-              <w:rPr>
-                <w:noProof/>
-                <w:webHidden/>
-              </w:rPr>
               <w:fldChar w:fldCharType="end"/>
             </w:r>
           </w:hyperlink>
@@ -650,46 +564,10 @@
                 <w:webHidden/>
               </w:rPr>
               <w:tab/>
-            </w:r>
-            <w:r>
-              <w:rPr>
-                <w:noProof/>
-                <w:webHidden/>
-              </w:rPr>
               <w:fldChar w:fldCharType="begin"/>
-            </w:r>
-            <w:r>
-              <w:rPr>
-                <w:noProof/>
-                <w:webHidden/>
-              </w:rPr>
               <w:instrText xml:space="preserve"> PAGEREF _Toc238548484 \h </w:instrText>
-            </w:r>
-            <w:r>
-              <w:rPr>
-                <w:noProof/>
-                <w:webHidden/>
-              </w:rPr>
-            </w:r>
-            <w:r>
-              <w:rPr>
-                <w:noProof/>
-                <w:webHidden/>
-              </w:rPr>
               <w:fldChar w:fldCharType="separate"/>
-            </w:r>
-            <w:r>
-              <w:rPr>
-                <w:noProof/>
-                <w:webHidden/>
-              </w:rPr>
               <w:t>3</w:t>
-            </w:r>
-            <w:r>
-              <w:rPr>
-                <w:noProof/>
-                <w:webHidden/>
-              </w:rPr>
               <w:fldChar w:fldCharType="end"/>
             </w:r>
           </w:hyperlink>
@@ -739,46 +617,10 @@
                 <w:webHidden/>
               </w:rPr>
               <w:tab/>
-            </w:r>
-            <w:r>
-              <w:rPr>
-                <w:noProof/>
-                <w:webHidden/>
-              </w:rPr>
               <w:fldChar w:fldCharType="begin"/>
-            </w:r>
-            <w:r>
-              <w:rPr>
-                <w:noProof/>
-                <w:webHidden/>
-              </w:rPr>
               <w:instrText xml:space="preserve"> PAGEREF _Toc238548485 \h </w:instrText>
-            </w:r>
-            <w:r>
-              <w:rPr>
-                <w:noProof/>
-                <w:webHidden/>
-              </w:rPr>
-            </w:r>
-            <w:r>
-              <w:rPr>
-                <w:noProof/>
-                <w:webHidden/>
-              </w:rPr>
               <w:fldChar w:fldCharType="separate"/>
-            </w:r>
-            <w:r>
-              <w:rPr>
-                <w:noProof/>
-                <w:webHidden/>
-              </w:rPr>
               <w:t>4</w:t>
-            </w:r>
-            <w:r>
-              <w:rPr>
-                <w:noProof/>
-                <w:webHidden/>
-              </w:rPr>
               <w:fldChar w:fldCharType="end"/>
             </w:r>
           </w:hyperlink>
@@ -813,46 +655,10 @@
                 <w:webHidden/>
               </w:rPr>
               <w:tab/>
-            </w:r>
-            <w:r>
-              <w:rPr>
-                <w:noProof/>
-                <w:webHidden/>
-              </w:rPr>
               <w:fldChar w:fldCharType="begin"/>
-            </w:r>
-            <w:r>
-              <w:rPr>
-                <w:noProof/>
-                <w:webHidden/>
-              </w:rPr>
               <w:instrText xml:space="preserve"> PAGEREF _Toc238548486 \h </w:instrText>
-            </w:r>
-            <w:r>
-              <w:rPr>
-                <w:noProof/>
-                <w:webHidden/>
-              </w:rPr>
-            </w:r>
-            <w:r>
-              <w:rPr>
-                <w:noProof/>
-                <w:webHidden/>
-              </w:rPr>
               <w:fldChar w:fldCharType="separate"/>
-            </w:r>
-            <w:r>
-              <w:rPr>
-                <w:noProof/>
-                <w:webHidden/>
-              </w:rPr>
               <w:t>4</w:t>
-            </w:r>
-            <w:r>
-              <w:rPr>
-                <w:noProof/>
-                <w:webHidden/>
-              </w:rPr>
               <w:fldChar w:fldCharType="end"/>
             </w:r>
           </w:hyperlink>
@@ -887,46 +693,10 @@
                 <w:webHidden/>
               </w:rPr>
               <w:tab/>
-            </w:r>
-            <w:r>
-              <w:rPr>
-                <w:noProof/>
-                <w:webHidden/>
-              </w:rPr>
               <w:fldChar w:fldCharType="begin"/>
-            </w:r>
-            <w:r>
-              <w:rPr>
-                <w:noProof/>
-                <w:webHidden/>
-              </w:rPr>
               <w:instrText xml:space="preserve"> PAGEREF _Toc238548487 \h </w:instrText>
-            </w:r>
-            <w:r>
-              <w:rPr>
-                <w:noProof/>
-                <w:webHidden/>
-              </w:rPr>
-            </w:r>
-            <w:r>
-              <w:rPr>
-                <w:noProof/>
-                <w:webHidden/>
-              </w:rPr>
               <w:fldChar w:fldCharType="separate"/>
-            </w:r>
-            <w:r>
-              <w:rPr>
-                <w:noProof/>
-                <w:webHidden/>
-              </w:rPr>
               <w:t>5</w:t>
-            </w:r>
-            <w:r>
-              <w:rPr>
-                <w:noProof/>
-                <w:webHidden/>
-              </w:rPr>
               <w:fldChar w:fldCharType="end"/>
             </w:r>
           </w:hyperlink>
@@ -976,46 +746,10 @@
                 <w:webHidden/>
               </w:rPr>
               <w:tab/>
-            </w:r>
-            <w:r>
-              <w:rPr>
-                <w:noProof/>
-                <w:webHidden/>
-              </w:rPr>
               <w:fldChar w:fldCharType="begin"/>
-            </w:r>
-            <w:r>
-              <w:rPr>
-                <w:noProof/>
-                <w:webHidden/>
-              </w:rPr>
               <w:instrText xml:space="preserve"> PAGEREF _Toc238548488 \h </w:instrText>
-            </w:r>
-            <w:r>
-              <w:rPr>
-                <w:noProof/>
-                <w:webHidden/>
-              </w:rPr>
-            </w:r>
-            <w:r>
-              <w:rPr>
-                <w:noProof/>
-                <w:webHidden/>
-              </w:rPr>
               <w:fldChar w:fldCharType="separate"/>
-            </w:r>
-            <w:r>
-              <w:rPr>
-                <w:noProof/>
-                <w:webHidden/>
-              </w:rPr>
               <w:t>5</w:t>
-            </w:r>
-            <w:r>
-              <w:rPr>
-                <w:noProof/>
-                <w:webHidden/>
-              </w:rPr>
               <w:fldChar w:fldCharType="end"/>
             </w:r>
           </w:hyperlink>
@@ -1050,46 +784,10 @@
                 <w:webHidden/>
               </w:rPr>
               <w:tab/>
-            </w:r>
-            <w:r>
-              <w:rPr>
-                <w:noProof/>
-                <w:webHidden/>
-              </w:rPr>
               <w:fldChar w:fldCharType="begin"/>
-            </w:r>
-            <w:r>
-              <w:rPr>
-                <w:noProof/>
-                <w:webHidden/>
-              </w:rPr>
               <w:instrText xml:space="preserve"> PAGEREF _Toc238548489 \h </w:instrText>
-            </w:r>
-            <w:r>
-              <w:rPr>
-                <w:noProof/>
-                <w:webHidden/>
-              </w:rPr>
-            </w:r>
-            <w:r>
-              <w:rPr>
-                <w:noProof/>
-                <w:webHidden/>
-              </w:rPr>
               <w:fldChar w:fldCharType="separate"/>
-            </w:r>
-            <w:r>
-              <w:rPr>
-                <w:noProof/>
-                <w:webHidden/>
-              </w:rPr>
               <w:t>6</w:t>
-            </w:r>
-            <w:r>
-              <w:rPr>
-                <w:noProof/>
-                <w:webHidden/>
-              </w:rPr>
               <w:fldChar w:fldCharType="end"/>
             </w:r>
           </w:hyperlink>
@@ -1124,46 +822,10 @@
                 <w:webHidden/>
               </w:rPr>
               <w:tab/>
-            </w:r>
-            <w:r>
-              <w:rPr>
-                <w:noProof/>
-                <w:webHidden/>
-              </w:rPr>
               <w:fldChar w:fldCharType="begin"/>
-            </w:r>
-            <w:r>
-              <w:rPr>
-                <w:noProof/>
-                <w:webHidden/>
-              </w:rPr>
               <w:instrText xml:space="preserve"> PAGEREF _Toc238548490 \h </w:instrText>
-            </w:r>
-            <w:r>
-              <w:rPr>
-                <w:noProof/>
-                <w:webHidden/>
-              </w:rPr>
-            </w:r>
-            <w:r>
-              <w:rPr>
-                <w:noProof/>
-                <w:webHidden/>
-              </w:rPr>
               <w:fldChar w:fldCharType="separate"/>
-            </w:r>
-            <w:r>
-              <w:rPr>
-                <w:noProof/>
-                <w:webHidden/>
-              </w:rPr>
               <w:t>6</w:t>
-            </w:r>
-            <w:r>
-              <w:rPr>
-                <w:noProof/>
-                <w:webHidden/>
-              </w:rPr>
               <w:fldChar w:fldCharType="end"/>
             </w:r>
           </w:hyperlink>
@@ -1198,46 +860,10 @@
                 <w:webHidden/>
               </w:rPr>
               <w:tab/>
-            </w:r>
-            <w:r>
-              <w:rPr>
-                <w:noProof/>
-                <w:webHidden/>
-              </w:rPr>
               <w:fldChar w:fldCharType="begin"/>
-            </w:r>
-            <w:r>
-              <w:rPr>
-                <w:noProof/>
-                <w:webHidden/>
-              </w:rPr>
               <w:instrText xml:space="preserve"> PAGEREF _Toc238548491 \h </w:instrText>
-            </w:r>
-            <w:r>
-              <w:rPr>
-                <w:noProof/>
-                <w:webHidden/>
-              </w:rPr>
-            </w:r>
-            <w:r>
-              <w:rPr>
-                <w:noProof/>
-                <w:webHidden/>
-              </w:rPr>
               <w:fldChar w:fldCharType="separate"/>
-            </w:r>
-            <w:r>
-              <w:rPr>
-                <w:noProof/>
-                <w:webHidden/>
-              </w:rPr>
               <w:t>7</w:t>
-            </w:r>
-            <w:r>
-              <w:rPr>
-                <w:noProof/>
-                <w:webHidden/>
-              </w:rPr>
               <w:fldChar w:fldCharType="end"/>
             </w:r>
           </w:hyperlink>
@@ -1287,46 +913,10 @@
                 <w:webHidden/>
               </w:rPr>
               <w:tab/>
-            </w:r>
-            <w:r>
-              <w:rPr>
-                <w:noProof/>
-                <w:webHidden/>
-              </w:rPr>
               <w:fldChar w:fldCharType="begin"/>
-            </w:r>
-            <w:r>
-              <w:rPr>
-                <w:noProof/>
-                <w:webHidden/>
-              </w:rPr>
               <w:instrText xml:space="preserve"> PAGEREF _Toc238548492 \h </w:instrText>
-            </w:r>
-            <w:r>
-              <w:rPr>
-                <w:noProof/>
-                <w:webHidden/>
-              </w:rPr>
-            </w:r>
-            <w:r>
-              <w:rPr>
-                <w:noProof/>
-                <w:webHidden/>
-              </w:rPr>
               <w:fldChar w:fldCharType="separate"/>
-            </w:r>
-            <w:r>
-              <w:rPr>
-                <w:noProof/>
-                <w:webHidden/>
-              </w:rPr>
               <w:t>7</w:t>
-            </w:r>
-            <w:r>
-              <w:rPr>
-                <w:noProof/>
-                <w:webHidden/>
-              </w:rPr>
               <w:fldChar w:fldCharType="end"/>
             </w:r>
           </w:hyperlink>
@@ -1361,46 +951,10 @@
                 <w:webHidden/>
               </w:rPr>
               <w:tab/>
-            </w:r>
-            <w:r>
-              <w:rPr>
-                <w:noProof/>
-                <w:webHidden/>
-              </w:rPr>
               <w:fldChar w:fldCharType="begin"/>
-            </w:r>
-            <w:r>
-              <w:rPr>
-                <w:noProof/>
-                <w:webHidden/>
-              </w:rPr>
               <w:instrText xml:space="preserve"> PAGEREF _Toc238548493 \h </w:instrText>
-            </w:r>
-            <w:r>
-              <w:rPr>
-                <w:noProof/>
-                <w:webHidden/>
-              </w:rPr>
-            </w:r>
-            <w:r>
-              <w:rPr>
-                <w:noProof/>
-                <w:webHidden/>
-              </w:rPr>
               <w:fldChar w:fldCharType="separate"/>
-            </w:r>
-            <w:r>
-              <w:rPr>
-                <w:noProof/>
-                <w:webHidden/>
-              </w:rPr>
               <w:t>8</w:t>
-            </w:r>
-            <w:r>
-              <w:rPr>
-                <w:noProof/>
-                <w:webHidden/>
-              </w:rPr>
               <w:fldChar w:fldCharType="end"/>
             </w:r>
           </w:hyperlink>
@@ -1435,46 +989,10 @@
                 <w:webHidden/>
               </w:rPr>
               <w:tab/>
-            </w:r>
-            <w:r>
-              <w:rPr>
-                <w:noProof/>
-                <w:webHidden/>
-              </w:rPr>
               <w:fldChar w:fldCharType="begin"/>
-            </w:r>
-            <w:r>
-              <w:rPr>
-                <w:noProof/>
-                <w:webHidden/>
-              </w:rPr>
               <w:instrText xml:space="preserve"> PAGEREF _Toc238548494 \h </w:instrText>
-            </w:r>
-            <w:r>
-              <w:rPr>
-                <w:noProof/>
-                <w:webHidden/>
-              </w:rPr>
-            </w:r>
-            <w:r>
-              <w:rPr>
-                <w:noProof/>
-                <w:webHidden/>
-              </w:rPr>
               <w:fldChar w:fldCharType="separate"/>
-            </w:r>
-            <w:r>
-              <w:rPr>
-                <w:noProof/>
-                <w:webHidden/>
-              </w:rPr>
               <w:t>8</w:t>
-            </w:r>
-            <w:r>
-              <w:rPr>
-                <w:noProof/>
-                <w:webHidden/>
-              </w:rPr>
               <w:fldChar w:fldCharType="end"/>
             </w:r>
           </w:hyperlink>
@@ -1524,46 +1042,10 @@
                 <w:webHidden/>
               </w:rPr>
               <w:tab/>
-            </w:r>
-            <w:r>
-              <w:rPr>
-                <w:noProof/>
-                <w:webHidden/>
-              </w:rPr>
               <w:fldChar w:fldCharType="begin"/>
-            </w:r>
-            <w:r>
-              <w:rPr>
-                <w:noProof/>
-                <w:webHidden/>
-              </w:rPr>
               <w:instrText xml:space="preserve"> PAGEREF _Toc238548495 \h </w:instrText>
-            </w:r>
-            <w:r>
-              <w:rPr>
-                <w:noProof/>
-                <w:webHidden/>
-              </w:rPr>
-            </w:r>
-            <w:r>
-              <w:rPr>
-                <w:noProof/>
-                <w:webHidden/>
-              </w:rPr>
               <w:fldChar w:fldCharType="separate"/>
-            </w:r>
-            <w:r>
-              <w:rPr>
-                <w:noProof/>
-                <w:webHidden/>
-              </w:rPr>
               <w:t>8</w:t>
-            </w:r>
-            <w:r>
-              <w:rPr>
-                <w:noProof/>
-                <w:webHidden/>
-              </w:rPr>
               <w:fldChar w:fldCharType="end"/>
             </w:r>
           </w:hyperlink>
@@ -1597,46 +1079,10 @@
                 <w:webHidden/>
               </w:rPr>
               <w:tab/>
-            </w:r>
-            <w:r>
-              <w:rPr>
-                <w:noProof/>
-                <w:webHidden/>
-              </w:rPr>
               <w:fldChar w:fldCharType="begin"/>
-            </w:r>
-            <w:r>
-              <w:rPr>
-                <w:noProof/>
-                <w:webHidden/>
-              </w:rPr>
               <w:instrText xml:space="preserve"> PAGEREF _Toc238548496 \h </w:instrText>
-            </w:r>
-            <w:r>
-              <w:rPr>
-                <w:noProof/>
-                <w:webHidden/>
-              </w:rPr>
-            </w:r>
-            <w:r>
-              <w:rPr>
-                <w:noProof/>
-                <w:webHidden/>
-              </w:rPr>
               <w:fldChar w:fldCharType="separate"/>
-            </w:r>
-            <w:r>
-              <w:rPr>
-                <w:noProof/>
-                <w:webHidden/>
-              </w:rPr>
               <w:t>9</w:t>
-            </w:r>
-            <w:r>
-              <w:rPr>
-                <w:noProof/>
-                <w:webHidden/>
-              </w:rPr>
               <w:fldChar w:fldCharType="end"/>
             </w:r>
           </w:hyperlink>
@@ -1671,46 +1117,10 @@
                 <w:webHidden/>
               </w:rPr>
               <w:tab/>
-            </w:r>
-            <w:r>
-              <w:rPr>
-                <w:noProof/>
-                <w:webHidden/>
-              </w:rPr>
               <w:fldChar w:fldCharType="begin"/>
-            </w:r>
-            <w:r>
-              <w:rPr>
-                <w:noProof/>
-                <w:webHidden/>
-              </w:rPr>
               <w:instrText xml:space="preserve"> PAGEREF _Toc238548497 \h </w:instrText>
-            </w:r>
-            <w:r>
-              <w:rPr>
-                <w:noProof/>
-                <w:webHidden/>
-              </w:rPr>
-            </w:r>
-            <w:r>
-              <w:rPr>
-                <w:noProof/>
-                <w:webHidden/>
-              </w:rPr>
               <w:fldChar w:fldCharType="separate"/>
-            </w:r>
-            <w:r>
-              <w:rPr>
-                <w:noProof/>
-                <w:webHidden/>
-              </w:rPr>
               <w:t>9</w:t>
-            </w:r>
-            <w:r>
-              <w:rPr>
-                <w:noProof/>
-                <w:webHidden/>
-              </w:rPr>
               <w:fldChar w:fldCharType="end"/>
             </w:r>
           </w:hyperlink>
@@ -1745,46 +1155,10 @@
                 <w:webHidden/>
               </w:rPr>
               <w:tab/>
-            </w:r>
-            <w:r>
-              <w:rPr>
-                <w:noProof/>
-                <w:webHidden/>
-              </w:rPr>
               <w:fldChar w:fldCharType="begin"/>
-            </w:r>
-            <w:r>
-              <w:rPr>
-                <w:noProof/>
-                <w:webHidden/>
-              </w:rPr>
               <w:instrText xml:space="preserve"> PAGEREF _Toc238548498 \h </w:instrText>
-            </w:r>
-            <w:r>
-              <w:rPr>
-                <w:noProof/>
-                <w:webHidden/>
-              </w:rPr>
-            </w:r>
-            <w:r>
-              <w:rPr>
-                <w:noProof/>
-                <w:webHidden/>
-              </w:rPr>
               <w:fldChar w:fldCharType="separate"/>
-            </w:r>
-            <w:r>
-              <w:rPr>
-                <w:noProof/>
-                <w:webHidden/>
-              </w:rPr>
               <w:t>10</w:t>
-            </w:r>
-            <w:r>
-              <w:rPr>
-                <w:noProof/>
-                <w:webHidden/>
-              </w:rPr>
               <w:fldChar w:fldCharType="end"/>
             </w:r>
           </w:hyperlink>
@@ -1818,46 +1192,10 @@
                 <w:webHidden/>
               </w:rPr>
               <w:tab/>
-            </w:r>
-            <w:r>
-              <w:rPr>
-                <w:noProof/>
-                <w:webHidden/>
-              </w:rPr>
               <w:fldChar w:fldCharType="begin"/>
-            </w:r>
-            <w:r>
-              <w:rPr>
-                <w:noProof/>
-                <w:webHidden/>
-              </w:rPr>
               <w:instrText xml:space="preserve"> PAGEREF _Toc238548499 \h </w:instrText>
-            </w:r>
-            <w:r>
-              <w:rPr>
-                <w:noProof/>
-                <w:webHidden/>
-              </w:rPr>
-            </w:r>
-            <w:r>
-              <w:rPr>
-                <w:noProof/>
-                <w:webHidden/>
-              </w:rPr>
               <w:fldChar w:fldCharType="separate"/>
-            </w:r>
-            <w:r>
-              <w:rPr>
-                <w:noProof/>
-                <w:webHidden/>
-              </w:rPr>
               <w:t>10</w:t>
-            </w:r>
-            <w:r>
-              <w:rPr>
-                <w:noProof/>
-                <w:webHidden/>
-              </w:rPr>
               <w:fldChar w:fldCharType="end"/>
             </w:r>
           </w:hyperlink>
@@ -1892,46 +1230,10 @@
                 <w:webHidden/>
               </w:rPr>
               <w:tab/>
-            </w:r>
-            <w:r>
-              <w:rPr>
-                <w:noProof/>
-                <w:webHidden/>
-              </w:rPr>
               <w:fldChar w:fldCharType="begin"/>
-            </w:r>
-            <w:r>
-              <w:rPr>
-                <w:noProof/>
-                <w:webHidden/>
-              </w:rPr>
               <w:instrText xml:space="preserve"> PAGEREF _Toc238548500 \h </w:instrText>
-            </w:r>
-            <w:r>
-              <w:rPr>
-                <w:noProof/>
-                <w:webHidden/>
-              </w:rPr>
-            </w:r>
-            <w:r>
-              <w:rPr>
-                <w:noProof/>
-                <w:webHidden/>
-              </w:rPr>
               <w:fldChar w:fldCharType="separate"/>
-            </w:r>
-            <w:r>
-              <w:rPr>
-                <w:noProof/>
-                <w:webHidden/>
-              </w:rPr>
               <w:t>11</w:t>
-            </w:r>
-            <w:r>
-              <w:rPr>
-                <w:noProof/>
-                <w:webHidden/>
-              </w:rPr>
               <w:fldChar w:fldCharType="end"/>
             </w:r>
           </w:hyperlink>
@@ -1966,46 +1268,10 @@
                 <w:webHidden/>
               </w:rPr>
               <w:tab/>
-            </w:r>
-            <w:r>
-              <w:rPr>
-                <w:noProof/>
-                <w:webHidden/>
-              </w:rPr>
               <w:fldChar w:fldCharType="begin"/>
-            </w:r>
-            <w:r>
-              <w:rPr>
-                <w:noProof/>
-                <w:webHidden/>
-              </w:rPr>
               <w:instrText xml:space="preserve"> PAGEREF _Toc238548501 \h </w:instrText>
-            </w:r>
-            <w:r>
-              <w:rPr>
-                <w:noProof/>
-                <w:webHidden/>
-              </w:rPr>
-            </w:r>
-            <w:r>
-              <w:rPr>
-                <w:noProof/>
-                <w:webHidden/>
-              </w:rPr>
               <w:fldChar w:fldCharType="separate"/>
-            </w:r>
-            <w:r>
-              <w:rPr>
-                <w:noProof/>
-                <w:webHidden/>
-              </w:rPr>
               <w:t>11</w:t>
-            </w:r>
-            <w:r>
-              <w:rPr>
-                <w:noProof/>
-                <w:webHidden/>
-              </w:rPr>
               <w:fldChar w:fldCharType="end"/>
             </w:r>
           </w:hyperlink>
@@ -2039,46 +1305,10 @@
                 <w:webHidden/>
               </w:rPr>
               <w:tab/>
-            </w:r>
-            <w:r>
-              <w:rPr>
-                <w:noProof/>
-                <w:webHidden/>
-              </w:rPr>
               <w:fldChar w:fldCharType="begin"/>
-            </w:r>
-            <w:r>
-              <w:rPr>
-                <w:noProof/>
-                <w:webHidden/>
-              </w:rPr>
               <w:instrText xml:space="preserve"> PAGEREF _Toc238548502 \h </w:instrText>
-            </w:r>
-            <w:r>
-              <w:rPr>
-                <w:noProof/>
-                <w:webHidden/>
-              </w:rPr>
-            </w:r>
-            <w:r>
-              <w:rPr>
-                <w:noProof/>
-                <w:webHidden/>
-              </w:rPr>
               <w:fldChar w:fldCharType="separate"/>
-            </w:r>
-            <w:r>
-              <w:rPr>
-                <w:noProof/>
-                <w:webHidden/>
-              </w:rPr>
               <w:t>11</w:t>
-            </w:r>
-            <w:r>
-              <w:rPr>
-                <w:noProof/>
-                <w:webHidden/>
-              </w:rPr>
               <w:fldChar w:fldCharType="end"/>
             </w:r>
           </w:hyperlink>
@@ -3776,22 +3006,8 @@
           <w:szCs w:val="15"/>
         </w:rPr>
         <w:t>Lokal an Cl21:   &lt;- Achse der sigma-Ansicht</w:t>
-      </w:r>
-      <w:r>
-        <w:rPr>
-          <w:rFonts w:ascii="Consolas" w:eastAsia="Consolas" w:hAnsi="Consolas" w:cs="Consolas"/>
-          <w:sz w:val="15"/>
-          <w:szCs w:val="15"/>
-        </w:rPr>
         <w:br/>
         <w:t>sigma-Loch  = +0.0171 a.u.  =   +44.9 kJ/(mol*e)  =  +10.7 kcal/(mol*e)   [interpoliert, 3.8 Grad zur Achse]</w:t>
-      </w:r>
-      <w:r>
-        <w:rPr>
-          <w:rFonts w:ascii="Consolas" w:eastAsia="Consolas" w:hAnsi="Consolas" w:cs="Consolas"/>
-          <w:sz w:val="15"/>
-          <w:szCs w:val="15"/>
-        </w:rPr>
         <w:br/>
         <w:t>Guertel     = -0.0184 a.u.  =   -48.2 kJ/(mol*e)  =  -11.5 kcal/(mol*e)   [508 Punkte]</w:t>
       </w:r>
@@ -3820,22 +3036,8 @@
           <w:szCs w:val="15"/>
         </w:rPr>
         <w:t xml:space="preserve">  Lokal an Cl11:</w:t>
-      </w:r>
-      <w:r>
-        <w:rPr>
-          <w:rFonts w:ascii="Consolas" w:eastAsia="Consolas" w:hAnsi="Consolas" w:cs="Consolas"/>
-          <w:sz w:val="15"/>
-          <w:szCs w:val="15"/>
-        </w:rPr>
         <w:br/>
         <w:t>sigma-Loch  = +0.0144 a.u.  =   +37.8 kJ/(mol*e)  =   +9.0 kcal/(mol*e)   [interpoliert, 1.3 Grad zur Achse]</w:t>
-      </w:r>
-      <w:r>
-        <w:rPr>
-          <w:rFonts w:ascii="Consolas" w:eastAsia="Consolas" w:hAnsi="Consolas" w:cs="Consolas"/>
-          <w:sz w:val="15"/>
-          <w:szCs w:val="15"/>
-        </w:rPr>
         <w:br/>
         <w:t xml:space="preserve">Guertel     = -0.0110 a.u.  </w:t>
       </w:r>
@@ -4528,7 +3730,7 @@
         <w:rPr>
           <w:lang w:val="en-GB"/>
         </w:rPr>
-        <w:t xml:space="preserve">Single-halogen molecules are unaffected — for 4-bromoacetophenone the </w:t>
+        <w:t xml:space="preserve">Single-halogen molecules are unaffected — for bromobenzene the </w:t>
       </w:r>
       <w:r>
         <w:t>σ</w:t>
@@ -4537,7 +3739,7 @@
         <w:rPr>
           <w:lang w:val="en-GB"/>
         </w:rPr>
-        <w:t>-hole moves from +0.02304 to +0.02303 a.u. and the belt is unchanged, because on a convex molecule the first and the last crossing are the same point. The rendered images are bit-identical; only the numbers changed.</w:t>
+        <w:t>-hole stays at +0.01629 a.u. and the belt minimum at −0.01882 a.u., identical to every digit before and after, because on a convex molecule the first and the last crossing are the same point and nothing else lies within 1.6 van der Waals radii of the bromine. Recomputed both ways on the full-resolution grid, the numbers and the rendered images are bit-identical.</w:t>
       </w:r>
     </w:p>
     <w:p>
@@ -6941,13 +6143,7 @@
         <w:rPr>
           <w:lang w:val="en-GB"/>
         </w:rPr>
-        <w:t xml:space="preserve"> column and the belt column carry the same number in every row: in bromobenzene the most negative point of the entire surface is the belt around the bromine itself. That is a property of this molecule, not of the method</w:t>
-      </w:r>
-      <w:r>
-        <w:rPr>
-          <w:lang w:val="en-GB"/>
-        </w:rPr>
-        <w:t>.</w:t>
+        <w:t xml:space="preserve"> column and the belt column carry the same number in every row: in bromobenzene the most negative point of the entire surface is the belt around the bromine itself. That is a property of this molecule, not of the method.</w:t>
       </w:r>
     </w:p>
     <w:p>
@@ -7089,27 +6285,7 @@
         <w:rPr>
           <w:lang w:val="en-GB"/>
         </w:rPr>
-        <w:t>Same molecule, isovalue fixed at 0.001, the same grid decimated by an increasing stride</w:t>
-      </w:r>
-      <w:r>
-        <w:rPr>
-          <w:lang w:val="en-GB"/>
-        </w:rPr>
-        <w:t xml:space="preserve"> (.</w:t>
-      </w:r>
-      <w:proofErr w:type="spellStart"/>
-      <w:r>
-        <w:rPr>
-          <w:lang w:val="en-GB"/>
-        </w:rPr>
-        <w:t>xyz</w:t>
-      </w:r>
-      <w:proofErr w:type="spellEnd"/>
-      <w:r>
-        <w:rPr>
-          <w:lang w:val="en-GB"/>
-        </w:rPr>
-        <w:t xml:space="preserve"> to .cube conversion). </w:t>
+        <w:t xml:space="preserve">Same molecule, isovalue fixed at 0.001, the same grid decimated by an increasing stride (.xyz to .cube conversion). </w:t>
       </w:r>
     </w:p>
     <w:tbl>
@@ -8730,19 +7906,7 @@
         <w:rPr>
           <w:lang w:val="en-GB"/>
         </w:rPr>
-        <w:t>-hole falls by 17 %. The degradation is smooth and one-sided</w:t>
-      </w:r>
-      <w:r>
-        <w:rPr>
-          <w:lang w:val="en-GB"/>
-        </w:rPr>
-        <w:t>,</w:t>
-      </w:r>
-      <w:r>
-        <w:rPr>
-          <w:lang w:val="en-GB"/>
-        </w:rPr>
-        <w:t xml:space="preserve"> because the interpolated density smooths the isosurface. Up to stride 4 the loss stays below 3 %, and stride 2 costs 1.2 % for an eight times smaller file. At stride 8 the belt can no longer be measured at all: fewer than five surface points survive in the belt region, and the script prints a dash rather than a number.</w:t>
+        <w:t xml:space="preserve">-hole falls by 17 %. The degradation is smooth and one-sided, because the interpolated density smooths the isosurface. Up to stride 4 the loss stays below 3 %, and stride 2 costs 1.2 % for an eight times smaller file. At stride 8 the belt can no longer be measured at all: fewer than five surface points survive in the belt region, and the script prints a dash rather than a number.</w:t>
       </w:r>
     </w:p>
     <w:p>
@@ -8756,31 +7920,7 @@
         <w:rPr>
           <w:lang w:val="en-GB"/>
         </w:rPr>
-        <w:t>One thing still makes this table look better than it should: these are ray-based values. The point-based method on the same six grids spans a factor of 5.1, from +0.0034 to +0.0175 a.u., and it does not even fall monotonically</w:t>
-      </w:r>
-      <w:r>
-        <w:rPr>
-          <w:lang w:val="en-GB"/>
-        </w:rPr>
-        <w:t xml:space="preserve">. </w:t>
-      </w:r>
-      <w:r>
-        <w:rPr>
-          <w:lang w:val="en-GB"/>
-        </w:rPr>
-        <w:t>22 % low at stride 2, 8 % high at stride 3, 65 % low at stride 4</w:t>
-      </w:r>
-      <w:r>
-        <w:rPr>
-          <w:lang w:val="en-GB"/>
-        </w:rPr>
-        <w:t xml:space="preserve">, </w:t>
-      </w:r>
-      <w:r>
-        <w:rPr>
-          <w:lang w:val="en-GB"/>
-        </w:rPr>
-        <w:t>because it depends on whether a grid point happens to lie both close to the C–Br axis and inside the thin shell. At stride 8 it finds fewer than five points in the cone and returns nothing at all, where the ray method still gives +0.0135 a.u. That is the measurement behind §2.2.</w:t>
+        <w:t xml:space="preserve">One thing still makes this table look better than it should: these are ray-based values. The point-based method on the same six grids spans a factor of 5.1, from +0.0034 to +0.0175 a.u., and it does not even fall monotonically. 22 % low at stride 2, 8 % high at stride 3, 65 % low at stride 4, because it depends on whether a grid point happens to lie both close to the C–Br axis and inside the thin shell. At stride 8 it finds fewer than five points in the cone and returns nothing at all, where the ray method still gives +0.0135 a.u. That is the measurement behind §2.2.</w:t>
       </w:r>
     </w:p>
     <w:p>
@@ -8794,19 +7934,7 @@
         <w:rPr>
           <w:lang w:val="en-GB"/>
         </w:rPr>
-        <w:t>Practical rule: stride 2 for looking, stride 1 for numbers that go in a table. The script warns above 0.30 Bohr spacing for exactly this reason</w:t>
-      </w:r>
-      <w:r>
-        <w:rPr>
-          <w:lang w:val="en-GB"/>
-        </w:rPr>
-        <w:t>. S</w:t>
-      </w:r>
-      <w:r>
-        <w:rPr>
-          <w:lang w:val="en-GB"/>
-        </w:rPr>
-        <w:t>tride 2 at 0.24 Bohr is the last one below the threshold.</w:t>
+        <w:t>Practical rule: stride 2 for looking, stride 1 for numbers that go in a table. The script warns above 0.30 Bohr spacing for exactly this reason. Stride 2 at 0.24 Bohr is the last one below the threshold.</w:t>
       </w:r>
     </w:p>
     <w:p>
@@ -8916,7 +8044,6 @@
             <w:pPr>
               <w:jc w:val="right"/>
             </w:pPr>
-            <w:proofErr w:type="spellStart"/>
             <w:r>
               <w:rPr>
                 <w:b/>
@@ -8925,31 +8052,8 @@
                 <w:sz w:val="18"/>
                 <w:szCs w:val="18"/>
               </w:rPr>
-              <w:t>Automatic</w:t>
-            </w:r>
-            <w:proofErr w:type="spellEnd"/>
-            <w:r>
-              <w:rPr>
-                <w:b/>
-                <w:bCs/>
-                <w:color w:val="FFFFFF"/>
-                <w:sz w:val="18"/>
-                <w:szCs w:val="18"/>
-              </w:rPr>
-              <w:t xml:space="preserve"> </w:t>
-            </w:r>
-            <w:proofErr w:type="spellStart"/>
-            <w:r>
-              <w:rPr>
-                <w:b/>
-                <w:bCs/>
-                <w:color w:val="FFFFFF"/>
-                <w:sz w:val="18"/>
-                <w:szCs w:val="18"/>
-              </w:rPr>
-              <w:t>range</w:t>
-            </w:r>
-            <w:proofErr w:type="spellEnd"/>
+              <w:t xml:space="preserve">Automatic range</w:t>
+            </w:r>
           </w:p>
         </w:tc>
         <w:tc>
@@ -9290,31 +8394,7 @@
         <w:rPr>
           <w:lang w:val="en-GB"/>
         </w:rPr>
-        <w:t>-hole of +0.017 is 49 % of full blue at ±0.035 and 20 % at ±0.085</w:t>
-      </w:r>
-      <w:r>
-        <w:rPr>
-          <w:lang w:val="en-GB"/>
-        </w:rPr>
-        <w:t>, hence it is good vis</w:t>
-      </w:r>
-      <w:r>
-        <w:rPr>
-          <w:lang w:val="en-GB"/>
-        </w:rPr>
-        <w:t xml:space="preserve">ible in the first case, </w:t>
-      </w:r>
-      <w:r>
-        <w:rPr>
-          <w:lang w:val="en-GB"/>
-        </w:rPr>
-        <w:t xml:space="preserve">but </w:t>
-      </w:r>
-      <w:r>
-        <w:rPr>
-          <w:lang w:val="en-GB"/>
-        </w:rPr>
-        <w:t>nearly white in the second, from identical data. Whenever the molecule carries a group far more polar than the halogen, the automatic range is set by that group and the halogen region is washed out. See §3 for when a common scale is legitimate.</w:t>
+        <w:t xml:space="preserve">-hole of +0.017 is 49 % of full blue at ±0.035 and 20 % at ±0.085, hence it is good visible in the first case, but nearly white in the second, from identical data. Whenever the molecule carries a group far more polar than the halogen, the automatic range is set by that group and the halogen region is washed out. See §3 for when a common scale is legitimate.</w:t>
       </w:r>
     </w:p>
     <w:p>
@@ -9536,15 +8616,82 @@
                 <w:szCs w:val="17"/>
                 <w:lang w:val="en-GB"/>
               </w:rPr>
-              <w:t>wide enough that the maximum is found interior to the cone, narrow enough to exclude the belt. A maximum near the edge is a warning sign</w:t>
-            </w:r>
+              <w:t>wide enough that the maximum is found interior to the cone, narrow enough to exclude the belt. A maximum near the edge is a warning sign.</w:t>
+            </w:r>
+          </w:p>
+        </w:tc>
+      </w:tr>
+      <w:tr>
+        <w:tc>
+          <w:tcPr>
+            <w:tcW w:w="1783" w:type="dxa"/>
+            <w:shd w:val="clear" w:color="auto" w:fill="FFFFFF"/>
+            <w:tcMar>
+              <w:top w:w="60" w:type="dxa"/>
+              <w:left w:w="100" w:type="dxa"/>
+              <w:bottom w:w="60" w:type="dxa"/>
+              <w:right w:w="100" w:type="dxa"/>
+            </w:tcMar>
+          </w:tcPr>
+          <w:p>
+            <w:r>
+              <w:rPr>
+                <w:sz w:val="17"/>
+                <w:szCs w:val="17"/>
+              </w:rPr>
+              <w:t xml:space="preserve">rays per halogen</w:t>
+            </w:r>
+          </w:p>
+        </w:tc>
+        <w:tc>
+          <w:tcPr>
+            <w:tcW w:w="2006" w:type="dxa"/>
+            <w:shd w:val="clear" w:color="auto" w:fill="FFFFFF"/>
+            <w:tcMar>
+              <w:top w:w="60" w:type="dxa"/>
+              <w:left w:w="100" w:type="dxa"/>
+              <w:bottom w:w="60" w:type="dxa"/>
+              <w:right w:w="100" w:type="dxa"/>
+            </w:tcMar>
+          </w:tcPr>
+          <w:p>
+            <w:pPr>
+              <w:jc w:val="right"/>
+            </w:pPr>
+            <w:r>
+              <w:rPr>
+                <w:sz w:val="17"/>
+                <w:szCs w:val="17"/>
+              </w:rPr>
+              <w:t>400, Fibonacci spiral</w:t>
+            </w:r>
+          </w:p>
+        </w:tc>
+        <w:tc>
+          <w:tcPr>
+            <w:tcW w:w="5571" w:type="dxa"/>
+            <w:shd w:val="clear" w:color="auto" w:fill="FFFFFF"/>
+            <w:tcMar>
+              <w:top w:w="60" w:type="dxa"/>
+              <w:left w:w="100" w:type="dxa"/>
+              <w:bottom w:w="60" w:type="dxa"/>
+              <w:right w:w="100" w:type="dxa"/>
+            </w:tcMar>
+          </w:tcPr>
+          <w:p>
+            <w:pPr>
+              <w:jc w:val="right"/>
+              <w:rPr>
+                <w:lang w:val="en-GB"/>
+              </w:rPr>
+            </w:pPr>
             <w:r>
               <w:rPr>
                 <w:sz w:val="17"/>
                 <w:szCs w:val="17"/>
                 <w:lang w:val="en-GB"/>
               </w:rPr>
-              <w:t>.</w:t>
+              <w:t>even coverage of the cap without the pole clustering of spherical coordinates</w:t>
             </w:r>
           </w:p>
         </w:tc>
@@ -9562,45 +8709,36 @@
             </w:tcMar>
           </w:tcPr>
           <w:p>
-            <w:proofErr w:type="spellStart"/>
             <w:r>
               <w:rPr>
                 <w:sz w:val="17"/>
                 <w:szCs w:val="17"/>
               </w:rPr>
-              <w:t>rays</w:t>
-            </w:r>
-            <w:proofErr w:type="spellEnd"/>
+              <w:t xml:space="preserve">step along a ray</w:t>
+            </w:r>
+          </w:p>
+        </w:tc>
+        <w:tc>
+          <w:tcPr>
+            <w:tcW w:w="2006" w:type="dxa"/>
+            <w:shd w:val="clear" w:color="auto" w:fill="FFFFFF"/>
+            <w:tcMar>
+              <w:top w:w="60" w:type="dxa"/>
+              <w:left w:w="100" w:type="dxa"/>
+              <w:bottom w:w="60" w:type="dxa"/>
+              <w:right w:w="100" w:type="dxa"/>
+            </w:tcMar>
+          </w:tcPr>
+          <w:p>
+            <w:pPr>
+              <w:jc w:val="right"/>
+            </w:pPr>
             <w:r>
               <w:rPr>
                 <w:sz w:val="17"/>
                 <w:szCs w:val="17"/>
               </w:rPr>
-              <w:t xml:space="preserve"> per halogen</w:t>
-            </w:r>
-          </w:p>
-        </w:tc>
-        <w:tc>
-          <w:tcPr>
-            <w:tcW w:w="2006" w:type="dxa"/>
-            <w:shd w:val="clear" w:color="auto" w:fill="FFFFFF"/>
-            <w:tcMar>
-              <w:top w:w="60" w:type="dxa"/>
-              <w:left w:w="100" w:type="dxa"/>
-              <w:bottom w:w="60" w:type="dxa"/>
-              <w:right w:w="100" w:type="dxa"/>
-            </w:tcMar>
-          </w:tcPr>
-          <w:p>
-            <w:pPr>
-              <w:jc w:val="right"/>
-            </w:pPr>
-            <w:r>
-              <w:rPr>
-                <w:sz w:val="17"/>
-                <w:szCs w:val="17"/>
-              </w:rPr>
-              <w:t>400, Fibonacci spiral</w:t>
+              <w:t>0.02 Bohr</w:t>
             </w:r>
           </w:p>
         </w:tc>
@@ -9628,7 +8766,7 @@
                 <w:szCs w:val="17"/>
                 <w:lang w:val="en-GB"/>
               </w:rPr>
-              <w:t>even coverage of the cap without the pole clustering of spherical coordinates</w:t>
+              <w:t>far below the grid spacing; the crossing radius is then refined by linear interpolation anyway</w:t>
             </w:r>
           </w:p>
         </w:tc>
@@ -9651,56 +8789,31 @@
                 <w:sz w:val="17"/>
                 <w:szCs w:val="17"/>
               </w:rPr>
-              <w:t xml:space="preserve">step </w:t>
-            </w:r>
-            <w:proofErr w:type="spellStart"/>
+              <w:t xml:space="preserve">radius cut-off</w:t>
+            </w:r>
+          </w:p>
+        </w:tc>
+        <w:tc>
+          <w:tcPr>
+            <w:tcW w:w="2006" w:type="dxa"/>
+            <w:shd w:val="clear" w:color="auto" w:fill="FFFFFF"/>
+            <w:tcMar>
+              <w:top w:w="60" w:type="dxa"/>
+              <w:left w:w="100" w:type="dxa"/>
+              <w:bottom w:w="60" w:type="dxa"/>
+              <w:right w:w="100" w:type="dxa"/>
+            </w:tcMar>
+          </w:tcPr>
+          <w:p>
+            <w:pPr>
+              <w:jc w:val="right"/>
+            </w:pPr>
             <w:r>
               <w:rPr>
                 <w:sz w:val="17"/>
                 <w:szCs w:val="17"/>
               </w:rPr>
-              <w:t>along</w:t>
-            </w:r>
-            <w:proofErr w:type="spellEnd"/>
-            <w:r>
-              <w:rPr>
-                <w:sz w:val="17"/>
-                <w:szCs w:val="17"/>
-              </w:rPr>
-              <w:t xml:space="preserve"> a </w:t>
-            </w:r>
-            <w:proofErr w:type="spellStart"/>
-            <w:r>
-              <w:rPr>
-                <w:sz w:val="17"/>
-                <w:szCs w:val="17"/>
-              </w:rPr>
-              <w:t>ray</w:t>
-            </w:r>
-            <w:proofErr w:type="spellEnd"/>
-          </w:p>
-        </w:tc>
-        <w:tc>
-          <w:tcPr>
-            <w:tcW w:w="2006" w:type="dxa"/>
-            <w:shd w:val="clear" w:color="auto" w:fill="FFFFFF"/>
-            <w:tcMar>
-              <w:top w:w="60" w:type="dxa"/>
-              <w:left w:w="100" w:type="dxa"/>
-              <w:bottom w:w="60" w:type="dxa"/>
-              <w:right w:w="100" w:type="dxa"/>
-            </w:tcMar>
-          </w:tcPr>
-          <w:p>
-            <w:pPr>
-              <w:jc w:val="right"/>
-            </w:pPr>
-            <w:r>
-              <w:rPr>
-                <w:sz w:val="17"/>
-                <w:szCs w:val="17"/>
-              </w:rPr>
-              <w:t>0.02 Bohr</w:t>
+              <w:t>1.6 × Bondi vdW</w:t>
             </w:r>
           </w:p>
         </w:tc>
@@ -9728,122 +8841,112 @@
                 <w:szCs w:val="17"/>
                 <w:lang w:val="en-GB"/>
               </w:rPr>
-              <w:t>far below the grid spacing; the crossing radius is then refined by linear interpolation anyway</w:t>
-            </w:r>
-          </w:p>
-        </w:tc>
-      </w:tr>
-      <w:tr>
-        <w:tc>
-          <w:tcPr>
-            <w:tcW w:w="1783" w:type="dxa"/>
-            <w:shd w:val="clear" w:color="auto" w:fill="FFFFFF"/>
-            <w:tcMar>
-              <w:top w:w="60" w:type="dxa"/>
-              <w:left w:w="100" w:type="dxa"/>
-              <w:bottom w:w="60" w:type="dxa"/>
-              <w:right w:w="100" w:type="dxa"/>
-            </w:tcMar>
-          </w:tcPr>
-          <w:p>
-            <w:proofErr w:type="spellStart"/>
+              <w:t xml:space="preserve">the </w:t>
+            </w:r>
             <w:r>
               <w:rPr>
                 <w:sz w:val="17"/>
                 <w:szCs w:val="17"/>
               </w:rPr>
-              <w:t>radius</w:t>
-            </w:r>
-            <w:proofErr w:type="spellEnd"/>
-            <w:r>
-              <w:rPr>
-                <w:sz w:val="17"/>
-                <w:szCs w:val="17"/>
-              </w:rPr>
-              <w:t xml:space="preserve"> </w:t>
-            </w:r>
-            <w:proofErr w:type="spellStart"/>
-            <w:r>
-              <w:rPr>
-                <w:sz w:val="17"/>
-                <w:szCs w:val="17"/>
-              </w:rPr>
-              <w:t>cut</w:t>
-            </w:r>
-            <w:proofErr w:type="spellEnd"/>
-            <w:r>
-              <w:rPr>
-                <w:sz w:val="17"/>
-                <w:szCs w:val="17"/>
-              </w:rPr>
-              <w:t>-off</w:t>
-            </w:r>
-          </w:p>
-        </w:tc>
-        <w:tc>
-          <w:tcPr>
-            <w:tcW w:w="2006" w:type="dxa"/>
-            <w:shd w:val="clear" w:color="auto" w:fill="FFFFFF"/>
-            <w:tcMar>
-              <w:top w:w="60" w:type="dxa"/>
-              <w:left w:w="100" w:type="dxa"/>
-              <w:bottom w:w="60" w:type="dxa"/>
-              <w:right w:w="100" w:type="dxa"/>
-            </w:tcMar>
-          </w:tcPr>
-          <w:p>
-            <w:pPr>
-              <w:jc w:val="right"/>
-            </w:pPr>
-            <w:r>
-              <w:rPr>
-                <w:sz w:val="17"/>
-                <w:szCs w:val="17"/>
-              </w:rPr>
-              <w:t>1.6 × Bondi vdW</w:t>
-            </w:r>
-          </w:p>
-        </w:tc>
-        <w:tc>
-          <w:tcPr>
-            <w:tcW w:w="5571" w:type="dxa"/>
-            <w:shd w:val="clear" w:color="auto" w:fill="FFFFFF"/>
-            <w:tcMar>
-              <w:top w:w="60" w:type="dxa"/>
-              <w:left w:w="100" w:type="dxa"/>
-              <w:bottom w:w="60" w:type="dxa"/>
-              <w:right w:w="100" w:type="dxa"/>
-            </w:tcMar>
-          </w:tcPr>
-          <w:p>
-            <w:pPr>
-              <w:jc w:val="right"/>
-              <w:rPr>
-                <w:lang w:val="en-GB"/>
-              </w:rPr>
-            </w:pPr>
+              <w:t>ρ</w:t>
+            </w:r>
             <w:r>
               <w:rPr>
                 <w:sz w:val="17"/>
                 <w:szCs w:val="17"/>
                 <w:lang w:val="en-GB"/>
               </w:rPr>
-              <w:t xml:space="preserve">the </w:t>
-            </w:r>
+              <w:t xml:space="preserve"> = 0.001 surface sits at 1.1–1.2 vdW radii; beyond that the ray is looking at another part of the molecule</w:t>
+            </w:r>
+          </w:p>
+        </w:tc>
+      </w:tr>
+      <w:tr>
+        <w:tc>
+          <w:tcPr>
+            <w:tcW w:w="1783" w:type="dxa"/>
+            <w:shd w:val="clear" w:color="auto" w:fill="FFFFFF"/>
+            <w:tcMar>
+              <w:top w:w="60" w:type="dxa"/>
+              <w:left w:w="100" w:type="dxa"/>
+              <w:bottom w:w="60" w:type="dxa"/>
+              <w:right w:w="100" w:type="dxa"/>
+            </w:tcMar>
+          </w:tcPr>
+          <w:p>
             <w:r>
               <w:rPr>
                 <w:sz w:val="17"/>
                 <w:szCs w:val="17"/>
               </w:rPr>
-              <w:t>ρ</w:t>
-            </w:r>
+              <w:t xml:space="preserve">belt half-angle</w:t>
+            </w:r>
+          </w:p>
+        </w:tc>
+        <w:tc>
+          <w:tcPr>
+            <w:tcW w:w="2006" w:type="dxa"/>
+            <w:shd w:val="clear" w:color="auto" w:fill="FFFFFF"/>
+            <w:tcMar>
+              <w:top w:w="60" w:type="dxa"/>
+              <w:left w:w="100" w:type="dxa"/>
+              <w:bottom w:w="60" w:type="dxa"/>
+              <w:right w:w="100" w:type="dxa"/>
+            </w:tcMar>
+          </w:tcPr>
+          <w:p>
+            <w:pPr>
+              <w:jc w:val="right"/>
+            </w:pPr>
+            <w:r>
+              <w:rPr>
+                <w:sz w:val="17"/>
+                <w:szCs w:val="17"/>
+              </w:rPr>
+              <w:t>±69.5° (</w:t>
+            </w:r>
+            <w:r>
+              <w:rPr>
+                <w:rFonts w:ascii="Consolas" w:eastAsia="Consolas" w:hAnsi="Consolas" w:cs="Consolas"/>
+                <w:sz w:val="16"/>
+                <w:szCs w:val="16"/>
+              </w:rPr>
+              <w:t>belt_cos = 0.35</w:t>
+            </w:r>
+            <w:r>
+              <w:rPr>
+                <w:sz w:val="17"/>
+                <w:szCs w:val="17"/>
+              </w:rPr>
+              <w:t>)</w:t>
+            </w:r>
+          </w:p>
+        </w:tc>
+        <w:tc>
+          <w:tcPr>
+            <w:tcW w:w="5571" w:type="dxa"/>
+            <w:shd w:val="clear" w:color="auto" w:fill="FFFFFF"/>
+            <w:tcMar>
+              <w:top w:w="60" w:type="dxa"/>
+              <w:left w:w="100" w:type="dxa"/>
+              <w:bottom w:w="60" w:type="dxa"/>
+              <w:right w:w="100" w:type="dxa"/>
+            </w:tcMar>
+          </w:tcPr>
+          <w:p>
+            <w:pPr>
+              <w:jc w:val="right"/>
+              <w:rPr>
+                <w:lang w:val="en-GB"/>
+              </w:rPr>
+            </w:pPr>
             <w:r>
               <w:rPr>
                 <w:sz w:val="17"/>
                 <w:szCs w:val="17"/>
                 <w:lang w:val="en-GB"/>
               </w:rPr>
-              <w:t xml:space="preserve"> = 0.001 surface sits at 1.1–1.2 vdW radii; beyond that the ray is looking at another part of the molecule</w:t>
+              <w:t>the belt is broad; a narrow band would sample only its rim</w:t>
             </w:r>
           </w:p>
         </w:tc>
@@ -9861,130 +8964,13 @@
             </w:tcMar>
           </w:tcPr>
           <w:p>
-            <w:proofErr w:type="spellStart"/>
             <w:r>
               <w:rPr>
                 <w:sz w:val="17"/>
                 <w:szCs w:val="17"/>
               </w:rPr>
-              <w:t>belt</w:t>
-            </w:r>
-            <w:proofErr w:type="spellEnd"/>
-            <w:r>
-              <w:rPr>
-                <w:sz w:val="17"/>
-                <w:szCs w:val="17"/>
-              </w:rPr>
-              <w:t xml:space="preserve"> half-angle</w:t>
-            </w:r>
-          </w:p>
-        </w:tc>
-        <w:tc>
-          <w:tcPr>
-            <w:tcW w:w="2006" w:type="dxa"/>
-            <w:shd w:val="clear" w:color="auto" w:fill="FFFFFF"/>
-            <w:tcMar>
-              <w:top w:w="60" w:type="dxa"/>
-              <w:left w:w="100" w:type="dxa"/>
-              <w:bottom w:w="60" w:type="dxa"/>
-              <w:right w:w="100" w:type="dxa"/>
-            </w:tcMar>
-          </w:tcPr>
-          <w:p>
-            <w:pPr>
-              <w:jc w:val="right"/>
-            </w:pPr>
-            <w:r>
-              <w:rPr>
-                <w:sz w:val="17"/>
-                <w:szCs w:val="17"/>
-              </w:rPr>
-              <w:t>±69.5° (</w:t>
-            </w:r>
-            <w:r>
-              <w:rPr>
-                <w:rFonts w:ascii="Consolas" w:eastAsia="Consolas" w:hAnsi="Consolas" w:cs="Consolas"/>
-                <w:sz w:val="16"/>
-                <w:szCs w:val="16"/>
-              </w:rPr>
-              <w:t>belt_cos = 0.35</w:t>
-            </w:r>
-            <w:r>
-              <w:rPr>
-                <w:sz w:val="17"/>
-                <w:szCs w:val="17"/>
-              </w:rPr>
-              <w:t>)</w:t>
-            </w:r>
-          </w:p>
-        </w:tc>
-        <w:tc>
-          <w:tcPr>
-            <w:tcW w:w="5571" w:type="dxa"/>
-            <w:shd w:val="clear" w:color="auto" w:fill="FFFFFF"/>
-            <w:tcMar>
-              <w:top w:w="60" w:type="dxa"/>
-              <w:left w:w="100" w:type="dxa"/>
-              <w:bottom w:w="60" w:type="dxa"/>
-              <w:right w:w="100" w:type="dxa"/>
-            </w:tcMar>
-          </w:tcPr>
-          <w:p>
-            <w:pPr>
-              <w:jc w:val="right"/>
-              <w:rPr>
-                <w:lang w:val="en-GB"/>
-              </w:rPr>
-            </w:pPr>
-            <w:r>
-              <w:rPr>
-                <w:sz w:val="17"/>
-                <w:szCs w:val="17"/>
-                <w:lang w:val="en-GB"/>
-              </w:rPr>
-              <w:t>the belt is broad; a narrow band would sample only its rim</w:t>
-            </w:r>
-          </w:p>
-        </w:tc>
-      </w:tr>
-      <w:tr>
-        <w:tc>
-          <w:tcPr>
-            <w:tcW w:w="1783" w:type="dxa"/>
-            <w:shd w:val="clear" w:color="auto" w:fill="FFFFFF"/>
-            <w:tcMar>
-              <w:top w:w="60" w:type="dxa"/>
-              <w:left w:w="100" w:type="dxa"/>
-              <w:bottom w:w="60" w:type="dxa"/>
-              <w:right w:w="100" w:type="dxa"/>
-            </w:tcMar>
-          </w:tcPr>
-          <w:p>
-            <w:proofErr w:type="spellStart"/>
-            <w:r>
-              <w:rPr>
-                <w:sz w:val="17"/>
-                <w:szCs w:val="17"/>
-              </w:rPr>
-              <w:t>belt</w:t>
-            </w:r>
-            <w:proofErr w:type="spellEnd"/>
-            <w:r>
-              <w:rPr>
-                <w:sz w:val="17"/>
-                <w:szCs w:val="17"/>
-              </w:rPr>
-              <w:t xml:space="preserve"> </w:t>
-            </w:r>
-            <w:proofErr w:type="spellStart"/>
-            <w:r>
-              <w:rPr>
-                <w:sz w:val="17"/>
-                <w:szCs w:val="17"/>
-              </w:rPr>
-              <w:t>radius</w:t>
-            </w:r>
-            <w:proofErr w:type="spellEnd"/>
+              <w:t xml:space="preserve">belt radius</w:t>
+            </w:r>
           </w:p>
         </w:tc>
         <w:tc>
@@ -10350,7 +9336,6 @@
             </w:tcMar>
           </w:tcPr>
           <w:p>
-            <w:proofErr w:type="spellStart"/>
             <w:r>
               <w:rPr>
                 <w:rFonts w:ascii="Consolas" w:eastAsia="Consolas" w:hAnsi="Consolas" w:cs="Consolas"/>
@@ -10359,7 +9344,6 @@
               </w:rPr>
               <w:t>surface_quality</w:t>
             </w:r>
-            <w:proofErr w:type="spellEnd"/>
           </w:p>
         </w:tc>
         <w:tc>
@@ -10428,7 +9412,6 @@
             </w:tcMar>
           </w:tcPr>
           <w:p>
-            <w:proofErr w:type="spellStart"/>
             <w:r>
               <w:rPr>
                 <w:rFonts w:ascii="Consolas" w:eastAsia="Consolas" w:hAnsi="Consolas" w:cs="Consolas"/>
@@ -10437,7 +9420,6 @@
               </w:rPr>
               <w:t>orthoscopic</w:t>
             </w:r>
-            <w:proofErr w:type="spellEnd"/>
           </w:p>
         </w:tc>
         <w:tc>
@@ -10506,31 +9488,13 @@
             </w:tcMar>
           </w:tcPr>
           <w:p>
-            <w:proofErr w:type="spellStart"/>
             <w:r>
               <w:rPr>
                 <w:sz w:val="17"/>
                 <w:szCs w:val="17"/>
               </w:rPr>
-              <w:t>image</w:t>
-            </w:r>
-            <w:proofErr w:type="spellEnd"/>
-            <w:r>
-              <w:rPr>
-                <w:sz w:val="17"/>
-                <w:szCs w:val="17"/>
-              </w:rPr>
-              <w:t xml:space="preserve"> </w:t>
-            </w:r>
-            <w:proofErr w:type="spellStart"/>
-            <w:r>
-              <w:rPr>
-                <w:sz w:val="17"/>
-                <w:szCs w:val="17"/>
-              </w:rPr>
-              <w:t>size</w:t>
-            </w:r>
-            <w:proofErr w:type="spellEnd"/>
+              <w:t xml:space="preserve">image size</w:t>
+            </w:r>
           </w:p>
         </w:tc>
         <w:tc>

</xml_diff>

<commit_message>
Found some translation errors in the code, fixed it accordingly
</commit_message>
<xml_diff>
--- a/docs/ESP_Visualization_Background.docx
+++ b/docs/ESP_Visualization_Background.docx
@@ -124,6 +124,11 @@
             </a:graphic>
           </wp:inline>
         </w:drawing>
+      </w:r>
+      <w:r>
+        <w:rPr>
+          <w:noProof/>
+        </w:rPr>
         <w:drawing>
           <wp:inline distT="0" distB="0" distL="0" distR="0" wp14:anchorId="26DB74DC" wp14:editId="4C1EF5B0">
             <wp:extent cx="1428750" cy="1143000"/>
@@ -162,6 +167,11 @@
             </a:graphic>
           </wp:inline>
         </w:drawing>
+      </w:r>
+      <w:r>
+        <w:rPr>
+          <w:noProof/>
+        </w:rPr>
         <w:drawing>
           <wp:inline distT="0" distB="0" distL="0" distR="0" wp14:anchorId="5AC42BA4" wp14:editId="32CB1017">
             <wp:extent cx="1428750" cy="1143000"/>
@@ -310,7 +320,31 @@
           <w:szCs w:val="18"/>
           <w:lang w:val="en-GB"/>
         </w:rPr>
-        <w:t>-hole cap in the middle of the chlorine, the nitro group deep red beside it. Right: in-plane profile. One molecule showing both features the workflow has to get right: a strongly negative functional group and an anisotropic halogen.</w:t>
+        <w:t xml:space="preserve">-hole cap in the middle of the chlorine, the nitro group deep red beside it. Right: in-plane profile. One molecule showing both features the workflow </w:t>
+      </w:r>
+      <w:proofErr w:type="gramStart"/>
+      <w:r>
+        <w:rPr>
+          <w:i/>
+          <w:iCs/>
+          <w:color w:val="595959"/>
+          <w:sz w:val="18"/>
+          <w:szCs w:val="18"/>
+          <w:lang w:val="en-GB"/>
+        </w:rPr>
+        <w:t>has to</w:t>
+      </w:r>
+      <w:proofErr w:type="gramEnd"/>
+      <w:r>
+        <w:rPr>
+          <w:i/>
+          <w:iCs/>
+          <w:color w:val="595959"/>
+          <w:sz w:val="18"/>
+          <w:szCs w:val="18"/>
+          <w:lang w:val="en-GB"/>
+        </w:rPr>
+        <w:t xml:space="preserve"> get right: a strongly negative functional group and an anisotropic halogen.</w:t>
       </w:r>
     </w:p>
     <w:p>
@@ -329,7 +363,21 @@
         <w:rPr>
           <w:lang w:val="en-GB"/>
         </w:rPr>
-        <w:t xml:space="preserve">This document holds the background of the workflow: the conventions behind the images, which number actually describes a </w:t>
+        <w:t xml:space="preserve">This document holds the background of the workflow: the conventions behind the images, which number </w:t>
+      </w:r>
+      <w:proofErr w:type="gramStart"/>
+      <w:r>
+        <w:rPr>
+          <w:lang w:val="en-GB"/>
+        </w:rPr>
+        <w:t>actually describes</w:t>
+      </w:r>
+      <w:proofErr w:type="gramEnd"/>
+      <w:r>
+        <w:rPr>
+          <w:lang w:val="en-GB"/>
+        </w:rPr>
+        <w:t xml:space="preserve"> a </w:t>
       </w:r>
       <w:r>
         <w:t>σ</w:t>
@@ -446,7 +494,11 @@
           </w:pPr>
           <w:r>
             <w:fldChar w:fldCharType="begin"/>
+          </w:r>
+          <w:r>
             <w:instrText xml:space="preserve"> TOC \o "1-3" \h \z \u </w:instrText>
+          </w:r>
+          <w:r>
             <w:fldChar w:fldCharType="separate"/>
           </w:r>
           <w:hyperlink w:anchor="_Toc238548482" w:history="1">
@@ -464,10 +516,46 @@
                 <w:webHidden/>
               </w:rPr>
               <w:tab/>
+            </w:r>
+            <w:r>
+              <w:rPr>
+                <w:noProof/>
+                <w:webHidden/>
+              </w:rPr>
               <w:fldChar w:fldCharType="begin"/>
+            </w:r>
+            <w:r>
+              <w:rPr>
+                <w:noProof/>
+                <w:webHidden/>
+              </w:rPr>
               <w:instrText xml:space="preserve"> PAGEREF _Toc238548482 \h </w:instrText>
+            </w:r>
+            <w:r>
+              <w:rPr>
+                <w:noProof/>
+                <w:webHidden/>
+              </w:rPr>
+            </w:r>
+            <w:r>
+              <w:rPr>
+                <w:noProof/>
+                <w:webHidden/>
+              </w:rPr>
               <w:fldChar w:fldCharType="separate"/>
+            </w:r>
+            <w:r>
+              <w:rPr>
+                <w:noProof/>
+                <w:webHidden/>
+              </w:rPr>
               <w:t>3</w:t>
+            </w:r>
+            <w:r>
+              <w:rPr>
+                <w:noProof/>
+                <w:webHidden/>
+              </w:rPr>
               <w:fldChar w:fldCharType="end"/>
             </w:r>
           </w:hyperlink>
@@ -517,10 +605,46 @@
                 <w:webHidden/>
               </w:rPr>
               <w:tab/>
+            </w:r>
+            <w:r>
+              <w:rPr>
+                <w:noProof/>
+                <w:webHidden/>
+              </w:rPr>
               <w:fldChar w:fldCharType="begin"/>
+            </w:r>
+            <w:r>
+              <w:rPr>
+                <w:noProof/>
+                <w:webHidden/>
+              </w:rPr>
               <w:instrText xml:space="preserve"> PAGEREF _Toc238548483 \h </w:instrText>
+            </w:r>
+            <w:r>
+              <w:rPr>
+                <w:noProof/>
+                <w:webHidden/>
+              </w:rPr>
+            </w:r>
+            <w:r>
+              <w:rPr>
+                <w:noProof/>
+                <w:webHidden/>
+              </w:rPr>
               <w:fldChar w:fldCharType="separate"/>
+            </w:r>
+            <w:r>
+              <w:rPr>
+                <w:noProof/>
+                <w:webHidden/>
+              </w:rPr>
               <w:t>3</w:t>
+            </w:r>
+            <w:r>
+              <w:rPr>
+                <w:noProof/>
+                <w:webHidden/>
+              </w:rPr>
               <w:fldChar w:fldCharType="end"/>
             </w:r>
           </w:hyperlink>
@@ -564,10 +688,46 @@
                 <w:webHidden/>
               </w:rPr>
               <w:tab/>
+            </w:r>
+            <w:r>
+              <w:rPr>
+                <w:noProof/>
+                <w:webHidden/>
+              </w:rPr>
               <w:fldChar w:fldCharType="begin"/>
+            </w:r>
+            <w:r>
+              <w:rPr>
+                <w:noProof/>
+                <w:webHidden/>
+              </w:rPr>
               <w:instrText xml:space="preserve"> PAGEREF _Toc238548484 \h </w:instrText>
+            </w:r>
+            <w:r>
+              <w:rPr>
+                <w:noProof/>
+                <w:webHidden/>
+              </w:rPr>
+            </w:r>
+            <w:r>
+              <w:rPr>
+                <w:noProof/>
+                <w:webHidden/>
+              </w:rPr>
               <w:fldChar w:fldCharType="separate"/>
+            </w:r>
+            <w:r>
+              <w:rPr>
+                <w:noProof/>
+                <w:webHidden/>
+              </w:rPr>
               <w:t>3</w:t>
+            </w:r>
+            <w:r>
+              <w:rPr>
+                <w:noProof/>
+                <w:webHidden/>
+              </w:rPr>
               <w:fldChar w:fldCharType="end"/>
             </w:r>
           </w:hyperlink>
@@ -617,10 +777,46 @@
                 <w:webHidden/>
               </w:rPr>
               <w:tab/>
+            </w:r>
+            <w:r>
+              <w:rPr>
+                <w:noProof/>
+                <w:webHidden/>
+              </w:rPr>
               <w:fldChar w:fldCharType="begin"/>
+            </w:r>
+            <w:r>
+              <w:rPr>
+                <w:noProof/>
+                <w:webHidden/>
+              </w:rPr>
               <w:instrText xml:space="preserve"> PAGEREF _Toc238548485 \h </w:instrText>
+            </w:r>
+            <w:r>
+              <w:rPr>
+                <w:noProof/>
+                <w:webHidden/>
+              </w:rPr>
+            </w:r>
+            <w:r>
+              <w:rPr>
+                <w:noProof/>
+                <w:webHidden/>
+              </w:rPr>
               <w:fldChar w:fldCharType="separate"/>
+            </w:r>
+            <w:r>
+              <w:rPr>
+                <w:noProof/>
+                <w:webHidden/>
+              </w:rPr>
               <w:t>4</w:t>
+            </w:r>
+            <w:r>
+              <w:rPr>
+                <w:noProof/>
+                <w:webHidden/>
+              </w:rPr>
               <w:fldChar w:fldCharType="end"/>
             </w:r>
           </w:hyperlink>
@@ -655,10 +851,46 @@
                 <w:webHidden/>
               </w:rPr>
               <w:tab/>
+            </w:r>
+            <w:r>
+              <w:rPr>
+                <w:noProof/>
+                <w:webHidden/>
+              </w:rPr>
               <w:fldChar w:fldCharType="begin"/>
+            </w:r>
+            <w:r>
+              <w:rPr>
+                <w:noProof/>
+                <w:webHidden/>
+              </w:rPr>
               <w:instrText xml:space="preserve"> PAGEREF _Toc238548486 \h </w:instrText>
+            </w:r>
+            <w:r>
+              <w:rPr>
+                <w:noProof/>
+                <w:webHidden/>
+              </w:rPr>
+            </w:r>
+            <w:r>
+              <w:rPr>
+                <w:noProof/>
+                <w:webHidden/>
+              </w:rPr>
               <w:fldChar w:fldCharType="separate"/>
+            </w:r>
+            <w:r>
+              <w:rPr>
+                <w:noProof/>
+                <w:webHidden/>
+              </w:rPr>
               <w:t>4</w:t>
+            </w:r>
+            <w:r>
+              <w:rPr>
+                <w:noProof/>
+                <w:webHidden/>
+              </w:rPr>
               <w:fldChar w:fldCharType="end"/>
             </w:r>
           </w:hyperlink>
@@ -693,10 +925,46 @@
                 <w:webHidden/>
               </w:rPr>
               <w:tab/>
+            </w:r>
+            <w:r>
+              <w:rPr>
+                <w:noProof/>
+                <w:webHidden/>
+              </w:rPr>
               <w:fldChar w:fldCharType="begin"/>
+            </w:r>
+            <w:r>
+              <w:rPr>
+                <w:noProof/>
+                <w:webHidden/>
+              </w:rPr>
               <w:instrText xml:space="preserve"> PAGEREF _Toc238548487 \h </w:instrText>
+            </w:r>
+            <w:r>
+              <w:rPr>
+                <w:noProof/>
+                <w:webHidden/>
+              </w:rPr>
+            </w:r>
+            <w:r>
+              <w:rPr>
+                <w:noProof/>
+                <w:webHidden/>
+              </w:rPr>
               <w:fldChar w:fldCharType="separate"/>
+            </w:r>
+            <w:r>
+              <w:rPr>
+                <w:noProof/>
+                <w:webHidden/>
+              </w:rPr>
               <w:t>5</w:t>
+            </w:r>
+            <w:r>
+              <w:rPr>
+                <w:noProof/>
+                <w:webHidden/>
+              </w:rPr>
               <w:fldChar w:fldCharType="end"/>
             </w:r>
           </w:hyperlink>
@@ -746,10 +1014,46 @@
                 <w:webHidden/>
               </w:rPr>
               <w:tab/>
+            </w:r>
+            <w:r>
+              <w:rPr>
+                <w:noProof/>
+                <w:webHidden/>
+              </w:rPr>
               <w:fldChar w:fldCharType="begin"/>
+            </w:r>
+            <w:r>
+              <w:rPr>
+                <w:noProof/>
+                <w:webHidden/>
+              </w:rPr>
               <w:instrText xml:space="preserve"> PAGEREF _Toc238548488 \h </w:instrText>
+            </w:r>
+            <w:r>
+              <w:rPr>
+                <w:noProof/>
+                <w:webHidden/>
+              </w:rPr>
+            </w:r>
+            <w:r>
+              <w:rPr>
+                <w:noProof/>
+                <w:webHidden/>
+              </w:rPr>
               <w:fldChar w:fldCharType="separate"/>
+            </w:r>
+            <w:r>
+              <w:rPr>
+                <w:noProof/>
+                <w:webHidden/>
+              </w:rPr>
               <w:t>5</w:t>
+            </w:r>
+            <w:r>
+              <w:rPr>
+                <w:noProof/>
+                <w:webHidden/>
+              </w:rPr>
               <w:fldChar w:fldCharType="end"/>
             </w:r>
           </w:hyperlink>
@@ -784,10 +1088,46 @@
                 <w:webHidden/>
               </w:rPr>
               <w:tab/>
+            </w:r>
+            <w:r>
+              <w:rPr>
+                <w:noProof/>
+                <w:webHidden/>
+              </w:rPr>
               <w:fldChar w:fldCharType="begin"/>
+            </w:r>
+            <w:r>
+              <w:rPr>
+                <w:noProof/>
+                <w:webHidden/>
+              </w:rPr>
               <w:instrText xml:space="preserve"> PAGEREF _Toc238548489 \h </w:instrText>
+            </w:r>
+            <w:r>
+              <w:rPr>
+                <w:noProof/>
+                <w:webHidden/>
+              </w:rPr>
+            </w:r>
+            <w:r>
+              <w:rPr>
+                <w:noProof/>
+                <w:webHidden/>
+              </w:rPr>
               <w:fldChar w:fldCharType="separate"/>
+            </w:r>
+            <w:r>
+              <w:rPr>
+                <w:noProof/>
+                <w:webHidden/>
+              </w:rPr>
               <w:t>6</w:t>
+            </w:r>
+            <w:r>
+              <w:rPr>
+                <w:noProof/>
+                <w:webHidden/>
+              </w:rPr>
               <w:fldChar w:fldCharType="end"/>
             </w:r>
           </w:hyperlink>
@@ -822,10 +1162,46 @@
                 <w:webHidden/>
               </w:rPr>
               <w:tab/>
+            </w:r>
+            <w:r>
+              <w:rPr>
+                <w:noProof/>
+                <w:webHidden/>
+              </w:rPr>
               <w:fldChar w:fldCharType="begin"/>
+            </w:r>
+            <w:r>
+              <w:rPr>
+                <w:noProof/>
+                <w:webHidden/>
+              </w:rPr>
               <w:instrText xml:space="preserve"> PAGEREF _Toc238548490 \h </w:instrText>
+            </w:r>
+            <w:r>
+              <w:rPr>
+                <w:noProof/>
+                <w:webHidden/>
+              </w:rPr>
+            </w:r>
+            <w:r>
+              <w:rPr>
+                <w:noProof/>
+                <w:webHidden/>
+              </w:rPr>
               <w:fldChar w:fldCharType="separate"/>
+            </w:r>
+            <w:r>
+              <w:rPr>
+                <w:noProof/>
+                <w:webHidden/>
+              </w:rPr>
               <w:t>6</w:t>
+            </w:r>
+            <w:r>
+              <w:rPr>
+                <w:noProof/>
+                <w:webHidden/>
+              </w:rPr>
               <w:fldChar w:fldCharType="end"/>
             </w:r>
           </w:hyperlink>
@@ -860,10 +1236,46 @@
                 <w:webHidden/>
               </w:rPr>
               <w:tab/>
+            </w:r>
+            <w:r>
+              <w:rPr>
+                <w:noProof/>
+                <w:webHidden/>
+              </w:rPr>
               <w:fldChar w:fldCharType="begin"/>
+            </w:r>
+            <w:r>
+              <w:rPr>
+                <w:noProof/>
+                <w:webHidden/>
+              </w:rPr>
               <w:instrText xml:space="preserve"> PAGEREF _Toc238548491 \h </w:instrText>
+            </w:r>
+            <w:r>
+              <w:rPr>
+                <w:noProof/>
+                <w:webHidden/>
+              </w:rPr>
+            </w:r>
+            <w:r>
+              <w:rPr>
+                <w:noProof/>
+                <w:webHidden/>
+              </w:rPr>
               <w:fldChar w:fldCharType="separate"/>
+            </w:r>
+            <w:r>
+              <w:rPr>
+                <w:noProof/>
+                <w:webHidden/>
+              </w:rPr>
               <w:t>7</w:t>
+            </w:r>
+            <w:r>
+              <w:rPr>
+                <w:noProof/>
+                <w:webHidden/>
+              </w:rPr>
               <w:fldChar w:fldCharType="end"/>
             </w:r>
           </w:hyperlink>
@@ -913,10 +1325,46 @@
                 <w:webHidden/>
               </w:rPr>
               <w:tab/>
+            </w:r>
+            <w:r>
+              <w:rPr>
+                <w:noProof/>
+                <w:webHidden/>
+              </w:rPr>
               <w:fldChar w:fldCharType="begin"/>
+            </w:r>
+            <w:r>
+              <w:rPr>
+                <w:noProof/>
+                <w:webHidden/>
+              </w:rPr>
               <w:instrText xml:space="preserve"> PAGEREF _Toc238548492 \h </w:instrText>
+            </w:r>
+            <w:r>
+              <w:rPr>
+                <w:noProof/>
+                <w:webHidden/>
+              </w:rPr>
+            </w:r>
+            <w:r>
+              <w:rPr>
+                <w:noProof/>
+                <w:webHidden/>
+              </w:rPr>
               <w:fldChar w:fldCharType="separate"/>
+            </w:r>
+            <w:r>
+              <w:rPr>
+                <w:noProof/>
+                <w:webHidden/>
+              </w:rPr>
               <w:t>7</w:t>
+            </w:r>
+            <w:r>
+              <w:rPr>
+                <w:noProof/>
+                <w:webHidden/>
+              </w:rPr>
               <w:fldChar w:fldCharType="end"/>
             </w:r>
           </w:hyperlink>
@@ -951,10 +1399,46 @@
                 <w:webHidden/>
               </w:rPr>
               <w:tab/>
+            </w:r>
+            <w:r>
+              <w:rPr>
+                <w:noProof/>
+                <w:webHidden/>
+              </w:rPr>
               <w:fldChar w:fldCharType="begin"/>
+            </w:r>
+            <w:r>
+              <w:rPr>
+                <w:noProof/>
+                <w:webHidden/>
+              </w:rPr>
               <w:instrText xml:space="preserve"> PAGEREF _Toc238548493 \h </w:instrText>
+            </w:r>
+            <w:r>
+              <w:rPr>
+                <w:noProof/>
+                <w:webHidden/>
+              </w:rPr>
+            </w:r>
+            <w:r>
+              <w:rPr>
+                <w:noProof/>
+                <w:webHidden/>
+              </w:rPr>
               <w:fldChar w:fldCharType="separate"/>
+            </w:r>
+            <w:r>
+              <w:rPr>
+                <w:noProof/>
+                <w:webHidden/>
+              </w:rPr>
               <w:t>8</w:t>
+            </w:r>
+            <w:r>
+              <w:rPr>
+                <w:noProof/>
+                <w:webHidden/>
+              </w:rPr>
               <w:fldChar w:fldCharType="end"/>
             </w:r>
           </w:hyperlink>
@@ -989,10 +1473,46 @@
                 <w:webHidden/>
               </w:rPr>
               <w:tab/>
+            </w:r>
+            <w:r>
+              <w:rPr>
+                <w:noProof/>
+                <w:webHidden/>
+              </w:rPr>
               <w:fldChar w:fldCharType="begin"/>
+            </w:r>
+            <w:r>
+              <w:rPr>
+                <w:noProof/>
+                <w:webHidden/>
+              </w:rPr>
               <w:instrText xml:space="preserve"> PAGEREF _Toc238548494 \h </w:instrText>
+            </w:r>
+            <w:r>
+              <w:rPr>
+                <w:noProof/>
+                <w:webHidden/>
+              </w:rPr>
+            </w:r>
+            <w:r>
+              <w:rPr>
+                <w:noProof/>
+                <w:webHidden/>
+              </w:rPr>
               <w:fldChar w:fldCharType="separate"/>
+            </w:r>
+            <w:r>
+              <w:rPr>
+                <w:noProof/>
+                <w:webHidden/>
+              </w:rPr>
               <w:t>8</w:t>
+            </w:r>
+            <w:r>
+              <w:rPr>
+                <w:noProof/>
+                <w:webHidden/>
+              </w:rPr>
               <w:fldChar w:fldCharType="end"/>
             </w:r>
           </w:hyperlink>
@@ -1042,10 +1562,46 @@
                 <w:webHidden/>
               </w:rPr>
               <w:tab/>
+            </w:r>
+            <w:r>
+              <w:rPr>
+                <w:noProof/>
+                <w:webHidden/>
+              </w:rPr>
               <w:fldChar w:fldCharType="begin"/>
+            </w:r>
+            <w:r>
+              <w:rPr>
+                <w:noProof/>
+                <w:webHidden/>
+              </w:rPr>
               <w:instrText xml:space="preserve"> PAGEREF _Toc238548495 \h </w:instrText>
+            </w:r>
+            <w:r>
+              <w:rPr>
+                <w:noProof/>
+                <w:webHidden/>
+              </w:rPr>
+            </w:r>
+            <w:r>
+              <w:rPr>
+                <w:noProof/>
+                <w:webHidden/>
+              </w:rPr>
               <w:fldChar w:fldCharType="separate"/>
+            </w:r>
+            <w:r>
+              <w:rPr>
+                <w:noProof/>
+                <w:webHidden/>
+              </w:rPr>
               <w:t>8</w:t>
+            </w:r>
+            <w:r>
+              <w:rPr>
+                <w:noProof/>
+                <w:webHidden/>
+              </w:rPr>
               <w:fldChar w:fldCharType="end"/>
             </w:r>
           </w:hyperlink>
@@ -1079,10 +1635,46 @@
                 <w:webHidden/>
               </w:rPr>
               <w:tab/>
+            </w:r>
+            <w:r>
+              <w:rPr>
+                <w:noProof/>
+                <w:webHidden/>
+              </w:rPr>
               <w:fldChar w:fldCharType="begin"/>
+            </w:r>
+            <w:r>
+              <w:rPr>
+                <w:noProof/>
+                <w:webHidden/>
+              </w:rPr>
               <w:instrText xml:space="preserve"> PAGEREF _Toc238548496 \h </w:instrText>
+            </w:r>
+            <w:r>
+              <w:rPr>
+                <w:noProof/>
+                <w:webHidden/>
+              </w:rPr>
+            </w:r>
+            <w:r>
+              <w:rPr>
+                <w:noProof/>
+                <w:webHidden/>
+              </w:rPr>
               <w:fldChar w:fldCharType="separate"/>
+            </w:r>
+            <w:r>
+              <w:rPr>
+                <w:noProof/>
+                <w:webHidden/>
+              </w:rPr>
               <w:t>9</w:t>
+            </w:r>
+            <w:r>
+              <w:rPr>
+                <w:noProof/>
+                <w:webHidden/>
+              </w:rPr>
               <w:fldChar w:fldCharType="end"/>
             </w:r>
           </w:hyperlink>
@@ -1117,10 +1709,46 @@
                 <w:webHidden/>
               </w:rPr>
               <w:tab/>
+            </w:r>
+            <w:r>
+              <w:rPr>
+                <w:noProof/>
+                <w:webHidden/>
+              </w:rPr>
               <w:fldChar w:fldCharType="begin"/>
+            </w:r>
+            <w:r>
+              <w:rPr>
+                <w:noProof/>
+                <w:webHidden/>
+              </w:rPr>
               <w:instrText xml:space="preserve"> PAGEREF _Toc238548497 \h </w:instrText>
+            </w:r>
+            <w:r>
+              <w:rPr>
+                <w:noProof/>
+                <w:webHidden/>
+              </w:rPr>
+            </w:r>
+            <w:r>
+              <w:rPr>
+                <w:noProof/>
+                <w:webHidden/>
+              </w:rPr>
               <w:fldChar w:fldCharType="separate"/>
+            </w:r>
+            <w:r>
+              <w:rPr>
+                <w:noProof/>
+                <w:webHidden/>
+              </w:rPr>
               <w:t>9</w:t>
+            </w:r>
+            <w:r>
+              <w:rPr>
+                <w:noProof/>
+                <w:webHidden/>
+              </w:rPr>
               <w:fldChar w:fldCharType="end"/>
             </w:r>
           </w:hyperlink>
@@ -1155,10 +1783,46 @@
                 <w:webHidden/>
               </w:rPr>
               <w:tab/>
+            </w:r>
+            <w:r>
+              <w:rPr>
+                <w:noProof/>
+                <w:webHidden/>
+              </w:rPr>
               <w:fldChar w:fldCharType="begin"/>
+            </w:r>
+            <w:r>
+              <w:rPr>
+                <w:noProof/>
+                <w:webHidden/>
+              </w:rPr>
               <w:instrText xml:space="preserve"> PAGEREF _Toc238548498 \h </w:instrText>
+            </w:r>
+            <w:r>
+              <w:rPr>
+                <w:noProof/>
+                <w:webHidden/>
+              </w:rPr>
+            </w:r>
+            <w:r>
+              <w:rPr>
+                <w:noProof/>
+                <w:webHidden/>
+              </w:rPr>
               <w:fldChar w:fldCharType="separate"/>
+            </w:r>
+            <w:r>
+              <w:rPr>
+                <w:noProof/>
+                <w:webHidden/>
+              </w:rPr>
               <w:t>10</w:t>
+            </w:r>
+            <w:r>
+              <w:rPr>
+                <w:noProof/>
+                <w:webHidden/>
+              </w:rPr>
               <w:fldChar w:fldCharType="end"/>
             </w:r>
           </w:hyperlink>
@@ -1192,10 +1856,46 @@
                 <w:webHidden/>
               </w:rPr>
               <w:tab/>
+            </w:r>
+            <w:r>
+              <w:rPr>
+                <w:noProof/>
+                <w:webHidden/>
+              </w:rPr>
               <w:fldChar w:fldCharType="begin"/>
+            </w:r>
+            <w:r>
+              <w:rPr>
+                <w:noProof/>
+                <w:webHidden/>
+              </w:rPr>
               <w:instrText xml:space="preserve"> PAGEREF _Toc238548499 \h </w:instrText>
+            </w:r>
+            <w:r>
+              <w:rPr>
+                <w:noProof/>
+                <w:webHidden/>
+              </w:rPr>
+            </w:r>
+            <w:r>
+              <w:rPr>
+                <w:noProof/>
+                <w:webHidden/>
+              </w:rPr>
               <w:fldChar w:fldCharType="separate"/>
+            </w:r>
+            <w:r>
+              <w:rPr>
+                <w:noProof/>
+                <w:webHidden/>
+              </w:rPr>
               <w:t>10</w:t>
+            </w:r>
+            <w:r>
+              <w:rPr>
+                <w:noProof/>
+                <w:webHidden/>
+              </w:rPr>
               <w:fldChar w:fldCharType="end"/>
             </w:r>
           </w:hyperlink>
@@ -1230,10 +1930,46 @@
                 <w:webHidden/>
               </w:rPr>
               <w:tab/>
+            </w:r>
+            <w:r>
+              <w:rPr>
+                <w:noProof/>
+                <w:webHidden/>
+              </w:rPr>
               <w:fldChar w:fldCharType="begin"/>
+            </w:r>
+            <w:r>
+              <w:rPr>
+                <w:noProof/>
+                <w:webHidden/>
+              </w:rPr>
               <w:instrText xml:space="preserve"> PAGEREF _Toc238548500 \h </w:instrText>
+            </w:r>
+            <w:r>
+              <w:rPr>
+                <w:noProof/>
+                <w:webHidden/>
+              </w:rPr>
+            </w:r>
+            <w:r>
+              <w:rPr>
+                <w:noProof/>
+                <w:webHidden/>
+              </w:rPr>
               <w:fldChar w:fldCharType="separate"/>
+            </w:r>
+            <w:r>
+              <w:rPr>
+                <w:noProof/>
+                <w:webHidden/>
+              </w:rPr>
               <w:t>11</w:t>
+            </w:r>
+            <w:r>
+              <w:rPr>
+                <w:noProof/>
+                <w:webHidden/>
+              </w:rPr>
               <w:fldChar w:fldCharType="end"/>
             </w:r>
           </w:hyperlink>
@@ -1268,10 +2004,46 @@
                 <w:webHidden/>
               </w:rPr>
               <w:tab/>
+            </w:r>
+            <w:r>
+              <w:rPr>
+                <w:noProof/>
+                <w:webHidden/>
+              </w:rPr>
               <w:fldChar w:fldCharType="begin"/>
+            </w:r>
+            <w:r>
+              <w:rPr>
+                <w:noProof/>
+                <w:webHidden/>
+              </w:rPr>
               <w:instrText xml:space="preserve"> PAGEREF _Toc238548501 \h </w:instrText>
+            </w:r>
+            <w:r>
+              <w:rPr>
+                <w:noProof/>
+                <w:webHidden/>
+              </w:rPr>
+            </w:r>
+            <w:r>
+              <w:rPr>
+                <w:noProof/>
+                <w:webHidden/>
+              </w:rPr>
               <w:fldChar w:fldCharType="separate"/>
+            </w:r>
+            <w:r>
+              <w:rPr>
+                <w:noProof/>
+                <w:webHidden/>
+              </w:rPr>
               <w:t>11</w:t>
+            </w:r>
+            <w:r>
+              <w:rPr>
+                <w:noProof/>
+                <w:webHidden/>
+              </w:rPr>
               <w:fldChar w:fldCharType="end"/>
             </w:r>
           </w:hyperlink>
@@ -1305,10 +2077,46 @@
                 <w:webHidden/>
               </w:rPr>
               <w:tab/>
+            </w:r>
+            <w:r>
+              <w:rPr>
+                <w:noProof/>
+                <w:webHidden/>
+              </w:rPr>
               <w:fldChar w:fldCharType="begin"/>
+            </w:r>
+            <w:r>
+              <w:rPr>
+                <w:noProof/>
+                <w:webHidden/>
+              </w:rPr>
               <w:instrText xml:space="preserve"> PAGEREF _Toc238548502 \h </w:instrText>
+            </w:r>
+            <w:r>
+              <w:rPr>
+                <w:noProof/>
+                <w:webHidden/>
+              </w:rPr>
+            </w:r>
+            <w:r>
+              <w:rPr>
+                <w:noProof/>
+                <w:webHidden/>
+              </w:rPr>
               <w:fldChar w:fldCharType="separate"/>
+            </w:r>
+            <w:r>
+              <w:rPr>
+                <w:noProof/>
+                <w:webHidden/>
+              </w:rPr>
               <w:t>11</w:t>
+            </w:r>
+            <w:r>
+              <w:rPr>
+                <w:noProof/>
+                <w:webHidden/>
+              </w:rPr>
               <w:fldChar w:fldCharType="end"/>
             </w:r>
           </w:hyperlink>
@@ -1361,12 +2169,20 @@
         </w:rPr>
       </w:pPr>
       <w:bookmarkStart w:id="1" w:name="_Toc238548482"/>
+      <w:proofErr w:type="gramStart"/>
       <w:r>
         <w:rPr>
           <w:lang w:val="en-GB"/>
         </w:rPr>
         <w:lastRenderedPageBreak/>
-        <w:t>1  Why these images look the way they do</w:t>
+        <w:t>1  Why</w:t>
+      </w:r>
+      <w:proofErr w:type="gramEnd"/>
+      <w:r>
+        <w:rPr>
+          <w:lang w:val="en-GB"/>
+        </w:rPr>
+        <w:t xml:space="preserve"> these images look the way they do</w:t>
       </w:r>
       <w:bookmarkEnd w:id="0"/>
       <w:bookmarkEnd w:id="1"/>
@@ -1526,11 +2342,19 @@
       </w:pPr>
       <w:bookmarkStart w:id="2" w:name="_Toc238466586"/>
       <w:bookmarkStart w:id="3" w:name="_Toc238548483"/>
-      <w:r>
-        <w:rPr>
-          <w:lang w:val="en-GB"/>
-        </w:rPr>
-        <w:t xml:space="preserve">2  Which number describes the </w:t>
+      <w:proofErr w:type="gramStart"/>
+      <w:r>
+        <w:rPr>
+          <w:lang w:val="en-GB"/>
+        </w:rPr>
+        <w:t>2  Which</w:t>
+      </w:r>
+      <w:proofErr w:type="gramEnd"/>
+      <w:r>
+        <w:rPr>
+          <w:lang w:val="en-GB"/>
+        </w:rPr>
+        <w:t xml:space="preserve"> number describes the </w:t>
       </w:r>
       <w:r>
         <w:t>σ</w:t>
@@ -1554,11 +2378,26 @@
       </w:pPr>
       <w:bookmarkStart w:id="4" w:name="_Toc238466587"/>
       <w:bookmarkStart w:id="5" w:name="_Toc238548484"/>
-      <w:r>
-        <w:rPr>
-          <w:lang w:val="en-GB"/>
-        </w:rPr>
-        <w:t>2.1  Not V</w:t>
+      <w:proofErr w:type="gramStart"/>
+      <w:r>
+        <w:rPr>
+          <w:lang w:val="en-GB"/>
+        </w:rPr>
+        <w:t>2.1  Not</w:t>
+      </w:r>
+      <w:proofErr w:type="gramEnd"/>
+      <w:r>
+        <w:rPr>
+          <w:lang w:val="en-GB"/>
+        </w:rPr>
+        <w:t xml:space="preserve"> </w:t>
+      </w:r>
+      <w:proofErr w:type="gramStart"/>
+      <w:r>
+        <w:rPr>
+          <w:lang w:val="en-GB"/>
+        </w:rPr>
+        <w:t>V</w:t>
       </w:r>
       <w:r>
         <w:rPr>
@@ -1569,6 +2408,7 @@
       </w:r>
       <w:bookmarkEnd w:id="4"/>
       <w:bookmarkEnd w:id="5"/>
+      <w:proofErr w:type="gramEnd"/>
     </w:p>
     <w:p>
       <w:pPr>
@@ -1864,7 +2704,15 @@
                 <w:sz w:val="17"/>
                 <w:szCs w:val="17"/>
               </w:rPr>
-              <w:t>ring hydrogens = global V</w:t>
+              <w:t xml:space="preserve">ring hydrogens = global </w:t>
+            </w:r>
+            <w:proofErr w:type="gramStart"/>
+            <w:r>
+              <w:rPr>
+                <w:sz w:val="17"/>
+                <w:szCs w:val="17"/>
+              </w:rPr>
+              <w:t>V</w:t>
             </w:r>
             <w:r>
               <w:rPr>
@@ -1874,6 +2722,7 @@
               </w:rPr>
               <w:t>S,max</w:t>
             </w:r>
+            <w:proofErr w:type="gramEnd"/>
           </w:p>
         </w:tc>
         <w:tc>
@@ -1967,7 +2816,15 @@
                 <w:sz w:val="17"/>
                 <w:szCs w:val="17"/>
               </w:rPr>
-              <w:t>halogen belt = global V</w:t>
+              <w:t xml:space="preserve">halogen belt = global </w:t>
+            </w:r>
+            <w:proofErr w:type="gramStart"/>
+            <w:r>
+              <w:rPr>
+                <w:sz w:val="17"/>
+                <w:szCs w:val="17"/>
+              </w:rPr>
+              <w:t>V</w:t>
             </w:r>
             <w:r>
               <w:rPr>
@@ -1977,6 +2834,7 @@
               </w:rPr>
               <w:t>S,min</w:t>
             </w:r>
+            <w:proofErr w:type="gramEnd"/>
           </w:p>
         </w:tc>
         <w:tc>
@@ -2147,60 +3005,224 @@
           <w:sz w:val="15"/>
           <w:szCs w:val="15"/>
         </w:rPr>
-        <w:t>V_S,max = +0.0312 a.u.  =  +19.6 kcal/(mol*e)   auf H5</w:t>
-      </w:r>
-      <w:r>
-        <w:br/>
-      </w:r>
+        <w:t>V_</w:t>
+      </w:r>
+      <w:proofErr w:type="gramStart"/>
       <w:r>
         <w:rPr>
           <w:rFonts w:ascii="Consolas" w:eastAsia="Consolas" w:hAnsi="Consolas" w:cs="Consolas"/>
           <w:sz w:val="15"/>
           <w:szCs w:val="15"/>
         </w:rPr>
-        <w:t xml:space="preserve">  Lokal am Halogen (Br):</w:t>
-      </w:r>
-      <w:r>
-        <w:br/>
-      </w:r>
+        <w:t>S,max</w:t>
+      </w:r>
+      <w:proofErr w:type="gramEnd"/>
       <w:r>
         <w:rPr>
           <w:rFonts w:ascii="Consolas" w:eastAsia="Consolas" w:hAnsi="Consolas" w:cs="Consolas"/>
           <w:sz w:val="15"/>
           <w:szCs w:val="15"/>
         </w:rPr>
-        <w:t xml:space="preserve">    sigma-Loch  = +0.0126 a.u.  =   +7.9 kcal/(mol*e)   [144 Punkte]</w:t>
-      </w:r>
-      <w:r>
-        <w:br/>
-      </w:r>
+        <w:t xml:space="preserve"> = +0.0312 a.u.  </w:t>
+      </w:r>
+      <w:proofErr w:type="gramStart"/>
       <w:r>
         <w:rPr>
           <w:rFonts w:ascii="Consolas" w:eastAsia="Consolas" w:hAnsi="Consolas" w:cs="Consolas"/>
           <w:sz w:val="15"/>
           <w:szCs w:val="15"/>
         </w:rPr>
-        <w:t xml:space="preserve">    Guertel     = -0.0188 a.u.  =  -11.8 kcal/(mol*e)   [836 Punkte]</w:t>
-      </w:r>
-      <w:r>
-        <w:br/>
-      </w:r>
+        <w:t>=  +</w:t>
+      </w:r>
+      <w:proofErr w:type="gramEnd"/>
       <w:r>
         <w:rPr>
           <w:rFonts w:ascii="Consolas" w:eastAsia="Consolas" w:hAnsi="Consolas" w:cs="Consolas"/>
           <w:sz w:val="15"/>
           <w:szCs w:val="15"/>
         </w:rPr>
-        <w:t xml:space="preserve">    ! </w:t>
-      </w:r>
+        <w:t>19.6 kcal/(mol*</w:t>
+      </w:r>
+      <w:proofErr w:type="gramStart"/>
       <w:r>
         <w:rPr>
           <w:rFonts w:ascii="Consolas" w:eastAsia="Consolas" w:hAnsi="Consolas" w:cs="Consolas"/>
           <w:sz w:val="15"/>
           <w:szCs w:val="15"/>
-          <w:lang w:val="en-GB"/>
-        </w:rPr>
-        <w:t>V_S,max liegt auf H5, nicht auf dem Halogen</w:t>
+        </w:rPr>
+        <w:t xml:space="preserve">e)   </w:t>
+      </w:r>
+      <w:proofErr w:type="gramEnd"/>
+      <w:r>
+        <w:rPr>
+          <w:rFonts w:ascii="Consolas" w:eastAsia="Consolas" w:hAnsi="Consolas" w:cs="Consolas"/>
+          <w:sz w:val="15"/>
+          <w:szCs w:val="15"/>
+        </w:rPr>
+        <w:t>auf H5</w:t>
+      </w:r>
+      <w:r>
+        <w:br/>
+      </w:r>
+      <w:r>
+        <w:rPr>
+          <w:rFonts w:ascii="Consolas" w:eastAsia="Consolas" w:hAnsi="Consolas" w:cs="Consolas"/>
+          <w:sz w:val="15"/>
+          <w:szCs w:val="15"/>
+        </w:rPr>
+        <w:t xml:space="preserve">  Lokal am Halogen (Br):</w:t>
+      </w:r>
+      <w:r>
+        <w:br/>
+      </w:r>
+      <w:r>
+        <w:rPr>
+          <w:rFonts w:ascii="Consolas" w:eastAsia="Consolas" w:hAnsi="Consolas" w:cs="Consolas"/>
+          <w:sz w:val="15"/>
+          <w:szCs w:val="15"/>
+        </w:rPr>
+        <w:t xml:space="preserve">    sigma-</w:t>
+      </w:r>
+      <w:proofErr w:type="gramStart"/>
+      <w:r>
+        <w:rPr>
+          <w:rFonts w:ascii="Consolas" w:eastAsia="Consolas" w:hAnsi="Consolas" w:cs="Consolas"/>
+          <w:sz w:val="15"/>
+          <w:szCs w:val="15"/>
+        </w:rPr>
+        <w:t>Loch  =</w:t>
+      </w:r>
+      <w:proofErr w:type="gramEnd"/>
+      <w:r>
+        <w:rPr>
+          <w:rFonts w:ascii="Consolas" w:eastAsia="Consolas" w:hAnsi="Consolas" w:cs="Consolas"/>
+          <w:sz w:val="15"/>
+          <w:szCs w:val="15"/>
+        </w:rPr>
+        <w:t xml:space="preserve"> +0.0126 a.u.  =   +7.9 kcal/(mol*</w:t>
+      </w:r>
+      <w:proofErr w:type="gramStart"/>
+      <w:r>
+        <w:rPr>
+          <w:rFonts w:ascii="Consolas" w:eastAsia="Consolas" w:hAnsi="Consolas" w:cs="Consolas"/>
+          <w:sz w:val="15"/>
+          <w:szCs w:val="15"/>
+        </w:rPr>
+        <w:t xml:space="preserve">e)   </w:t>
+      </w:r>
+      <w:proofErr w:type="gramEnd"/>
+      <w:r>
+        <w:rPr>
+          <w:rFonts w:ascii="Consolas" w:eastAsia="Consolas" w:hAnsi="Consolas" w:cs="Consolas"/>
+          <w:sz w:val="15"/>
+          <w:szCs w:val="15"/>
+        </w:rPr>
+        <w:t>[144 Punkte]</w:t>
+      </w:r>
+      <w:r>
+        <w:br/>
+      </w:r>
+      <w:r>
+        <w:rPr>
+          <w:rFonts w:ascii="Consolas" w:eastAsia="Consolas" w:hAnsi="Consolas" w:cs="Consolas"/>
+          <w:sz w:val="15"/>
+          <w:szCs w:val="15"/>
+        </w:rPr>
+        <w:t xml:space="preserve">    Guertel     = -0.0188 a.u.  </w:t>
+      </w:r>
+      <w:proofErr w:type="gramStart"/>
+      <w:r>
+        <w:rPr>
+          <w:rFonts w:ascii="Consolas" w:eastAsia="Consolas" w:hAnsi="Consolas" w:cs="Consolas"/>
+          <w:sz w:val="15"/>
+          <w:szCs w:val="15"/>
+        </w:rPr>
+        <w:t>=  -</w:t>
+      </w:r>
+      <w:proofErr w:type="gramEnd"/>
+      <w:r>
+        <w:rPr>
+          <w:rFonts w:ascii="Consolas" w:eastAsia="Consolas" w:hAnsi="Consolas" w:cs="Consolas"/>
+          <w:sz w:val="15"/>
+          <w:szCs w:val="15"/>
+        </w:rPr>
+        <w:t>11.8 kcal/(mol*</w:t>
+      </w:r>
+      <w:proofErr w:type="gramStart"/>
+      <w:r>
+        <w:rPr>
+          <w:rFonts w:ascii="Consolas" w:eastAsia="Consolas" w:hAnsi="Consolas" w:cs="Consolas"/>
+          <w:sz w:val="15"/>
+          <w:szCs w:val="15"/>
+        </w:rPr>
+        <w:t xml:space="preserve">e)   </w:t>
+      </w:r>
+      <w:proofErr w:type="gramEnd"/>
+      <w:r>
+        <w:rPr>
+          <w:rFonts w:ascii="Consolas" w:eastAsia="Consolas" w:hAnsi="Consolas" w:cs="Consolas"/>
+          <w:sz w:val="15"/>
+          <w:szCs w:val="15"/>
+        </w:rPr>
+        <w:t>[836 Punkte]</w:t>
+      </w:r>
+      <w:r>
+        <w:br/>
+      </w:r>
+      <w:r>
+        <w:rPr>
+          <w:rFonts w:ascii="Consolas" w:eastAsia="Consolas" w:hAnsi="Consolas" w:cs="Consolas"/>
+          <w:sz w:val="15"/>
+          <w:szCs w:val="15"/>
+        </w:rPr>
+        <w:t xml:space="preserve">  </w:t>
+      </w:r>
+      <w:proofErr w:type="gramStart"/>
+      <w:r>
+        <w:rPr>
+          <w:rFonts w:ascii="Consolas" w:eastAsia="Consolas" w:hAnsi="Consolas" w:cs="Consolas"/>
+          <w:sz w:val="15"/>
+          <w:szCs w:val="15"/>
+        </w:rPr>
+        <w:t xml:space="preserve">  !</w:t>
+      </w:r>
+      <w:proofErr w:type="gramEnd"/>
+      <w:r>
+        <w:rPr>
+          <w:rFonts w:ascii="Consolas" w:eastAsia="Consolas" w:hAnsi="Consolas" w:cs="Consolas"/>
+          <w:sz w:val="15"/>
+          <w:szCs w:val="15"/>
+        </w:rPr>
+        <w:t xml:space="preserve"> </w:t>
+      </w:r>
+      <w:r>
+        <w:rPr>
+          <w:rFonts w:ascii="Consolas" w:eastAsia="Consolas" w:hAnsi="Consolas" w:cs="Consolas"/>
+          <w:sz w:val="15"/>
+          <w:szCs w:val="15"/>
+          <w:lang w:val="en-GB"/>
+        </w:rPr>
+        <w:t>V_</w:t>
+      </w:r>
+      <w:proofErr w:type="gramStart"/>
+      <w:r>
+        <w:rPr>
+          <w:rFonts w:ascii="Consolas" w:eastAsia="Consolas" w:hAnsi="Consolas" w:cs="Consolas"/>
+          <w:sz w:val="15"/>
+          <w:szCs w:val="15"/>
+          <w:lang w:val="en-GB"/>
+        </w:rPr>
+        <w:t>S,max</w:t>
+      </w:r>
+      <w:proofErr w:type="gramEnd"/>
+      <w:r>
+        <w:rPr>
+          <w:rFonts w:ascii="Consolas" w:eastAsia="Consolas" w:hAnsi="Consolas" w:cs="Consolas"/>
+          <w:sz w:val="15"/>
+          <w:szCs w:val="15"/>
+          <w:lang w:val="en-GB"/>
+        </w:rPr>
+        <w:t xml:space="preserve"> liegt auf H5, nicht auf dem Halogen</w:t>
       </w:r>
     </w:p>
     <w:p>
@@ -2300,12 +3322,20 @@
       </w:pPr>
       <w:bookmarkStart w:id="6" w:name="_Toc238466588"/>
       <w:bookmarkStart w:id="7" w:name="_Toc238548485"/>
+      <w:proofErr w:type="gramStart"/>
       <w:r>
         <w:rPr>
           <w:lang w:val="en-GB"/>
         </w:rPr>
         <w:lastRenderedPageBreak/>
-        <w:t xml:space="preserve">2.2  The </w:t>
+        <w:t>2.2  The</w:t>
+      </w:r>
+      <w:proofErr w:type="gramEnd"/>
+      <w:r>
+        <w:rPr>
+          <w:lang w:val="en-GB"/>
+        </w:rPr>
+        <w:t xml:space="preserve"> </w:t>
       </w:r>
       <w:r>
         <w:t>σ</w:t>
@@ -2606,6 +3636,29 @@
               </w:rPr>
               <w:t>+9.4</w:t>
             </w:r>
+            <w:r>
+              <w:rPr>
+                <w:sz w:val="18"/>
+                <w:szCs w:val="18"/>
+              </w:rPr>
+              <w:t xml:space="preserve"> </w:t>
+            </w:r>
+            <w:r>
+              <w:rPr>
+                <w:sz w:val="18"/>
+                <w:szCs w:val="18"/>
+              </w:rPr>
+              <w:t>kcal/</w:t>
+            </w:r>
+            <w:proofErr w:type="spellStart"/>
+            <w:r>
+              <w:rPr>
+                <w:sz w:val="18"/>
+                <w:szCs w:val="18"/>
+              </w:rPr>
+              <w:t>mol</w:t>
+            </w:r>
+            <w:proofErr w:type="spellEnd"/>
           </w:p>
         </w:tc>
       </w:tr>
@@ -2692,6 +3745,29 @@
               </w:rPr>
               <w:t>+7.9</w:t>
             </w:r>
+            <w:r>
+              <w:rPr>
+                <w:sz w:val="18"/>
+                <w:szCs w:val="18"/>
+              </w:rPr>
+              <w:t xml:space="preserve"> </w:t>
+            </w:r>
+            <w:r>
+              <w:rPr>
+                <w:sz w:val="18"/>
+                <w:szCs w:val="18"/>
+              </w:rPr>
+              <w:t>kcal/</w:t>
+            </w:r>
+            <w:proofErr w:type="spellStart"/>
+            <w:r>
+              <w:rPr>
+                <w:sz w:val="18"/>
+                <w:szCs w:val="18"/>
+              </w:rPr>
+              <w:t>mol</w:t>
+            </w:r>
+            <w:proofErr w:type="spellEnd"/>
           </w:p>
         </w:tc>
         <w:tc>
@@ -2718,6 +3794,29 @@
               </w:rPr>
               <w:t>+10.1</w:t>
             </w:r>
+            <w:r>
+              <w:rPr>
+                <w:sz w:val="18"/>
+                <w:szCs w:val="18"/>
+              </w:rPr>
+              <w:t xml:space="preserve"> </w:t>
+            </w:r>
+            <w:r>
+              <w:rPr>
+                <w:sz w:val="18"/>
+                <w:szCs w:val="18"/>
+              </w:rPr>
+              <w:t>kcal/</w:t>
+            </w:r>
+            <w:proofErr w:type="spellStart"/>
+            <w:r>
+              <w:rPr>
+                <w:sz w:val="18"/>
+                <w:szCs w:val="18"/>
+              </w:rPr>
+              <w:t>mol</w:t>
+            </w:r>
+            <w:proofErr w:type="spellEnd"/>
           </w:p>
         </w:tc>
       </w:tr>
@@ -2789,6 +3888,29 @@
               </w:rPr>
               <w:t>+11.0</w:t>
             </w:r>
+            <w:r>
+              <w:rPr>
+                <w:sz w:val="18"/>
+                <w:szCs w:val="18"/>
+              </w:rPr>
+              <w:t xml:space="preserve"> </w:t>
+            </w:r>
+            <w:r>
+              <w:rPr>
+                <w:sz w:val="18"/>
+                <w:szCs w:val="18"/>
+              </w:rPr>
+              <w:t>kcal/</w:t>
+            </w:r>
+            <w:proofErr w:type="spellStart"/>
+            <w:r>
+              <w:rPr>
+                <w:sz w:val="18"/>
+                <w:szCs w:val="18"/>
+              </w:rPr>
+              <w:t>mol</w:t>
+            </w:r>
+            <w:proofErr w:type="spellEnd"/>
           </w:p>
         </w:tc>
         <w:tc>
@@ -2815,6 +3937,29 @@
               </w:rPr>
               <w:t>+10.2</w:t>
             </w:r>
+            <w:r>
+              <w:rPr>
+                <w:sz w:val="18"/>
+                <w:szCs w:val="18"/>
+              </w:rPr>
+              <w:t xml:space="preserve"> </w:t>
+            </w:r>
+            <w:r>
+              <w:rPr>
+                <w:sz w:val="18"/>
+                <w:szCs w:val="18"/>
+              </w:rPr>
+              <w:t>kcal/</w:t>
+            </w:r>
+            <w:proofErr w:type="spellStart"/>
+            <w:r>
+              <w:rPr>
+                <w:sz w:val="18"/>
+                <w:szCs w:val="18"/>
+              </w:rPr>
+              <w:t>mol</w:t>
+            </w:r>
+            <w:proofErr w:type="spellEnd"/>
           </w:p>
         </w:tc>
       </w:tr>
@@ -2919,11 +4064,19 @@
       </w:pPr>
       <w:bookmarkStart w:id="8" w:name="_Toc238466589"/>
       <w:bookmarkStart w:id="9" w:name="_Toc238548486"/>
-      <w:r>
-        <w:rPr>
-          <w:lang w:val="en-GB"/>
-        </w:rPr>
-        <w:t>2.3  Molecules with more than one halogen</w:t>
+      <w:proofErr w:type="gramStart"/>
+      <w:r>
+        <w:rPr>
+          <w:lang w:val="en-GB"/>
+        </w:rPr>
+        <w:t>2.3  Molecules</w:t>
+      </w:r>
+      <w:proofErr w:type="gramEnd"/>
+      <w:r>
+        <w:rPr>
+          <w:lang w:val="en-GB"/>
+        </w:rPr>
+        <w:t xml:space="preserve"> with more than one halogen</w:t>
       </w:r>
       <w:bookmarkEnd w:id="8"/>
       <w:bookmarkEnd w:id="9"/>
@@ -3006,10 +4159,114 @@
           <w:szCs w:val="15"/>
         </w:rPr>
         <w:t>Lokal an Cl21:   &lt;- Achse der sigma-Ansicht</w:t>
+      </w:r>
+      <w:r>
+        <w:rPr>
+          <w:rFonts w:ascii="Consolas" w:eastAsia="Consolas" w:hAnsi="Consolas" w:cs="Consolas"/>
+          <w:sz w:val="15"/>
+          <w:szCs w:val="15"/>
+        </w:rPr>
         <w:br/>
-        <w:t>sigma-Loch  = +0.0171 a.u.  =   +44.9 kJ/(mol*e)  =  +10.7 kcal/(mol*e)   [interpoliert, 3.8 Grad zur Achse]</w:t>
+        <w:t>sigma-</w:t>
+      </w:r>
+      <w:proofErr w:type="gramStart"/>
+      <w:r>
+        <w:rPr>
+          <w:rFonts w:ascii="Consolas" w:eastAsia="Consolas" w:hAnsi="Consolas" w:cs="Consolas"/>
+          <w:sz w:val="15"/>
+          <w:szCs w:val="15"/>
+        </w:rPr>
+        <w:t>Loch  =</w:t>
+      </w:r>
+      <w:proofErr w:type="gramEnd"/>
+      <w:r>
+        <w:rPr>
+          <w:rFonts w:ascii="Consolas" w:eastAsia="Consolas" w:hAnsi="Consolas" w:cs="Consolas"/>
+          <w:sz w:val="15"/>
+          <w:szCs w:val="15"/>
+        </w:rPr>
+        <w:t xml:space="preserve"> +0.0171 a.u.  =   +44.9 kJ/(mol*</w:t>
+      </w:r>
+      <w:proofErr w:type="gramStart"/>
+      <w:r>
+        <w:rPr>
+          <w:rFonts w:ascii="Consolas" w:eastAsia="Consolas" w:hAnsi="Consolas" w:cs="Consolas"/>
+          <w:sz w:val="15"/>
+          <w:szCs w:val="15"/>
+        </w:rPr>
+        <w:t>e)  =</w:t>
+      </w:r>
+      <w:proofErr w:type="gramEnd"/>
+      <w:r>
+        <w:rPr>
+          <w:rFonts w:ascii="Consolas" w:eastAsia="Consolas" w:hAnsi="Consolas" w:cs="Consolas"/>
+          <w:sz w:val="15"/>
+          <w:szCs w:val="15"/>
+        </w:rPr>
+        <w:t xml:space="preserve">  +10.7 kcal/(mol*</w:t>
+      </w:r>
+      <w:proofErr w:type="gramStart"/>
+      <w:r>
+        <w:rPr>
+          <w:rFonts w:ascii="Consolas" w:eastAsia="Consolas" w:hAnsi="Consolas" w:cs="Consolas"/>
+          <w:sz w:val="15"/>
+          <w:szCs w:val="15"/>
+        </w:rPr>
+        <w:t xml:space="preserve">e)   </w:t>
+      </w:r>
+      <w:proofErr w:type="gramEnd"/>
+      <w:r>
+        <w:rPr>
+          <w:rFonts w:ascii="Consolas" w:eastAsia="Consolas" w:hAnsi="Consolas" w:cs="Consolas"/>
+          <w:sz w:val="15"/>
+          <w:szCs w:val="15"/>
+        </w:rPr>
+        <w:t>[interpoliert, 3.8 Grad zur Achse]</w:t>
+      </w:r>
+      <w:r>
+        <w:rPr>
+          <w:rFonts w:ascii="Consolas" w:eastAsia="Consolas" w:hAnsi="Consolas" w:cs="Consolas"/>
+          <w:sz w:val="15"/>
+          <w:szCs w:val="15"/>
+        </w:rPr>
         <w:br/>
-        <w:t>Guertel     = -0.0184 a.u.  =   -48.2 kJ/(mol*e)  =  -11.5 kcal/(mol*e)   [508 Punkte]</w:t>
+        <w:t>Guertel     = -0.0184 a.u.  =   -48.2 kJ/(mol*</w:t>
+      </w:r>
+      <w:proofErr w:type="gramStart"/>
+      <w:r>
+        <w:rPr>
+          <w:rFonts w:ascii="Consolas" w:eastAsia="Consolas" w:hAnsi="Consolas" w:cs="Consolas"/>
+          <w:sz w:val="15"/>
+          <w:szCs w:val="15"/>
+        </w:rPr>
+        <w:t>e)  =</w:t>
+      </w:r>
+      <w:proofErr w:type="gramEnd"/>
+      <w:r>
+        <w:rPr>
+          <w:rFonts w:ascii="Consolas" w:eastAsia="Consolas" w:hAnsi="Consolas" w:cs="Consolas"/>
+          <w:sz w:val="15"/>
+          <w:szCs w:val="15"/>
+        </w:rPr>
+        <w:t xml:space="preserve">  -11.5 kcal/(mol*</w:t>
+      </w:r>
+      <w:proofErr w:type="gramStart"/>
+      <w:r>
+        <w:rPr>
+          <w:rFonts w:ascii="Consolas" w:eastAsia="Consolas" w:hAnsi="Consolas" w:cs="Consolas"/>
+          <w:sz w:val="15"/>
+          <w:szCs w:val="15"/>
+        </w:rPr>
+        <w:t xml:space="preserve">e)   </w:t>
+      </w:r>
+      <w:proofErr w:type="gramEnd"/>
+      <w:r>
+        <w:rPr>
+          <w:rFonts w:ascii="Consolas" w:eastAsia="Consolas" w:hAnsi="Consolas" w:cs="Consolas"/>
+          <w:sz w:val="15"/>
+          <w:szCs w:val="15"/>
+        </w:rPr>
+        <w:t>[508 Punkte]</w:t>
       </w:r>
     </w:p>
     <w:p>
@@ -3036,19 +4293,127 @@
           <w:szCs w:val="15"/>
         </w:rPr>
         <w:t xml:space="preserve">  Lokal an Cl11:</w:t>
-        <w:br/>
-        <w:t>sigma-Loch  = +0.0144 a.u.  =   +37.8 kJ/(mol*e)  =   +9.0 kcal/(mol*e)   [interpoliert, 1.3 Grad zur Achse]</w:t>
-        <w:br/>
-        <w:t xml:space="preserve">Guertel     = -0.0110 a.u.  </w:t>
       </w:r>
       <w:r>
         <w:rPr>
           <w:rFonts w:ascii="Consolas" w:eastAsia="Consolas" w:hAnsi="Consolas" w:cs="Consolas"/>
           <w:sz w:val="15"/>
           <w:szCs w:val="15"/>
-          <w:lang w:val="en-GB"/>
-        </w:rPr>
-        <w:t>=   -28.8 kJ/(mol*e)  =   -6.9 kcal/(mol*e)   [464 Punkte]</w:t>
+        </w:rPr>
+        <w:br/>
+        <w:t>sigma-</w:t>
+      </w:r>
+      <w:proofErr w:type="gramStart"/>
+      <w:r>
+        <w:rPr>
+          <w:rFonts w:ascii="Consolas" w:eastAsia="Consolas" w:hAnsi="Consolas" w:cs="Consolas"/>
+          <w:sz w:val="15"/>
+          <w:szCs w:val="15"/>
+        </w:rPr>
+        <w:t>Loch  =</w:t>
+      </w:r>
+      <w:proofErr w:type="gramEnd"/>
+      <w:r>
+        <w:rPr>
+          <w:rFonts w:ascii="Consolas" w:eastAsia="Consolas" w:hAnsi="Consolas" w:cs="Consolas"/>
+          <w:sz w:val="15"/>
+          <w:szCs w:val="15"/>
+        </w:rPr>
+        <w:t xml:space="preserve"> +0.0144 a.u.  =   +37.8 kJ/(mol*</w:t>
+      </w:r>
+      <w:proofErr w:type="gramStart"/>
+      <w:r>
+        <w:rPr>
+          <w:rFonts w:ascii="Consolas" w:eastAsia="Consolas" w:hAnsi="Consolas" w:cs="Consolas"/>
+          <w:sz w:val="15"/>
+          <w:szCs w:val="15"/>
+        </w:rPr>
+        <w:t>e)  =</w:t>
+      </w:r>
+      <w:proofErr w:type="gramEnd"/>
+      <w:r>
+        <w:rPr>
+          <w:rFonts w:ascii="Consolas" w:eastAsia="Consolas" w:hAnsi="Consolas" w:cs="Consolas"/>
+          <w:sz w:val="15"/>
+          <w:szCs w:val="15"/>
+        </w:rPr>
+        <w:t xml:space="preserve">   +9.0 kcal/(mol*</w:t>
+      </w:r>
+      <w:proofErr w:type="gramStart"/>
+      <w:r>
+        <w:rPr>
+          <w:rFonts w:ascii="Consolas" w:eastAsia="Consolas" w:hAnsi="Consolas" w:cs="Consolas"/>
+          <w:sz w:val="15"/>
+          <w:szCs w:val="15"/>
+        </w:rPr>
+        <w:t xml:space="preserve">e)   </w:t>
+      </w:r>
+      <w:proofErr w:type="gramEnd"/>
+      <w:r>
+        <w:rPr>
+          <w:rFonts w:ascii="Consolas" w:eastAsia="Consolas" w:hAnsi="Consolas" w:cs="Consolas"/>
+          <w:sz w:val="15"/>
+          <w:szCs w:val="15"/>
+        </w:rPr>
+        <w:t>[interpoliert, 1.3 Grad zur Achse]</w:t>
+      </w:r>
+      <w:r>
+        <w:rPr>
+          <w:rFonts w:ascii="Consolas" w:eastAsia="Consolas" w:hAnsi="Consolas" w:cs="Consolas"/>
+          <w:sz w:val="15"/>
+          <w:szCs w:val="15"/>
+        </w:rPr>
+        <w:br/>
+        <w:t xml:space="preserve">Guertel     = -0.0110 a.u.  </w:t>
+      </w:r>
+      <w:r>
+        <w:rPr>
+          <w:rFonts w:ascii="Consolas" w:eastAsia="Consolas" w:hAnsi="Consolas" w:cs="Consolas"/>
+          <w:sz w:val="15"/>
+          <w:szCs w:val="15"/>
+          <w:lang w:val="en-GB"/>
+        </w:rPr>
+        <w:t>=   -28.8 kJ/(mol*</w:t>
+      </w:r>
+      <w:proofErr w:type="gramStart"/>
+      <w:r>
+        <w:rPr>
+          <w:rFonts w:ascii="Consolas" w:eastAsia="Consolas" w:hAnsi="Consolas" w:cs="Consolas"/>
+          <w:sz w:val="15"/>
+          <w:szCs w:val="15"/>
+          <w:lang w:val="en-GB"/>
+        </w:rPr>
+        <w:t>e)  =</w:t>
+      </w:r>
+      <w:proofErr w:type="gramEnd"/>
+      <w:r>
+        <w:rPr>
+          <w:rFonts w:ascii="Consolas" w:eastAsia="Consolas" w:hAnsi="Consolas" w:cs="Consolas"/>
+          <w:sz w:val="15"/>
+          <w:szCs w:val="15"/>
+          <w:lang w:val="en-GB"/>
+        </w:rPr>
+        <w:t xml:space="preserve">   -6.9 kcal/(mol*</w:t>
+      </w:r>
+      <w:proofErr w:type="gramStart"/>
+      <w:r>
+        <w:rPr>
+          <w:rFonts w:ascii="Consolas" w:eastAsia="Consolas" w:hAnsi="Consolas" w:cs="Consolas"/>
+          <w:sz w:val="15"/>
+          <w:szCs w:val="15"/>
+          <w:lang w:val="en-GB"/>
+        </w:rPr>
+        <w:t xml:space="preserve">e)   </w:t>
+      </w:r>
+      <w:proofErr w:type="gramEnd"/>
+      <w:r>
+        <w:rPr>
+          <w:rFonts w:ascii="Consolas" w:eastAsia="Consolas" w:hAnsi="Consolas" w:cs="Consolas"/>
+          <w:sz w:val="15"/>
+          <w:szCs w:val="15"/>
+          <w:lang w:val="en-GB"/>
+        </w:rPr>
+        <w:t>[464 Punkte]</w:t>
       </w:r>
     </w:p>
     <w:p>
@@ -3228,7 +4593,27 @@
           <w:szCs w:val="19"/>
           <w:lang w:val="en-GB"/>
         </w:rPr>
-        <w:t>Br1:0.00862;Cl4:-0.00398</w:t>
+        <w:t>Br1:0.</w:t>
+      </w:r>
+      <w:proofErr w:type="gramStart"/>
+      <w:r>
+        <w:rPr>
+          <w:rFonts w:ascii="Consolas" w:eastAsia="Consolas" w:hAnsi="Consolas" w:cs="Consolas"/>
+          <w:sz w:val="19"/>
+          <w:szCs w:val="19"/>
+          <w:lang w:val="en-GB"/>
+        </w:rPr>
+        <w:t>00862;Cl4:-</w:t>
+      </w:r>
+      <w:proofErr w:type="gramEnd"/>
+      <w:r>
+        <w:rPr>
+          <w:rFonts w:ascii="Consolas" w:eastAsia="Consolas" w:hAnsi="Consolas" w:cs="Consolas"/>
+          <w:sz w:val="19"/>
+          <w:szCs w:val="19"/>
+          <w:lang w:val="en-GB"/>
+        </w:rPr>
+        <w:t>0.00398</w:t>
       </w:r>
       <w:r>
         <w:rPr>
@@ -3262,12 +4647,20 @@
       </w:pPr>
       <w:bookmarkStart w:id="10" w:name="_Toc238466590"/>
       <w:bookmarkStart w:id="11" w:name="_Toc238548487"/>
+      <w:proofErr w:type="gramStart"/>
       <w:r>
         <w:rPr>
           <w:lang w:val="en-GB"/>
         </w:rPr>
         <w:lastRenderedPageBreak/>
-        <w:t>2.4  The cone must not reach the rest of the molecule</w:t>
+        <w:t>2.4  The</w:t>
+      </w:r>
+      <w:proofErr w:type="gramEnd"/>
+      <w:r>
+        <w:rPr>
+          <w:lang w:val="en-GB"/>
+        </w:rPr>
+        <w:t xml:space="preserve"> cone must not reach the rest of the molecule</w:t>
       </w:r>
       <w:bookmarkEnd w:id="10"/>
       <w:bookmarkEnd w:id="11"/>
@@ -3573,7 +4966,25 @@
                 <w:szCs w:val="17"/>
                 <w:lang w:val="en-GB"/>
               </w:rPr>
-              <w:t>−0.0670 a.u. (−42.0) — actually the triazole N3/N4 lone pairs</w:t>
+              <w:t xml:space="preserve">−0.0670 a.u. (−42.0) — </w:t>
+            </w:r>
+            <w:proofErr w:type="gramStart"/>
+            <w:r>
+              <w:rPr>
+                <w:sz w:val="17"/>
+                <w:szCs w:val="17"/>
+                <w:lang w:val="en-GB"/>
+              </w:rPr>
+              <w:t>actually the</w:t>
+            </w:r>
+            <w:proofErr w:type="gramEnd"/>
+            <w:r>
+              <w:rPr>
+                <w:sz w:val="17"/>
+                <w:szCs w:val="17"/>
+                <w:lang w:val="en-GB"/>
+              </w:rPr>
+              <w:t xml:space="preserve"> triazole N3/N4 lone pairs</w:t>
             </w:r>
           </w:p>
         </w:tc>
@@ -3794,11 +5205,19 @@
       </w:pPr>
       <w:bookmarkStart w:id="12" w:name="_Toc238466591"/>
       <w:bookmarkStart w:id="13" w:name="_Toc238548488"/>
-      <w:r>
-        <w:rPr>
-          <w:lang w:val="en-GB"/>
-        </w:rPr>
-        <w:t xml:space="preserve">2.5  The colour scale can hide a correct </w:t>
+      <w:proofErr w:type="gramStart"/>
+      <w:r>
+        <w:rPr>
+          <w:lang w:val="en-GB"/>
+        </w:rPr>
+        <w:t>2.5  The</w:t>
+      </w:r>
+      <w:proofErr w:type="gramEnd"/>
+      <w:r>
+        <w:rPr>
+          <w:lang w:val="en-GB"/>
+        </w:rPr>
+        <w:t xml:space="preserve"> colour scale can hide a correct </w:t>
       </w:r>
       <w:r>
         <w:t>σ</w:t>
@@ -3931,12 +5350,20 @@
         </w:rPr>
       </w:pPr>
       <w:bookmarkStart w:id="15" w:name="_Toc238548489"/>
+      <w:proofErr w:type="gramStart"/>
       <w:r>
         <w:rPr>
           <w:lang w:val="en-GB"/>
         </w:rPr>
         <w:lastRenderedPageBreak/>
-        <w:t>3  Choosing the colour scale</w:t>
+        <w:t>3  Choosing</w:t>
+      </w:r>
+      <w:proofErr w:type="gramEnd"/>
+      <w:r>
+        <w:rPr>
+          <w:lang w:val="en-GB"/>
+        </w:rPr>
+        <w:t xml:space="preserve"> the colour scale</w:t>
       </w:r>
       <w:bookmarkEnd w:id="14"/>
       <w:bookmarkEnd w:id="15"/>
@@ -3989,7 +5416,21 @@
         <w:rPr>
           <w:lang w:val="en-GB"/>
         </w:rPr>
-        <w:t xml:space="preserve">. The range is derived from the ESP actually present on the </w:t>
+        <w:t xml:space="preserve">. The range is derived from the ESP </w:t>
+      </w:r>
+      <w:proofErr w:type="gramStart"/>
+      <w:r>
+        <w:rPr>
+          <w:lang w:val="en-GB"/>
+        </w:rPr>
+        <w:t>actually present</w:t>
+      </w:r>
+      <w:proofErr w:type="gramEnd"/>
+      <w:r>
+        <w:rPr>
+          <w:lang w:val="en-GB"/>
+        </w:rPr>
+        <w:t xml:space="preserve"> on the </w:t>
       </w:r>
       <w:r>
         <w:t>ρ</w:t>
@@ -4187,11 +5628,19 @@
       </w:pPr>
       <w:bookmarkStart w:id="16" w:name="_Toc238466594"/>
       <w:bookmarkStart w:id="17" w:name="_Toc238548490"/>
-      <w:r>
-        <w:rPr>
-          <w:lang w:val="en-GB"/>
-        </w:rPr>
-        <w:t>3.1  The rainbow ramp</w:t>
+      <w:proofErr w:type="gramStart"/>
+      <w:r>
+        <w:rPr>
+          <w:lang w:val="en-GB"/>
+        </w:rPr>
+        <w:t>3.1  The</w:t>
+      </w:r>
+      <w:proofErr w:type="gramEnd"/>
+      <w:r>
+        <w:rPr>
+          <w:lang w:val="en-GB"/>
+        </w:rPr>
+        <w:t xml:space="preserve"> rainbow ramp</w:t>
       </w:r>
       <w:bookmarkEnd w:id="16"/>
       <w:bookmarkEnd w:id="17"/>
@@ -4213,7 +5662,21 @@
         <w:rPr>
           <w:lang w:val="en-GB"/>
         </w:rPr>
-        <w:t xml:space="preserve"> switches the colour ramp from red–white–blue to a rainbow. </w:t>
+        <w:t xml:space="preserve"> switches the colour ramp from </w:t>
+      </w:r>
+      <w:proofErr w:type="gramStart"/>
+      <w:r>
+        <w:rPr>
+          <w:lang w:val="en-GB"/>
+        </w:rPr>
+        <w:t>red–white</w:t>
+      </w:r>
+      <w:proofErr w:type="gramEnd"/>
+      <w:r>
+        <w:rPr>
+          <w:lang w:val="en-GB"/>
+        </w:rPr>
+        <w:t xml:space="preserve">–blue to a rainbow. </w:t>
       </w:r>
       <w:r>
         <w:t>It works on all three scripts.</w:t>
@@ -4499,7 +5962,21 @@
         <w:rPr>
           <w:lang w:val="en-GB"/>
         </w:rPr>
-        <w:t xml:space="preserve"> Red stays negative and blue stays positive in both ramps; the rainbow only inserts yellow, green and cyan in between.</w:t>
+        <w:t xml:space="preserve"> Red stays negative and blue </w:t>
+      </w:r>
+      <w:proofErr w:type="gramStart"/>
+      <w:r>
+        <w:rPr>
+          <w:lang w:val="en-GB"/>
+        </w:rPr>
+        <w:t>stays</w:t>
+      </w:r>
+      <w:proofErr w:type="gramEnd"/>
+      <w:r>
+        <w:rPr>
+          <w:lang w:val="en-GB"/>
+        </w:rPr>
+        <w:t xml:space="preserve"> positive in both ramps; the rainbow only inserts yellow, green and cyan in between.</w:t>
       </w:r>
     </w:p>
     <w:p>
@@ -4521,7 +5998,21 @@
         <w:rPr>
           <w:lang w:val="en-GB"/>
         </w:rPr>
-        <w:t xml:space="preserve"> Red–white–blue spends almost no colour resolution near zero: everything weakly polar comes out white. The rainbow resolves exactly that region, which is useful for looking at the </w:t>
+        <w:t xml:space="preserve"> </w:t>
+      </w:r>
+      <w:proofErr w:type="gramStart"/>
+      <w:r>
+        <w:rPr>
+          <w:lang w:val="en-GB"/>
+        </w:rPr>
+        <w:t>Red–white</w:t>
+      </w:r>
+      <w:proofErr w:type="gramEnd"/>
+      <w:r>
+        <w:rPr>
+          <w:lang w:val="en-GB"/>
+        </w:rPr>
+        <w:t xml:space="preserve">–blue spends almost no colour resolution near zero: everything weakly polar comes out white. The rainbow resolves exactly that region, which is useful for looking at the </w:t>
       </w:r>
       <w:r>
         <w:t>π</w:t>
@@ -4553,7 +6044,14 @@
         <w:rPr>
           <w:lang w:val="en-GB"/>
         </w:rPr>
-        <w:t>-hole, belt, V</w:t>
+        <w:t xml:space="preserve">-hole, belt, </w:t>
+      </w:r>
+      <w:proofErr w:type="gramStart"/>
+      <w:r>
+        <w:rPr>
+          <w:lang w:val="en-GB"/>
+        </w:rPr>
+        <w:t>V</w:t>
       </w:r>
       <w:r>
         <w:rPr>
@@ -4562,11 +6060,19 @@
         </w:rPr>
         <w:t>S,min</w:t>
       </w:r>
-      <w:r>
-        <w:rPr>
-          <w:lang w:val="en-GB"/>
-        </w:rPr>
-        <w:t>, V</w:t>
+      <w:proofErr w:type="gramEnd"/>
+      <w:r>
+        <w:rPr>
+          <w:lang w:val="en-GB"/>
+        </w:rPr>
+        <w:t xml:space="preserve">, </w:t>
+      </w:r>
+      <w:proofErr w:type="gramStart"/>
+      <w:r>
+        <w:rPr>
+          <w:lang w:val="en-GB"/>
+        </w:rPr>
+        <w:t>V</w:t>
       </w:r>
       <w:r>
         <w:rPr>
@@ -4575,11 +6081,40 @@
         </w:rPr>
         <w:t>S,max</w:t>
       </w:r>
-      <w:r>
-        <w:rPr>
-          <w:lang w:val="en-GB"/>
-        </w:rPr>
-        <w:t xml:space="preserve"> — red–white–blue is the more honest picture, and it is also what the ESP literature uses. Recommended practice: red–white–blue as the main figure, rainbow alongside where fine structure is the point.</w:t>
+      <w:proofErr w:type="gramEnd"/>
+      <w:r>
+        <w:rPr>
+          <w:lang w:val="en-GB"/>
+        </w:rPr>
+        <w:t xml:space="preserve"> — </w:t>
+      </w:r>
+      <w:proofErr w:type="gramStart"/>
+      <w:r>
+        <w:rPr>
+          <w:lang w:val="en-GB"/>
+        </w:rPr>
+        <w:t>red–white</w:t>
+      </w:r>
+      <w:proofErr w:type="gramEnd"/>
+      <w:r>
+        <w:rPr>
+          <w:lang w:val="en-GB"/>
+        </w:rPr>
+        <w:t xml:space="preserve">–blue is the more honest picture, and it is also what the ESP literature uses. Recommended practice: </w:t>
+      </w:r>
+      <w:proofErr w:type="gramStart"/>
+      <w:r>
+        <w:rPr>
+          <w:lang w:val="en-GB"/>
+        </w:rPr>
+        <w:t>red–white</w:t>
+      </w:r>
+      <w:proofErr w:type="gramEnd"/>
+      <w:r>
+        <w:rPr>
+          <w:lang w:val="en-GB"/>
+        </w:rPr>
+        <w:t>–blue as the main figure, rainbow alongside where fine structure is the point.</w:t>
       </w:r>
     </w:p>
     <w:p>
@@ -4703,12 +6238,20 @@
       </w:pPr>
       <w:bookmarkStart w:id="18" w:name="_Toc238466595"/>
       <w:bookmarkStart w:id="19" w:name="_Toc238548491"/>
+      <w:proofErr w:type="gramStart"/>
       <w:r>
         <w:rPr>
           <w:lang w:val="en-GB"/>
         </w:rPr>
         <w:lastRenderedPageBreak/>
-        <w:t>4  Parameter study</w:t>
+        <w:t>4  Parameter</w:t>
+      </w:r>
+      <w:proofErr w:type="gramEnd"/>
+      <w:r>
+        <w:rPr>
+          <w:lang w:val="en-GB"/>
+        </w:rPr>
+        <w:t xml:space="preserve"> study</w:t>
       </w:r>
       <w:bookmarkEnd w:id="18"/>
       <w:bookmarkEnd w:id="19"/>
@@ -4724,7 +6267,21 @@
         <w:rPr>
           <w:lang w:val="en-GB"/>
         </w:rPr>
-        <w:t>Every default in this pipeline was chosen against a measurement. This section collects those measurements so the choices can be checked, and so it is clear which parameters are cosmetic and which change the result.</w:t>
+        <w:t xml:space="preserve">Every default in this pipeline was chosen against a measurement. This section collects those measurements so the choices can be checked, and so it is clear which parameters are </w:t>
+      </w:r>
+      <w:proofErr w:type="gramStart"/>
+      <w:r>
+        <w:rPr>
+          <w:lang w:val="en-GB"/>
+        </w:rPr>
+        <w:t>cosmetic</w:t>
+      </w:r>
+      <w:proofErr w:type="gramEnd"/>
+      <w:r>
+        <w:rPr>
+          <w:lang w:val="en-GB"/>
+        </w:rPr>
+        <w:t xml:space="preserve"> and which change the result.</w:t>
       </w:r>
     </w:p>
     <w:p>
@@ -4774,11 +6331,19 @@
       </w:pPr>
       <w:bookmarkStart w:id="20" w:name="_Toc238466596"/>
       <w:bookmarkStart w:id="21" w:name="_Toc238548492"/>
-      <w:r>
-        <w:rPr>
-          <w:lang w:val="en-GB"/>
-        </w:rPr>
-        <w:t xml:space="preserve">4.1  Isovalue </w:t>
+      <w:proofErr w:type="gramStart"/>
+      <w:r>
+        <w:rPr>
+          <w:lang w:val="en-GB"/>
+        </w:rPr>
+        <w:t>4.1  Isovalue</w:t>
+      </w:r>
+      <w:proofErr w:type="gramEnd"/>
+      <w:r>
+        <w:rPr>
+          <w:lang w:val="en-GB"/>
+        </w:rPr>
+        <w:t xml:space="preserve"> </w:t>
       </w:r>
       <w:r>
         <w:t>ρ</w:t>
@@ -4908,6 +6473,7 @@
             <w:pPr>
               <w:jc w:val="right"/>
             </w:pPr>
+            <w:proofErr w:type="gramStart"/>
             <w:r>
               <w:rPr>
                 <w:b/>
@@ -4929,6 +6495,7 @@
               </w:rPr>
               <w:t>S,min</w:t>
             </w:r>
+            <w:proofErr w:type="gramEnd"/>
           </w:p>
         </w:tc>
         <w:tc>
@@ -4946,6 +6513,7 @@
             <w:pPr>
               <w:jc w:val="right"/>
             </w:pPr>
+            <w:proofErr w:type="gramStart"/>
             <w:r>
               <w:rPr>
                 <w:b/>
@@ -4967,6 +6535,7 @@
               </w:rPr>
               <w:t>S,max</w:t>
             </w:r>
+            <w:proofErr w:type="gramEnd"/>
           </w:p>
         </w:tc>
         <w:tc>
@@ -6130,7 +7699,14 @@
         <w:rPr>
           <w:lang w:val="en-GB"/>
         </w:rPr>
-        <w:t>The V</w:t>
+        <w:t xml:space="preserve">The </w:t>
+      </w:r>
+      <w:proofErr w:type="gramStart"/>
+      <w:r>
+        <w:rPr>
+          <w:lang w:val="en-GB"/>
+        </w:rPr>
+        <w:t>V</w:t>
       </w:r>
       <w:r>
         <w:rPr>
@@ -6139,6 +7715,7 @@
         </w:rPr>
         <w:t>S,min</w:t>
       </w:r>
+      <w:proofErr w:type="gramEnd"/>
       <w:r>
         <w:rPr>
           <w:lang w:val="en-GB"/>
@@ -6258,12 +7835,20 @@
       </w:pPr>
       <w:bookmarkStart w:id="22" w:name="_Toc238466597"/>
       <w:bookmarkStart w:id="23" w:name="_Toc238548493"/>
+      <w:proofErr w:type="gramStart"/>
       <w:r>
         <w:rPr>
           <w:lang w:val="en-GB"/>
         </w:rPr>
         <w:lastRenderedPageBreak/>
-        <w:t>4.2  Grid resolution</w:t>
+        <w:t>4.2  Grid</w:t>
+      </w:r>
+      <w:proofErr w:type="gramEnd"/>
+      <w:r>
+        <w:rPr>
+          <w:lang w:val="en-GB"/>
+        </w:rPr>
+        <w:t xml:space="preserve"> resolution</w:t>
       </w:r>
       <w:bookmarkEnd w:id="22"/>
       <w:r>
@@ -6285,7 +7870,35 @@
         <w:rPr>
           <w:lang w:val="en-GB"/>
         </w:rPr>
-        <w:t xml:space="preserve">Same molecule, isovalue fixed at 0.001, the same grid decimated by an increasing stride (.xyz to .cube conversion). </w:t>
+        <w:t xml:space="preserve">Same molecule, isovalue fixed at 0.001, the same grid decimated by an increasing stride </w:t>
+      </w:r>
+      <w:proofErr w:type="gramStart"/>
+      <w:r>
+        <w:rPr>
+          <w:lang w:val="en-GB"/>
+        </w:rPr>
+        <w:t>(.xyz</w:t>
+      </w:r>
+      <w:proofErr w:type="gramEnd"/>
+      <w:r>
+        <w:rPr>
+          <w:lang w:val="en-GB"/>
+        </w:rPr>
+        <w:t xml:space="preserve"> </w:t>
+      </w:r>
+      <w:proofErr w:type="gramStart"/>
+      <w:r>
+        <w:rPr>
+          <w:lang w:val="en-GB"/>
+        </w:rPr>
+        <w:t>to .cube</w:t>
+      </w:r>
+      <w:proofErr w:type="gramEnd"/>
+      <w:r>
+        <w:rPr>
+          <w:lang w:val="en-GB"/>
+        </w:rPr>
+        <w:t xml:space="preserve"> conversion). </w:t>
       </w:r>
     </w:p>
     <w:tbl>
@@ -6441,6 +8054,7 @@
             <w:pPr>
               <w:jc w:val="right"/>
             </w:pPr>
+            <w:proofErr w:type="gramStart"/>
             <w:r>
               <w:rPr>
                 <w:b/>
@@ -6462,6 +8076,7 @@
               </w:rPr>
               <w:t>S,min</w:t>
             </w:r>
+            <w:proofErr w:type="gramEnd"/>
           </w:p>
         </w:tc>
         <w:tc>
@@ -6479,6 +8094,7 @@
             <w:pPr>
               <w:jc w:val="right"/>
             </w:pPr>
+            <w:proofErr w:type="gramStart"/>
             <w:r>
               <w:rPr>
                 <w:b/>
@@ -6500,6 +8116,7 @@
               </w:rPr>
               <w:t>S,max</w:t>
             </w:r>
+            <w:proofErr w:type="gramEnd"/>
           </w:p>
         </w:tc>
         <w:tc>
@@ -7906,7 +9523,7 @@
         <w:rPr>
           <w:lang w:val="en-GB"/>
         </w:rPr>
-        <w:t xml:space="preserve">-hole falls by 17 %. The degradation is smooth and one-sided, because the interpolated density smooths the isosurface. Up to stride 4 the loss stays below 3 %, and stride 2 costs 1.2 % for an eight times smaller file. At stride 8 the belt can no longer be measured at all: fewer than five surface points survive in the belt region, and the script prints a dash rather than a number.</w:t>
+        <w:t>-hole falls by 17 %. The degradation is smooth and one-sided, because the interpolated density smooths the isosurface. Up to stride 4 the loss stays below 3 %, and stride 2 costs 1.2 % for an eight times smaller file. At stride 8 the belt can no longer be measured at all: fewer than five surface points survive in the belt region, and the script prints a dash rather than a number.</w:t>
       </w:r>
     </w:p>
     <w:p>
@@ -7920,7 +9537,7 @@
         <w:rPr>
           <w:lang w:val="en-GB"/>
         </w:rPr>
-        <w:t xml:space="preserve">One thing still makes this table look better than it should: these are ray-based values. The point-based method on the same six grids spans a factor of 5.1, from +0.0034 to +0.0175 a.u., and it does not even fall monotonically. 22 % low at stride 2, 8 % high at stride 3, 65 % low at stride 4, because it depends on whether a grid point happens to lie both close to the C–Br axis and inside the thin shell. At stride 8 it finds fewer than five points in the cone and returns nothing at all, where the ray method still gives +0.0135 a.u. That is the measurement behind §2.2.</w:t>
+        <w:t>One thing still makes this table look better than it should: these are ray-based values. The point-based method on the same six grids spans a factor of 5.1, from +0.0034 to +0.0175 a.u., and it does not even fall monotonically. 22 % low at stride 2, 8 % high at stride 3, 65 % low at stride 4, because it depends on whether a grid point happens to lie both close to the C–Br axis and inside the thin shell. At stride 8 it finds fewer than five points in the cone and returns nothing at all, where the ray method still gives +0.0135 a.u. That is the measurement behind §2.2.</w:t>
       </w:r>
     </w:p>
     <w:p>
@@ -7947,11 +9564,19 @@
       </w:pPr>
       <w:bookmarkStart w:id="24" w:name="_Toc238466598"/>
       <w:bookmarkStart w:id="25" w:name="_Toc238548494"/>
-      <w:r>
-        <w:rPr>
-          <w:lang w:val="en-GB"/>
-        </w:rPr>
-        <w:t>4.3  Colour range — visual only</w:t>
+      <w:proofErr w:type="gramStart"/>
+      <w:r>
+        <w:rPr>
+          <w:lang w:val="en-GB"/>
+        </w:rPr>
+        <w:t>4.3  Colour</w:t>
+      </w:r>
+      <w:proofErr w:type="gramEnd"/>
+      <w:r>
+        <w:rPr>
+          <w:lang w:val="en-GB"/>
+        </w:rPr>
+        <w:t xml:space="preserve"> range — visual only</w:t>
       </w:r>
       <w:bookmarkEnd w:id="24"/>
       <w:bookmarkEnd w:id="25"/>
@@ -8052,7 +9677,7 @@
                 <w:sz w:val="18"/>
                 <w:szCs w:val="18"/>
               </w:rPr>
-              <w:t xml:space="preserve">Automatic range</w:t>
+              <w:t>Automatic range</w:t>
             </w:r>
           </w:p>
         </w:tc>
@@ -8394,7 +10019,21 @@
         <w:rPr>
           <w:lang w:val="en-GB"/>
         </w:rPr>
-        <w:t xml:space="preserve">-hole of +0.017 is 49 % of full blue at ±0.035 and 20 % at ±0.085, hence it is good visible in the first case, but nearly white in the second, from identical data. Whenever the molecule carries a group far more polar than the halogen, the automatic range is set by that group and the halogen region is washed out. See §3 for when a common scale is legitimate.</w:t>
+        <w:t xml:space="preserve">-hole of +0.017 is 49 % of full blue at ±0.035 and 20 % at ±0.085, hence it is good visible in the first case, but nearly white in the second, from identical data. Whenever the molecule carries a group far more polar than the halogen, the automatic range is set by that </w:t>
+      </w:r>
+      <w:proofErr w:type="gramStart"/>
+      <w:r>
+        <w:rPr>
+          <w:lang w:val="en-GB"/>
+        </w:rPr>
+        <w:t>group</w:t>
+      </w:r>
+      <w:proofErr w:type="gramEnd"/>
+      <w:r>
+        <w:rPr>
+          <w:lang w:val="en-GB"/>
+        </w:rPr>
+        <w:t xml:space="preserve"> and the halogen region is washed out. See §3 for when a common scale is legitimate.</w:t>
       </w:r>
     </w:p>
     <w:p>
@@ -8407,6 +10046,7 @@
       </w:pPr>
       <w:bookmarkStart w:id="26" w:name="_Toc238466599"/>
       <w:bookmarkStart w:id="27" w:name="_Toc238548495"/>
+      <w:proofErr w:type="gramStart"/>
       <w:r>
         <w:rPr>
           <w:lang w:val="en-GB"/>
@@ -8417,6 +10057,7 @@
       <w:r>
         <w:t>σ</w:t>
       </w:r>
+      <w:proofErr w:type="gramEnd"/>
       <w:r>
         <w:rPr>
           <w:lang w:val="en-GB"/>
@@ -8639,7 +10280,7 @@
                 <w:sz w:val="17"/>
                 <w:szCs w:val="17"/>
               </w:rPr>
-              <w:t xml:space="preserve">rays per halogen</w:t>
+              <w:t>rays per halogen</w:t>
             </w:r>
           </w:p>
         </w:tc>
@@ -8714,8 +10355,33 @@
                 <w:sz w:val="17"/>
                 <w:szCs w:val="17"/>
               </w:rPr>
-              <w:t xml:space="preserve">step along a ray</w:t>
-            </w:r>
+              <w:t xml:space="preserve">step </w:t>
+            </w:r>
+            <w:proofErr w:type="spellStart"/>
+            <w:r>
+              <w:rPr>
+                <w:sz w:val="17"/>
+                <w:szCs w:val="17"/>
+              </w:rPr>
+              <w:t>along</w:t>
+            </w:r>
+            <w:proofErr w:type="spellEnd"/>
+            <w:r>
+              <w:rPr>
+                <w:sz w:val="17"/>
+                <w:szCs w:val="17"/>
+              </w:rPr>
+              <w:t xml:space="preserve"> a </w:t>
+            </w:r>
+            <w:proofErr w:type="spellStart"/>
+            <w:r>
+              <w:rPr>
+                <w:sz w:val="17"/>
+                <w:szCs w:val="17"/>
+              </w:rPr>
+              <w:t>ray</w:t>
+            </w:r>
+            <w:proofErr w:type="spellEnd"/>
           </w:p>
         </w:tc>
         <w:tc>
@@ -8784,12 +10450,37 @@
             </w:tcMar>
           </w:tcPr>
           <w:p>
+            <w:proofErr w:type="spellStart"/>
             <w:r>
               <w:rPr>
                 <w:sz w:val="17"/>
                 <w:szCs w:val="17"/>
               </w:rPr>
-              <w:t xml:space="preserve">radius cut-off</w:t>
+              <w:t>radius</w:t>
+            </w:r>
+            <w:proofErr w:type="spellEnd"/>
+            <w:r>
+              <w:rPr>
+                <w:sz w:val="17"/>
+                <w:szCs w:val="17"/>
+              </w:rPr>
+              <w:t xml:space="preserve"> </w:t>
+            </w:r>
+            <w:proofErr w:type="spellStart"/>
+            <w:r>
+              <w:rPr>
+                <w:sz w:val="17"/>
+                <w:szCs w:val="17"/>
+              </w:rPr>
+              <w:t>cut</w:t>
+            </w:r>
+            <w:proofErr w:type="spellEnd"/>
+            <w:r>
+              <w:rPr>
+                <w:sz w:val="17"/>
+                <w:szCs w:val="17"/>
+              </w:rPr>
+              <w:t>-off</w:t>
             </w:r>
           </w:p>
         </w:tc>
@@ -8874,12 +10565,21 @@
             </w:tcMar>
           </w:tcPr>
           <w:p>
+            <w:proofErr w:type="spellStart"/>
             <w:r>
               <w:rPr>
                 <w:sz w:val="17"/>
                 <w:szCs w:val="17"/>
               </w:rPr>
-              <w:t xml:space="preserve">belt half-angle</w:t>
+              <w:t>belt</w:t>
+            </w:r>
+            <w:proofErr w:type="spellEnd"/>
+            <w:r>
+              <w:rPr>
+                <w:sz w:val="17"/>
+                <w:szCs w:val="17"/>
+              </w:rPr>
+              <w:t xml:space="preserve"> half-angle</w:t>
             </w:r>
           </w:p>
         </w:tc>
@@ -8964,13 +10664,31 @@
             </w:tcMar>
           </w:tcPr>
           <w:p>
+            <w:proofErr w:type="spellStart"/>
             <w:r>
               <w:rPr>
                 <w:sz w:val="17"/>
                 <w:szCs w:val="17"/>
               </w:rPr>
-              <w:t xml:space="preserve">belt radius</w:t>
-            </w:r>
+              <w:t>belt</w:t>
+            </w:r>
+            <w:proofErr w:type="spellEnd"/>
+            <w:r>
+              <w:rPr>
+                <w:sz w:val="17"/>
+                <w:szCs w:val="17"/>
+              </w:rPr>
+              <w:t xml:space="preserve"> </w:t>
+            </w:r>
+            <w:proofErr w:type="spellStart"/>
+            <w:r>
+              <w:rPr>
+                <w:sz w:val="17"/>
+                <w:szCs w:val="17"/>
+              </w:rPr>
+              <w:t>radius</w:t>
+            </w:r>
+            <w:proofErr w:type="spellEnd"/>
           </w:p>
         </w:tc>
         <w:tc>
@@ -9056,11 +10774,13 @@
       </w:pPr>
       <w:bookmarkStart w:id="28" w:name="_Toc238466600"/>
       <w:bookmarkStart w:id="29" w:name="_Toc238548496"/>
+      <w:proofErr w:type="gramStart"/>
       <w:r>
         <w:t>4.5  Rendering</w:t>
       </w:r>
       <w:bookmarkEnd w:id="28"/>
       <w:bookmarkEnd w:id="29"/>
+      <w:proofErr w:type="gramEnd"/>
     </w:p>
     <w:tbl>
       <w:tblPr>
@@ -9336,6 +11056,7 @@
             </w:tcMar>
           </w:tcPr>
           <w:p>
+            <w:proofErr w:type="spellStart"/>
             <w:r>
               <w:rPr>
                 <w:rFonts w:ascii="Consolas" w:eastAsia="Consolas" w:hAnsi="Consolas" w:cs="Consolas"/>
@@ -9344,6 +11065,7 @@
               </w:rPr>
               <w:t>surface_quality</w:t>
             </w:r>
+            <w:proofErr w:type="spellEnd"/>
           </w:p>
         </w:tc>
         <w:tc>
@@ -9412,6 +11134,7 @@
             </w:tcMar>
           </w:tcPr>
           <w:p>
+            <w:proofErr w:type="spellStart"/>
             <w:r>
               <w:rPr>
                 <w:rFonts w:ascii="Consolas" w:eastAsia="Consolas" w:hAnsi="Consolas" w:cs="Consolas"/>
@@ -9420,6 +11143,7 @@
               </w:rPr>
               <w:t>orthoscopic</w:t>
             </w:r>
+            <w:proofErr w:type="spellEnd"/>
           </w:p>
         </w:tc>
         <w:tc>
@@ -9488,13 +11212,31 @@
             </w:tcMar>
           </w:tcPr>
           <w:p>
+            <w:proofErr w:type="spellStart"/>
             <w:r>
               <w:rPr>
                 <w:sz w:val="17"/>
                 <w:szCs w:val="17"/>
               </w:rPr>
-              <w:t xml:space="preserve">image size</w:t>
-            </w:r>
+              <w:t>image</w:t>
+            </w:r>
+            <w:proofErr w:type="spellEnd"/>
+            <w:r>
+              <w:rPr>
+                <w:sz w:val="17"/>
+                <w:szCs w:val="17"/>
+              </w:rPr>
+              <w:t xml:space="preserve"> </w:t>
+            </w:r>
+            <w:proofErr w:type="spellStart"/>
+            <w:r>
+              <w:rPr>
+                <w:sz w:val="17"/>
+                <w:szCs w:val="17"/>
+              </w:rPr>
+              <w:t>size</w:t>
+            </w:r>
+            <w:proofErr w:type="spellEnd"/>
           </w:p>
         </w:tc>
         <w:tc>
@@ -9569,11 +11311,19 @@
       </w:pPr>
       <w:bookmarkStart w:id="30" w:name="_Toc238466601"/>
       <w:bookmarkStart w:id="31" w:name="_Toc238548497"/>
-      <w:r>
-        <w:rPr>
-          <w:lang w:val="en-GB"/>
-        </w:rPr>
-        <w:t>4.6  Test-data generator</w:t>
+      <w:proofErr w:type="gramStart"/>
+      <w:r>
+        <w:rPr>
+          <w:lang w:val="en-GB"/>
+        </w:rPr>
+        <w:t>4.6  Test</w:t>
+      </w:r>
+      <w:proofErr w:type="gramEnd"/>
+      <w:r>
+        <w:rPr>
+          <w:lang w:val="en-GB"/>
+        </w:rPr>
+        <w:t>-data generator</w:t>
       </w:r>
       <w:bookmarkEnd w:id="30"/>
       <w:bookmarkEnd w:id="31"/>
@@ -9613,7 +11363,21 @@
         <w:rPr>
           <w:lang w:val="en-GB"/>
         </w:rPr>
-        <w:t xml:space="preserve">. The one measurement worth repeating here is the cost scaling, because it decides what is practical: triazolam (35 atoms, 390 basis functions) at the default 0.25 Bohr and 3.5 Å margin needs 1.41 million grid points and about 26 minutes for the grid evaluation, against roughly 4 minutes for 4-bromoacetophenone. The two factors multiply — 1.8× more points and 4× more work per point. </w:t>
+        <w:t xml:space="preserve">. The one measurement worth repeating here is the cost scaling, because it decides what is practical: triazolam (35 atoms, 390 basis functions) at the default 0.25 Bohr and 3.5 Å margin </w:t>
+      </w:r>
+      <w:proofErr w:type="gramStart"/>
+      <w:r>
+        <w:rPr>
+          <w:lang w:val="en-GB"/>
+        </w:rPr>
+        <w:t>needs</w:t>
+      </w:r>
+      <w:proofErr w:type="gramEnd"/>
+      <w:r>
+        <w:rPr>
+          <w:lang w:val="en-GB"/>
+        </w:rPr>
+        <w:t xml:space="preserve"> 1.41 million grid points and about 26 minutes for the grid evaluation, against roughly 4 minutes for 4-bromoacetophenone. The two factors multiply — 1.8× more points and 4× more work per point. </w:t>
       </w:r>
       <w:r>
         <w:rPr>
@@ -9654,6 +11418,7 @@
       </w:pPr>
       <w:bookmarkStart w:id="32" w:name="_Toc238466602"/>
       <w:bookmarkStart w:id="33" w:name="_Toc238548498"/>
+      <w:proofErr w:type="gramStart"/>
       <w:r>
         <w:rPr>
           <w:lang w:val="en-GB"/>
@@ -9663,6 +11428,7 @@
       </w:r>
       <w:bookmarkEnd w:id="32"/>
       <w:bookmarkEnd w:id="33"/>
+      <w:proofErr w:type="gramEnd"/>
     </w:p>
     <w:p>
       <w:pPr>
@@ -9675,40 +11441,84 @@
         <w:rPr>
           <w:rFonts w:ascii="Consolas" w:hAnsi="Consolas"/>
           <w:sz w:val="19"/>
+          <w:lang w:val="en-GB"/>
         </w:rPr>
         <w:t>results/</w:t>
       </w:r>
       <w:r>
-        <w:t xml:space="preserve"> holds the image sets that this project actually delivers — nine molecules, each with the three standard views, its colour bar and its </w:t>
+        <w:rPr>
+          <w:lang w:val="en-GB"/>
+        </w:rPr>
+        <w:t xml:space="preserve"> holds the image sets that this project </w:t>
+      </w:r>
+      <w:proofErr w:type="gramStart"/>
+      <w:r>
+        <w:rPr>
+          <w:lang w:val="en-GB"/>
+        </w:rPr>
+        <w:t>actually delivers</w:t>
+      </w:r>
+      <w:proofErr w:type="gramEnd"/>
+      <w:r>
+        <w:rPr>
+          <w:lang w:val="en-GB"/>
+        </w:rPr>
+        <w:t xml:space="preserve"> — nine molecules, each with the three standard views, its colour bar and </w:t>
+      </w:r>
+      <w:proofErr w:type="spellStart"/>
+      <w:r>
+        <w:rPr>
+          <w:lang w:val="en-GB"/>
+        </w:rPr>
+        <w:t>its</w:t>
+      </w:r>
+      <w:proofErr w:type="spellEnd"/>
+      <w:r>
+        <w:rPr>
+          <w:lang w:val="en-GB"/>
+        </w:rPr>
+        <w:t xml:space="preserve"> </w:t>
       </w:r>
       <w:r>
         <w:rPr>
           <w:rFonts w:ascii="Consolas" w:hAnsi="Consolas"/>
           <w:sz w:val="19"/>
+          <w:lang w:val="en-GB"/>
         </w:rPr>
         <w:t>*_settings.txt</w:t>
       </w:r>
       <w:r>
+        <w:rPr>
+          <w:lang w:val="en-GB"/>
+        </w:rPr>
         <w:t xml:space="preserve">. Unlike </w:t>
       </w:r>
       <w:r>
         <w:rPr>
           <w:rFonts w:ascii="Consolas" w:hAnsi="Consolas"/>
           <w:sz w:val="19"/>
+          <w:lang w:val="en-GB"/>
         </w:rPr>
         <w:t>sandbox/</w:t>
       </w:r>
       <w:r>
+        <w:rPr>
+          <w:lang w:val="en-GB"/>
+        </w:rPr>
         <w:t xml:space="preserve">, this folder is committed: the images are the deliverable, and </w:t>
       </w:r>
       <w:r>
         <w:rPr>
           <w:rFonts w:ascii="Consolas" w:hAnsi="Consolas"/>
           <w:sz w:val="19"/>
+          <w:lang w:val="en-GB"/>
         </w:rPr>
         <w:t>*_settings.txt</w:t>
       </w:r>
       <w:r>
+        <w:rPr>
+          <w:lang w:val="en-GB"/>
+        </w:rPr>
         <w:t xml:space="preserve"> next to each one is the record of how it was made.</w:t>
       </w:r>
     </w:p>
@@ -10478,8 +12288,13 @@
       </w:pPr>
       <w:bookmarkStart w:id="34" w:name="_Toc238466603"/>
       <w:bookmarkStart w:id="35" w:name="_Toc238548499"/>
-      <w:r>
-        <w:t>5.1  Surface ESP values</w:t>
+      <w:proofErr w:type="gramStart"/>
+      <w:r>
+        <w:t>5.1  Surface</w:t>
+      </w:r>
+      <w:proofErr w:type="gramEnd"/>
+      <w:r>
+        <w:t xml:space="preserve"> ESP values</w:t>
       </w:r>
       <w:bookmarkEnd w:id="34"/>
       <w:bookmarkEnd w:id="35"/>
@@ -10492,7 +12307,61 @@
         </w:rPr>
       </w:pPr>
       <w:r>
-        <w:t>All at ρ = 0.001 a.u.; σ-hole and belt from the ray method. Atom labels are 1-based indices into the respective structure file. Note the two grid spacings — see §5.2.</w:t>
+        <w:rPr>
+          <w:lang w:val="en-GB"/>
+        </w:rPr>
+        <w:t xml:space="preserve">All at </w:t>
+      </w:r>
+      <w:r>
+        <w:t>ρ</w:t>
+      </w:r>
+      <w:r>
+        <w:rPr>
+          <w:lang w:val="en-GB"/>
+        </w:rPr>
+        <w:t xml:space="preserve"> = 0.001 </w:t>
+      </w:r>
+      <w:proofErr w:type="spellStart"/>
+      <w:r>
+        <w:rPr>
+          <w:lang w:val="en-GB"/>
+        </w:rPr>
+        <w:t>a.u</w:t>
+      </w:r>
+      <w:proofErr w:type="spellEnd"/>
+      <w:r>
+        <w:rPr>
+          <w:lang w:val="en-GB"/>
+        </w:rPr>
+        <w:t xml:space="preserve">.; </w:t>
+      </w:r>
+      <w:r>
+        <w:t>σ</w:t>
+      </w:r>
+      <w:r>
+        <w:rPr>
+          <w:lang w:val="en-GB"/>
+        </w:rPr>
+        <w:t xml:space="preserve">-hole and belt from the ray method. Atom labels are 1-based indices into the respective structure file. </w:t>
+      </w:r>
+      <w:r>
+        <w:t xml:space="preserve">Note the </w:t>
+      </w:r>
+      <w:proofErr w:type="spellStart"/>
+      <w:r>
+        <w:t>two</w:t>
+      </w:r>
+      <w:proofErr w:type="spellEnd"/>
+      <w:r>
+        <w:t xml:space="preserve"> </w:t>
+      </w:r>
+      <w:proofErr w:type="spellStart"/>
+      <w:r>
+        <w:t>grid</w:t>
+      </w:r>
+      <w:proofErr w:type="spellEnd"/>
+      <w:r>
+        <w:t xml:space="preserve"> spacings — see §5.2.</w:t>
       </w:r>
     </w:p>
     <w:tbl>
@@ -10647,6 +12516,7 @@
             <w:pPr>
               <w:jc w:val="right"/>
             </w:pPr>
+            <w:proofErr w:type="gramStart"/>
             <w:r>
               <w:rPr>
                 <w:b/>
@@ -10668,6 +12538,7 @@
               </w:rPr>
               <w:t>S,min</w:t>
             </w:r>
+            <w:proofErr w:type="gramEnd"/>
           </w:p>
         </w:tc>
         <w:tc>
@@ -10685,6 +12556,7 @@
             <w:pPr>
               <w:jc w:val="right"/>
             </w:pPr>
+            <w:proofErr w:type="gramStart"/>
             <w:r>
               <w:rPr>
                 <w:b/>
@@ -10706,6 +12578,7 @@
               </w:rPr>
               <w:t>S,max</w:t>
             </w:r>
+            <w:proofErr w:type="gramEnd"/>
           </w:p>
         </w:tc>
         <w:tc>
@@ -12739,6 +14612,9 @@
         </w:rPr>
       </w:pPr>
       <w:r>
+        <w:rPr>
+          <w:lang w:val="en-GB"/>
+        </w:rPr>
         <w:t>What the set is meant to show:</w:t>
       </w:r>
     </w:p>
@@ -12754,11 +14630,50 @@
       <w:r>
         <w:rPr>
           <w:b/>
+          <w:lang w:val="en-GB"/>
         </w:rPr>
         <w:t>The halobenzene series is the trend Cl &lt; Br &lt; I,</w:t>
       </w:r>
       <w:r>
-        <w:t xml:space="preserve"> a factor of 3.2 across the three — while their global VS,max agree to within 1.3 %, because that maximum is the same aromatic C–H in all three. This is the central argument of §2.1.</w:t>
+        <w:rPr>
+          <w:lang w:val="en-GB"/>
+        </w:rPr>
+        <w:t xml:space="preserve"> a factor of 3.2 across the three — while their global </w:t>
+      </w:r>
+      <w:proofErr w:type="spellStart"/>
+      <w:proofErr w:type="gramStart"/>
+      <w:r>
+        <w:rPr>
+          <w:lang w:val="en-GB"/>
+        </w:rPr>
+        <w:t>VS,max</w:t>
+      </w:r>
+      <w:proofErr w:type="spellEnd"/>
+      <w:proofErr w:type="gramEnd"/>
+      <w:r>
+        <w:rPr>
+          <w:lang w:val="en-GB"/>
+        </w:rPr>
+        <w:t xml:space="preserve"> agree to within 1.3 %, because that maximum is the same aromatic C–H in all three. </w:t>
+      </w:r>
+      <w:r>
+        <w:t xml:space="preserve">This </w:t>
+      </w:r>
+      <w:proofErr w:type="spellStart"/>
+      <w:r>
+        <w:t>is</w:t>
+      </w:r>
+      <w:proofErr w:type="spellEnd"/>
+      <w:r>
+        <w:t xml:space="preserve"> the </w:t>
+      </w:r>
+      <w:proofErr w:type="spellStart"/>
+      <w:r>
+        <w:t>central</w:t>
+      </w:r>
+      <w:proofErr w:type="spellEnd"/>
+      <w:r>
+        <w:t xml:space="preserve"> argument of §2.1.</w:t>
       </w:r>
     </w:p>
     <w:p>
@@ -12776,11 +14691,54 @@
       <w:r>
         <w:rPr>
           <w:b/>
+          <w:lang w:val="en-GB"/>
         </w:rPr>
         <w:t>The ring nitrogen dominates the negative side.</w:t>
       </w:r>
       <w:r>
-        <w:t xml:space="preserve"> In five of the six pyridines VS,min sits on the ring nitrogen — the lone pair, not the π system — between −0.0471 and −0.0678 a.u., two and a half to three and a half times the most negative value found anywhere on a halobenzene. The exception is 4-chloro-3-nitropyridine, where the nitro oxygens win at −0.0454.</w:t>
+        <w:rPr>
+          <w:lang w:val="en-GB"/>
+        </w:rPr>
+        <w:t xml:space="preserve"> In five of the six pyridines </w:t>
+      </w:r>
+      <w:proofErr w:type="spellStart"/>
+      <w:proofErr w:type="gramStart"/>
+      <w:r>
+        <w:rPr>
+          <w:lang w:val="en-GB"/>
+        </w:rPr>
+        <w:t>VS,min</w:t>
+      </w:r>
+      <w:proofErr w:type="spellEnd"/>
+      <w:proofErr w:type="gramEnd"/>
+      <w:r>
+        <w:rPr>
+          <w:lang w:val="en-GB"/>
+        </w:rPr>
+        <w:t xml:space="preserve"> sits on the ring nitrogen — the lone pair, not the </w:t>
+      </w:r>
+      <w:r>
+        <w:t>π</w:t>
+      </w:r>
+      <w:r>
+        <w:rPr>
+          <w:lang w:val="en-GB"/>
+        </w:rPr>
+        <w:t xml:space="preserve"> system — between −0.0471 and −0.0678 </w:t>
+      </w:r>
+      <w:proofErr w:type="spellStart"/>
+      <w:r>
+        <w:rPr>
+          <w:lang w:val="en-GB"/>
+        </w:rPr>
+        <w:t>a.u</w:t>
+      </w:r>
+      <w:proofErr w:type="spellEnd"/>
+      <w:r>
+        <w:rPr>
+          <w:lang w:val="en-GB"/>
+        </w:rPr>
+        <w:t>., two and a half to three and a half times the most negative value found anywhere on a halobenzene. The exception is 4-chloro-3-nitropyridine, where the nitro oxygens win at −0.0454.</w:t>
       </w:r>
     </w:p>
     <w:p>
@@ -12798,11 +14756,58 @@
       <w:r>
         <w:rPr>
           <w:b/>
-        </w:rPr>
+          <w:lang w:val="en-GB"/>
+        </w:rPr>
+        <w:lastRenderedPageBreak/>
         <w:t>Substituents shift that lone pair in the expected direction:</w:t>
       </w:r>
       <w:r>
-        <w:t xml:space="preserve"> methyl −0.0678, unsubstituted pyridine −0.0650, cyano −0.0593, nitro −0.0471. A span of 0.0207 a.u. — 54 kJ/(mol·e) — from a single group in the 4-position, with the electron-withdrawing ones making the nitrogen the weaker acceptor.</w:t>
+        <w:rPr>
+          <w:lang w:val="en-GB"/>
+        </w:rPr>
+        <w:t xml:space="preserve"> methyl −0.0678, unsubstituted pyridine −0.0650, </w:t>
+      </w:r>
+      <w:proofErr w:type="spellStart"/>
+      <w:r>
+        <w:rPr>
+          <w:lang w:val="en-GB"/>
+        </w:rPr>
+        <w:t>cyano</w:t>
+      </w:r>
+      <w:proofErr w:type="spellEnd"/>
+      <w:r>
+        <w:rPr>
+          <w:lang w:val="en-GB"/>
+        </w:rPr>
+        <w:t xml:space="preserve"> −0.0593, nitro −0.0471. A span of 0.0207 </w:t>
+      </w:r>
+      <w:proofErr w:type="spellStart"/>
+      <w:r>
+        <w:rPr>
+          <w:lang w:val="en-GB"/>
+        </w:rPr>
+        <w:t>a.u</w:t>
+      </w:r>
+      <w:proofErr w:type="spellEnd"/>
+      <w:r>
+        <w:rPr>
+          <w:lang w:val="en-GB"/>
+        </w:rPr>
+        <w:t>. — 54 kJ/(</w:t>
+      </w:r>
+      <w:proofErr w:type="spellStart"/>
+      <w:r>
+        <w:rPr>
+          <w:lang w:val="en-GB"/>
+        </w:rPr>
+        <w:t>mol·e</w:t>
+      </w:r>
+      <w:proofErr w:type="spellEnd"/>
+      <w:r>
+        <w:rPr>
+          <w:lang w:val="en-GB"/>
+        </w:rPr>
+        <w:t>) — from a single group in the 4-position, with the electron-withdrawing ones making the nitrogen the weaker acceptor.</w:t>
       </w:r>
     </w:p>
     <w:p>
@@ -12820,11 +14825,56 @@
       <w:r>
         <w:rPr>
           <w:b/>
-        </w:rPr>
-        <w:t>The ring carries over to the σ-hole.</w:t>
-      </w:r>
-      <w:r>
-        <w:t xml:space="preserve"> 3-Iodopyridine reaches +0.0344 against +0.0256 for iodobenzene: the same C–I bond on an electron-poorer ring is 34 % stronger. The iodine sits in the 3-position, not the 4-position (see §5.2), so the effect here is inductive rather than mesomeric.</w:t>
+          <w:lang w:val="en-GB"/>
+        </w:rPr>
+        <w:t xml:space="preserve">The ring carries over to the </w:t>
+      </w:r>
+      <w:r>
+        <w:rPr>
+          <w:b/>
+        </w:rPr>
+        <w:t>σ</w:t>
+      </w:r>
+      <w:r>
+        <w:rPr>
+          <w:b/>
+          <w:lang w:val="en-GB"/>
+        </w:rPr>
+        <w:t>-hole.</w:t>
+      </w:r>
+      <w:r>
+        <w:rPr>
+          <w:lang w:val="en-GB"/>
+        </w:rPr>
+        <w:t xml:space="preserve"> 3-Iodopyridine reaches +0.0344 against +0.0256 for </w:t>
+      </w:r>
+      <w:proofErr w:type="spellStart"/>
+      <w:r>
+        <w:rPr>
+          <w:lang w:val="en-GB"/>
+        </w:rPr>
+        <w:t>iodobenzene</w:t>
+      </w:r>
+      <w:proofErr w:type="spellEnd"/>
+      <w:r>
+        <w:rPr>
+          <w:lang w:val="en-GB"/>
+        </w:rPr>
+        <w:t xml:space="preserve">: the same C–I bond on an electron-poorer ring is 34 % stronger. The iodine sits in the 3-position, not the 4-position (see §5.2), so the effect here is inductive rather than </w:t>
+      </w:r>
+      <w:proofErr w:type="spellStart"/>
+      <w:r>
+        <w:rPr>
+          <w:lang w:val="en-GB"/>
+        </w:rPr>
+        <w:t>mesomeric</w:t>
+      </w:r>
+      <w:proofErr w:type="spellEnd"/>
+      <w:r>
+        <w:rPr>
+          <w:lang w:val="en-GB"/>
+        </w:rPr>
+        <w:t>.</w:t>
       </w:r>
     </w:p>
     <w:p>
@@ -12842,11 +14892,34 @@
       <w:r>
         <w:rPr>
           <w:b/>
+          <w:lang w:val="en-GB"/>
         </w:rPr>
         <w:t>4-Chloro-3-nitropyridine is the clearest case for how much the environment matters.</w:t>
       </w:r>
       <w:r>
-        <w:t xml:space="preserve"> Its chlorine reaches +0.0251 against +0.0079 on chlorobenzene, more than three times, on the same element — and its belt is the deepest of the set at −0.0309. Ring nitrogen and nitro group withdraw together.</w:t>
+        <w:rPr>
+          <w:lang w:val="en-GB"/>
+        </w:rPr>
+        <w:t xml:space="preserve"> Its chlorine reaches +0.0251 against +0.0079 on chlorobenzene, more than three times, on the same element — and its belt is the deepest of the set at −0.0309. </w:t>
+      </w:r>
+      <w:r>
+        <w:t xml:space="preserve">Ring </w:t>
+      </w:r>
+      <w:proofErr w:type="spellStart"/>
+      <w:r>
+        <w:t>nitrogen</w:t>
+      </w:r>
+      <w:proofErr w:type="spellEnd"/>
+      <w:r>
+        <w:t xml:space="preserve"> and </w:t>
+      </w:r>
+      <w:proofErr w:type="spellStart"/>
+      <w:r>
+        <w:t>nitro</w:t>
+      </w:r>
+      <w:proofErr w:type="spellEnd"/>
+      <w:r>
+        <w:t xml:space="preserve"> group withdraw together.</w:t>
       </w:r>
     </w:p>
     <w:p>
@@ -12864,10 +14937,27 @@
       <w:r>
         <w:rPr>
           <w:b/>
-        </w:rPr>
-        <w:t>It is also the only σ-hole in the set that is not on the bond axis:</w:t>
-      </w:r>
-      <w:r>
+          <w:lang w:val="en-GB"/>
+        </w:rPr>
+        <w:t xml:space="preserve">It is also the only </w:t>
+      </w:r>
+      <w:r>
+        <w:rPr>
+          <w:b/>
+        </w:rPr>
+        <w:t>σ</w:t>
+      </w:r>
+      <w:r>
+        <w:rPr>
+          <w:b/>
+          <w:lang w:val="en-GB"/>
+        </w:rPr>
+        <w:t>-hole in the set that is not on the bond axis:</w:t>
+      </w:r>
+      <w:r>
+        <w:rPr>
+          <w:lang w:val="en-GB"/>
+        </w:rPr>
         <w:t xml:space="preserve"> the maximum sits 6.4° off, pushed there by the neighbouring nitro group. Every other halogen here gives 0.0°. The angle is recorded in *_settings.txt, and §2.4 explains why the search cone must not reach the rest of the molecule.</w:t>
       </w:r>
     </w:p>
@@ -12881,11 +14971,19 @@
       </w:pPr>
       <w:bookmarkStart w:id="36" w:name="_Toc238466604"/>
       <w:bookmarkStart w:id="37" w:name="_Toc238548500"/>
-      <w:r>
-        <w:rPr>
-          <w:lang w:val="en-GB"/>
-        </w:rPr>
-        <w:t>5.2  What these numbers may and may not be compared with</w:t>
+      <w:proofErr w:type="gramStart"/>
+      <w:r>
+        <w:rPr>
+          <w:lang w:val="en-GB"/>
+        </w:rPr>
+        <w:t>5.2  What</w:t>
+      </w:r>
+      <w:proofErr w:type="gramEnd"/>
+      <w:r>
+        <w:rPr>
+          <w:lang w:val="en-GB"/>
+        </w:rPr>
+        <w:t xml:space="preserve"> these numbers may and may not be compared with</w:t>
       </w:r>
       <w:bookmarkEnd w:id="36"/>
       <w:bookmarkEnd w:id="37"/>
@@ -12900,30 +14998,58 @@
       <w:r>
         <w:rPr>
           <w:b/>
-        </w:rPr>
-        <w:t>All nine sets come from Turbomole calculations provided by the supervisor.</w:t>
-      </w:r>
-      <w:r>
+          <w:lang w:val="en-GB"/>
+        </w:rPr>
+        <w:t xml:space="preserve">All nine sets come from </w:t>
+      </w:r>
+      <w:proofErr w:type="spellStart"/>
+      <w:r>
+        <w:rPr>
+          <w:b/>
+          <w:lang w:val="en-GB"/>
+        </w:rPr>
+        <w:t>Turbomole</w:t>
+      </w:r>
+      <w:proofErr w:type="spellEnd"/>
+      <w:r>
+        <w:rPr>
+          <w:b/>
+          <w:lang w:val="en-GB"/>
+        </w:rPr>
+        <w:t xml:space="preserve"> calculations provided by the supervisor.</w:t>
+      </w:r>
+      <w:r>
+        <w:rPr>
+          <w:lang w:val="en-GB"/>
+        </w:rPr>
         <w:t xml:space="preserve"> The method caveat of earlier versions of this document therefore no longer applies. The self-generated molecules — chloromethane, 4-bromoacetophenone, paracetamol and triazolam, computed at HF/def2-SVP on MMFF94 geometries with </w:t>
       </w:r>
       <w:r>
         <w:rPr>
           <w:rFonts w:ascii="Consolas" w:hAnsi="Consolas"/>
           <w:sz w:val="19"/>
+          <w:lang w:val="en-GB"/>
         </w:rPr>
         <w:t>tools/CreateTpTdFromSmiles.py</w:t>
       </w:r>
       <w:r>
+        <w:rPr>
+          <w:lang w:val="en-GB"/>
+        </w:rPr>
         <w:t xml:space="preserve"> — have been removed from the delivered set. The generator and its limitations are still documented in </w:t>
       </w:r>
       <w:r>
         <w:rPr>
           <w:rFonts w:ascii="Consolas" w:hAnsi="Consolas"/>
           <w:sz w:val="19"/>
+          <w:lang w:val="en-GB"/>
         </w:rPr>
         <w:t>tools/README.txt</w:t>
       </w:r>
       <w:r>
+        <w:rPr>
+          <w:lang w:val="en-GB"/>
+        </w:rPr>
         <w:t>.</w:t>
       </w:r>
     </w:p>
@@ -12935,7 +15061,84 @@
         </w:rPr>
       </w:pPr>
       <w:r>
-        <w:t>One difference between the two groups remains and belongs in the methods section: they were computed on different grids. The pyridines use 0.16 Bohr spacing over a ±20 Bohr box, the halobenzenes 0.12 Bohr over ±15 Bohr. That is why the shell point counts differ by roughly a factor of three — 12 000 to 17 000 against 36 000 to 42 000. The effect on the values is small: decimating the bromobenzene grid from 0.12 to 0.24 Bohr, twice as coarse as the pyridine grid, moves VS,min by 0.00005 and VS,max by 0.00033 a.u., about 1 %. That is far below every difference discussed above, and per §4.2 both spacings sit well inside the range where the isovalue, not the grid, sets the accuracy.</w:t>
+        <w:rPr>
+          <w:lang w:val="en-GB"/>
+        </w:rPr>
+        <w:t xml:space="preserve">One difference between the two groups remains and belongs in the methods section: they were computed on different grids. The pyridines use 0.16 Bohr spacing over a ±20 Bohr box, the </w:t>
+      </w:r>
+      <w:proofErr w:type="spellStart"/>
+      <w:r>
+        <w:rPr>
+          <w:lang w:val="en-GB"/>
+        </w:rPr>
+        <w:t>halobenzenes</w:t>
+      </w:r>
+      <w:proofErr w:type="spellEnd"/>
+      <w:r>
+        <w:rPr>
+          <w:lang w:val="en-GB"/>
+        </w:rPr>
+        <w:t xml:space="preserve"> 0.12 Bohr over ±15 Bohr. That is why the shell point counts differ by roughly a factor of three — 12 000 to 17 000 against 36 000 to 42 000. The effect on the values is small: decimating the bromobenzene grid from 0.12 to 0.24 Bohr, twice as coarse as the pyridine grid, moves </w:t>
+      </w:r>
+      <w:proofErr w:type="spellStart"/>
+      <w:proofErr w:type="gramStart"/>
+      <w:r>
+        <w:rPr>
+          <w:lang w:val="en-GB"/>
+        </w:rPr>
+        <w:t>VS,min</w:t>
+      </w:r>
+      <w:proofErr w:type="spellEnd"/>
+      <w:proofErr w:type="gramEnd"/>
+      <w:r>
+        <w:rPr>
+          <w:lang w:val="en-GB"/>
+        </w:rPr>
+        <w:t xml:space="preserve"> by 0.00005 and </w:t>
+      </w:r>
+      <w:proofErr w:type="spellStart"/>
+      <w:proofErr w:type="gramStart"/>
+      <w:r>
+        <w:rPr>
+          <w:lang w:val="en-GB"/>
+        </w:rPr>
+        <w:t>VS,max</w:t>
+      </w:r>
+      <w:proofErr w:type="spellEnd"/>
+      <w:proofErr w:type="gramEnd"/>
+      <w:r>
+        <w:rPr>
+          <w:lang w:val="en-GB"/>
+        </w:rPr>
+        <w:t xml:space="preserve"> by 0.00033 </w:t>
+      </w:r>
+      <w:proofErr w:type="spellStart"/>
+      <w:r>
+        <w:rPr>
+          <w:lang w:val="en-GB"/>
+        </w:rPr>
+        <w:t>a.u</w:t>
+      </w:r>
+      <w:proofErr w:type="spellEnd"/>
+      <w:r>
+        <w:rPr>
+          <w:lang w:val="en-GB"/>
+        </w:rPr>
+        <w:t xml:space="preserve">., about 1 %. That is far below every difference discussed above, and per §4.2 both spacings sit well inside the range where the </w:t>
+      </w:r>
+      <w:proofErr w:type="spellStart"/>
+      <w:r>
+        <w:rPr>
+          <w:lang w:val="en-GB"/>
+        </w:rPr>
+        <w:t>isovalue</w:t>
+      </w:r>
+      <w:proofErr w:type="spellEnd"/>
+      <w:r>
+        <w:rPr>
+          <w:lang w:val="en-GB"/>
+        </w:rPr>
+        <w:t>, not the grid, sets the accuracy.</w:t>
       </w:r>
     </w:p>
     <w:p>
@@ -12946,6 +15149,9 @@
         </w:rPr>
       </w:pPr>
       <w:r>
+        <w:rPr>
+          <w:lang w:val="en-GB"/>
+        </w:rPr>
         <w:t>The colour scales, however, are not comparable. Each molecule was rendered on its own automatic range, from ±0.035 to ±0.070. Two images read side by side without their colour bars would suggest that bromobenzene is as polarised as pyridine, which is wrong by a factor of two. For a comparison figure, re-render the whole set on one scale:</w:t>
       </w:r>
     </w:p>
@@ -12970,7 +15176,41 @@
           <w:szCs w:val="15"/>
           <w:lang w:val="en-GB"/>
         </w:rPr>
-        <w:t>python run_all.py --root ../sandbox --esp-range 0.070 --images-dir images_common</w:t>
+        <w:t>python run_all.py --root</w:t>
+      </w:r>
+      <w:proofErr w:type="gramStart"/>
+      <w:r>
+        <w:rPr>
+          <w:rFonts w:ascii="Consolas" w:eastAsia="Consolas" w:hAnsi="Consolas" w:cs="Consolas"/>
+          <w:sz w:val="15"/>
+          <w:szCs w:val="15"/>
+          <w:lang w:val="en-GB"/>
+        </w:rPr>
+        <w:t xml:space="preserve"> ..</w:t>
+      </w:r>
+      <w:proofErr w:type="gramEnd"/>
+      <w:r>
+        <w:rPr>
+          <w:rFonts w:ascii="Consolas" w:eastAsia="Consolas" w:hAnsi="Consolas" w:cs="Consolas"/>
+          <w:sz w:val="15"/>
+          <w:szCs w:val="15"/>
+          <w:lang w:val="en-GB"/>
+        </w:rPr>
+        <w:t>/sandbox --esp-range 0.070 --images-dir images_common</w:t>
+      </w:r>
+    </w:p>
+    <w:p>
+      <w:pPr>
+        <w:spacing w:after="140"/>
+        <w:rPr>
+          <w:lang w:val="en-GB"/>
+        </w:rPr>
+      </w:pPr>
+      <w:r>
+        <w:rPr>
+          <w:lang w:val="en-GB"/>
+        </w:rPr>
+        <w:t>Always read the colour bar shipped with the image, never the colours alone.</w:t>
       </w:r>
     </w:p>
     <w:p>
@@ -12978,15 +15218,23 @@
         <w:spacing w:after="140"/>
       </w:pPr>
       <w:r>
-        <w:t>Always read the colour bar shipped with the image, never the colours alone.</w:t>
-      </w:r>
-    </w:p>
-    <w:p>
-      <w:pPr>
-        <w:spacing w:after="140"/>
-      </w:pPr>
-      <w:r>
-        <w:t>Two further caveats:</w:t>
+        <w:t xml:space="preserve">Two </w:t>
+      </w:r>
+      <w:proofErr w:type="spellStart"/>
+      <w:r>
+        <w:t>further</w:t>
+      </w:r>
+      <w:proofErr w:type="spellEnd"/>
+      <w:r>
+        <w:t xml:space="preserve"> </w:t>
+      </w:r>
+      <w:proofErr w:type="spellStart"/>
+      <w:r>
+        <w:t>caveats</w:t>
+      </w:r>
+      <w:proofErr w:type="spellEnd"/>
+      <w:r>
+        <w:t>:</w:t>
       </w:r>
     </w:p>
     <w:p>
@@ -13004,10 +15252,14 @@
       <w:r>
         <w:rPr>
           <w:b/>
+          <w:lang w:val="en-GB"/>
         </w:rPr>
         <w:t>The maximum density value in the provided halobenzene data suggests bromine was treated all-electron while iodine used an effective core potential.</w:t>
       </w:r>
       <w:r>
+        <w:rPr>
+          <w:lang w:val="en-GB"/>
+        </w:rPr>
         <w:t xml:space="preserve"> That is a question for the supervisor; if so, the Br/I step in the table is not a pure basis-set-consistent comparison.</w:t>
       </w:r>
     </w:p>
@@ -13026,11 +15278,80 @@
       <w:r>
         <w:rPr>
           <w:b/>
-        </w:rPr>
-        <w:t>I-Pyr is the 3-isomer, not the 4-isomer that the folder name suggests.</w:t>
-      </w:r>
-      <w:r>
-        <w:t xml:space="preserve"> By analogy with Me-Pyr, CN-Pyr and NO2-Pyr one would expect the 4-position. Confirmed from the geometry: the ring-nitrogen-to-iodine distance is 4.33 Å, against 4.36 Å expected for the 3-position and 4.88 Å for the 4-position. Any argument that lines it up with the para-substituted members has to account for that.</w:t>
+          <w:lang w:val="en-GB"/>
+        </w:rPr>
+        <w:t>I-</w:t>
+      </w:r>
+      <w:proofErr w:type="spellStart"/>
+      <w:r>
+        <w:rPr>
+          <w:b/>
+          <w:lang w:val="en-GB"/>
+        </w:rPr>
+        <w:t>Pyr</w:t>
+      </w:r>
+      <w:proofErr w:type="spellEnd"/>
+      <w:r>
+        <w:rPr>
+          <w:b/>
+          <w:lang w:val="en-GB"/>
+        </w:rPr>
+        <w:t xml:space="preserve"> is the 3-isomer, not the 4-isomer that the folder name suggests.</w:t>
+      </w:r>
+      <w:r>
+        <w:rPr>
+          <w:lang w:val="en-GB"/>
+        </w:rPr>
+        <w:t xml:space="preserve"> By analogy with Me-</w:t>
+      </w:r>
+      <w:proofErr w:type="spellStart"/>
+      <w:r>
+        <w:rPr>
+          <w:lang w:val="en-GB"/>
+        </w:rPr>
+        <w:t>Pyr</w:t>
+      </w:r>
+      <w:proofErr w:type="spellEnd"/>
+      <w:r>
+        <w:rPr>
+          <w:lang w:val="en-GB"/>
+        </w:rPr>
+        <w:t>, CN-</w:t>
+      </w:r>
+      <w:proofErr w:type="spellStart"/>
+      <w:r>
+        <w:rPr>
+          <w:lang w:val="en-GB"/>
+        </w:rPr>
+        <w:t>Pyr</w:t>
+      </w:r>
+      <w:proofErr w:type="spellEnd"/>
+      <w:r>
+        <w:rPr>
+          <w:lang w:val="en-GB"/>
+        </w:rPr>
+        <w:t xml:space="preserve"> and NO2-Pyr one would expect the 4-position. Confirmed from the geometry: the ring-</w:t>
+      </w:r>
+      <w:r>
+        <w:rPr>
+          <w:lang w:val="en-GB"/>
+        </w:rPr>
+        <w:lastRenderedPageBreak/>
+        <w:t xml:space="preserve">nitrogen-to-iodine distance is 4.33 Å, against 4.36 Å expected for the 3-position and 4.88 Å for the 4-position. Any argument that lines it up with the para-substituted members </w:t>
+      </w:r>
+      <w:proofErr w:type="gramStart"/>
+      <w:r>
+        <w:rPr>
+          <w:lang w:val="en-GB"/>
+        </w:rPr>
+        <w:t>has to</w:t>
+      </w:r>
+      <w:proofErr w:type="gramEnd"/>
+      <w:r>
+        <w:rPr>
+          <w:lang w:val="en-GB"/>
+        </w:rPr>
+        <w:t xml:space="preserve"> account for that.</w:t>
       </w:r>
     </w:p>
     <w:p>
@@ -13043,11 +15364,19 @@
       </w:pPr>
       <w:bookmarkStart w:id="38" w:name="_Toc238466605"/>
       <w:bookmarkStart w:id="39" w:name="_Toc238548501"/>
-      <w:r>
-        <w:rPr>
-          <w:lang w:val="en-GB"/>
-        </w:rPr>
-        <w:t>5.3  Provenance of the images</w:t>
+      <w:proofErr w:type="gramStart"/>
+      <w:r>
+        <w:rPr>
+          <w:lang w:val="en-GB"/>
+        </w:rPr>
+        <w:t>5.3  Provenance</w:t>
+      </w:r>
+      <w:proofErr w:type="gramEnd"/>
+      <w:r>
+        <w:rPr>
+          <w:lang w:val="en-GB"/>
+        </w:rPr>
+        <w:t xml:space="preserve"> of the images</w:t>
       </w:r>
       <w:bookmarkEnd w:id="38"/>
       <w:bookmarkEnd w:id="39"/>
@@ -13065,37 +15394,66 @@
         </w:rPr>
       </w:pPr>
       <w:r>
+        <w:rPr>
+          <w:lang w:val="en-GB"/>
+        </w:rPr>
         <w:t xml:space="preserve">All nine image sets come from a single run of the current </w:t>
       </w:r>
       <w:r>
         <w:rPr>
           <w:rFonts w:ascii="Consolas" w:hAnsi="Consolas"/>
           <w:sz w:val="19"/>
+          <w:lang w:val="en-GB"/>
         </w:rPr>
         <w:t>render_esp.py</w:t>
       </w:r>
       <w:r>
+        <w:rPr>
+          <w:lang w:val="en-GB"/>
+        </w:rPr>
         <w:t xml:space="preserve">, so the mixed-script-version caveat of earlier versions of this document no longer applies. The images in </w:t>
       </w:r>
       <w:r>
         <w:rPr>
           <w:rFonts w:ascii="Consolas" w:hAnsi="Consolas"/>
           <w:sz w:val="19"/>
+          <w:lang w:val="en-GB"/>
         </w:rPr>
         <w:t>results/</w:t>
       </w:r>
       <w:r>
+        <w:rPr>
+          <w:lang w:val="en-GB"/>
+        </w:rPr>
         <w:t xml:space="preserve"> are copies of that run's output in </w:t>
       </w:r>
       <w:r>
         <w:rPr>
           <w:rFonts w:ascii="Consolas" w:hAnsi="Consolas"/>
           <w:sz w:val="19"/>
+          <w:lang w:val="en-GB"/>
         </w:rPr>
         <w:t>sandbox/</w:t>
       </w:r>
       <w:r>
-        <w:t>; the cube files behind them stay untracked and are regenerable from the pointval grids. The command was:</w:t>
+        <w:rPr>
+          <w:lang w:val="en-GB"/>
+        </w:rPr>
+        <w:t xml:space="preserve">; the cube files behind them stay untracked and are regenerable from the </w:t>
+      </w:r>
+      <w:proofErr w:type="spellStart"/>
+      <w:r>
+        <w:rPr>
+          <w:lang w:val="en-GB"/>
+        </w:rPr>
+        <w:t>pointval</w:t>
+      </w:r>
+      <w:proofErr w:type="spellEnd"/>
+      <w:r>
+        <w:rPr>
+          <w:lang w:val="en-GB"/>
+        </w:rPr>
+        <w:t xml:space="preserve"> grids. The command was:</w:t>
       </w:r>
     </w:p>
     <w:p>
@@ -13119,30 +15477,62 @@
           <w:szCs w:val="15"/>
           <w:lang w:val="en-GB"/>
         </w:rPr>
-        <w:t>python run_all.py --root ../sandbox</w:t>
+        <w:t>python run_all.py --root</w:t>
+      </w:r>
+      <w:proofErr w:type="gramStart"/>
+      <w:r>
+        <w:rPr>
+          <w:rFonts w:ascii="Consolas" w:eastAsia="Consolas" w:hAnsi="Consolas" w:cs="Consolas"/>
+          <w:sz w:val="15"/>
+          <w:szCs w:val="15"/>
+          <w:lang w:val="en-GB"/>
+        </w:rPr>
+        <w:t xml:space="preserve"> ..</w:t>
+      </w:r>
+      <w:proofErr w:type="gramEnd"/>
+      <w:r>
+        <w:rPr>
+          <w:rFonts w:ascii="Consolas" w:eastAsia="Consolas" w:hAnsi="Consolas" w:cs="Consolas"/>
+          <w:sz w:val="15"/>
+          <w:szCs w:val="15"/>
+          <w:lang w:val="en-GB"/>
+        </w:rPr>
+        <w:t>/sandbox</w:t>
       </w:r>
     </w:p>
     <w:p>
       <w:pPr>
         <w:pStyle w:val="berschrift1"/>
         <w:spacing w:before="360" w:after="180"/>
+        <w:rPr>
+          <w:lang w:val="en-GB"/>
+        </w:rPr>
       </w:pPr>
       <w:bookmarkStart w:id="40" w:name="_Toc238466606"/>
       <w:bookmarkStart w:id="41" w:name="_Toc238548502"/>
-      <w:r>
+      <w:proofErr w:type="gramStart"/>
+      <w:r>
+        <w:rPr>
+          <w:lang w:val="en-GB"/>
+        </w:rPr>
         <w:t>6  References</w:t>
       </w:r>
       <w:bookmarkEnd w:id="40"/>
       <w:bookmarkEnd w:id="41"/>
+      <w:proofErr w:type="gramEnd"/>
     </w:p>
     <w:p>
       <w:pPr>
         <w:spacing w:before="120" w:after="100"/>
+        <w:rPr>
+          <w:lang w:val="en-GB"/>
+        </w:rPr>
       </w:pPr>
       <w:r>
         <w:rPr>
           <w:b/>
           <w:bCs/>
+          <w:lang w:val="en-GB"/>
         </w:rPr>
         <w:t>Method / convention</w:t>
       </w:r>
@@ -13242,7 +15632,6 @@
           <w:b/>
           <w:bCs/>
         </w:rPr>
-        <w:lastRenderedPageBreak/>
         <w:t>Software</w:t>
       </w:r>
     </w:p>

</xml_diff>